<commit_message>
docs(monitoring): replace placeholder PNGs with real Prometheus+Grafana captures
Ran a local observability stack (uvicorn + Prometheus 3.11.3 + Grafana 13.0.1 portable binaries under .obs/), generated 60 mixed high/low-risk requests, then captured real screenshots via Playwright:

  - 06_prometheus_query.png (NEW): rate(heart_api_requests_total) over 15m

  - 07_metrics_endpoint.png: live /metrics exposition

  - 08_docker_run_predict.png: high-risk POST /predict response (P=0.997)

  - 11_swagger_ui.png: real Swagger UI with High/Low examples dropdown

  - 12_grafana_dashboard.png: provisioned heart-api Grafana dashboard

  - 13_prometheus_targets.png: heart-api + prometheus targets both UP

REPORT.md section 10 now embeds 4 monitoring screenshots; .obs/ gitignored.
</commit_message>
<xml_diff>
--- a/docs/REPORT.docx
+++ b/docs/REPORT.docx
@@ -1519,7 +1519,7 @@
       <w:r>
         <w:drawing>
           <wp:inline xmlns:a="http://schemas.openxmlformats.org/drawingml/2006/main" xmlns:pic="http://schemas.openxmlformats.org/drawingml/2006/picture">
-            <wp:extent cx="5029200" cy="2766060"/>
+            <wp:extent cx="5029200" cy="2828925"/>
             <wp:docPr id="8" name="Picture 8"/>
             <wp:cNvGraphicFramePr>
               <a:graphicFrameLocks noChangeAspect="1"/>
@@ -1540,7 +1540,7 @@
                   <pic:spPr>
                     <a:xfrm>
                       <a:off x="0" y="0"/>
-                      <a:ext cx="5029200" cy="2766060"/>
+                      <a:ext cx="5029200" cy="2828925"/>
                     </a:xfrm>
                     <a:prstGeom prst="rect"/>
                   </pic:spPr>
@@ -1748,7 +1748,7 @@
       <w:r>
         <w:drawing>
           <wp:inline xmlns:a="http://schemas.openxmlformats.org/drawingml/2006/main" xmlns:pic="http://schemas.openxmlformats.org/drawingml/2006/picture">
-            <wp:extent cx="5029200" cy="2766060"/>
+            <wp:extent cx="5029200" cy="3023806"/>
             <wp:docPr id="11" name="Picture 11"/>
             <wp:cNvGraphicFramePr>
               <a:graphicFrameLocks noChangeAspect="1"/>
@@ -1769,7 +1769,7 @@
                   <pic:spPr>
                     <a:xfrm>
                       <a:off x="0" y="0"/>
-                      <a:ext cx="5029200" cy="2766060"/>
+                      <a:ext cx="5029200" cy="3023806"/>
                     </a:xfrm>
                     <a:prstGeom prst="rect"/>
                   </pic:spPr>
@@ -1879,7 +1879,7 @@
       <w:r>
         <w:drawing>
           <wp:inline xmlns:a="http://schemas.openxmlformats.org/drawingml/2006/main" xmlns:pic="http://schemas.openxmlformats.org/drawingml/2006/picture">
-            <wp:extent cx="5029200" cy="2766060"/>
+            <wp:extent cx="5029200" cy="2828925"/>
             <wp:docPr id="12" name="Picture 12"/>
             <wp:cNvGraphicFramePr>
               <a:graphicFrameLocks noChangeAspect="1"/>
@@ -1900,7 +1900,7 @@
                   <pic:spPr>
                     <a:xfrm>
                       <a:off x="0" y="0"/>
-                      <a:ext cx="5029200" cy="2766060"/>
+                      <a:ext cx="5029200" cy="2828925"/>
                     </a:xfrm>
                     <a:prstGeom prst="rect"/>
                   </pic:spPr>
@@ -1915,7 +1915,7 @@
       <w:r>
         <w:drawing>
           <wp:inline xmlns:a="http://schemas.openxmlformats.org/drawingml/2006/main" xmlns:pic="http://schemas.openxmlformats.org/drawingml/2006/picture">
-            <wp:extent cx="5029200" cy="2766060"/>
+            <wp:extent cx="5029200" cy="2828925"/>
             <wp:docPr id="13" name="Picture 13"/>
             <wp:cNvGraphicFramePr>
               <a:graphicFrameLocks noChangeAspect="1"/>
@@ -1936,7 +1936,79 @@
                   <pic:spPr>
                     <a:xfrm>
                       <a:off x="0" y="0"/>
-                      <a:ext cx="5029200" cy="2766060"/>
+                      <a:ext cx="5029200" cy="2828925"/>
+                    </a:xfrm>
+                    <a:prstGeom prst="rect"/>
+                  </pic:spPr>
+                </pic:pic>
+              </a:graphicData>
+            </a:graphic>
+          </wp:inline>
+        </w:drawing>
+      </w:r>
+    </w:p>
+    <w:p>
+      <w:r>
+        <w:drawing>
+          <wp:inline xmlns:a="http://schemas.openxmlformats.org/drawingml/2006/main" xmlns:pic="http://schemas.openxmlformats.org/drawingml/2006/picture">
+            <wp:extent cx="5029200" cy="2828925"/>
+            <wp:docPr id="14" name="Picture 14"/>
+            <wp:cNvGraphicFramePr>
+              <a:graphicFrameLocks noChangeAspect="1"/>
+            </wp:cNvGraphicFramePr>
+            <a:graphic>
+              <a:graphicData uri="http://schemas.openxmlformats.org/drawingml/2006/picture">
+                <pic:pic>
+                  <pic:nvPicPr>
+                    <pic:cNvPr id="0" name="06_prometheus_query.png"/>
+                    <pic:cNvPicPr/>
+                  </pic:nvPicPr>
+                  <pic:blipFill>
+                    <a:blip r:embed="rId22"/>
+                    <a:stretch>
+                      <a:fillRect/>
+                    </a:stretch>
+                  </pic:blipFill>
+                  <pic:spPr>
+                    <a:xfrm>
+                      <a:off x="0" y="0"/>
+                      <a:ext cx="5029200" cy="2828925"/>
+                    </a:xfrm>
+                    <a:prstGeom prst="rect"/>
+                  </pic:spPr>
+                </pic:pic>
+              </a:graphicData>
+            </a:graphic>
+          </wp:inline>
+        </w:drawing>
+      </w:r>
+    </w:p>
+    <w:p>
+      <w:r>
+        <w:drawing>
+          <wp:inline xmlns:a="http://schemas.openxmlformats.org/drawingml/2006/main" xmlns:pic="http://schemas.openxmlformats.org/drawingml/2006/picture">
+            <wp:extent cx="5029200" cy="2828925"/>
+            <wp:docPr id="15" name="Picture 15"/>
+            <wp:cNvGraphicFramePr>
+              <a:graphicFrameLocks noChangeAspect="1"/>
+            </wp:cNvGraphicFramePr>
+            <a:graphic>
+              <a:graphicData uri="http://schemas.openxmlformats.org/drawingml/2006/picture">
+                <pic:pic>
+                  <pic:nvPicPr>
+                    <pic:cNvPr id="0" name="07_metrics_endpoint.png"/>
+                    <pic:cNvPicPr/>
+                  </pic:nvPicPr>
+                  <pic:blipFill>
+                    <a:blip r:embed="rId23"/>
+                    <a:stretch>
+                      <a:fillRect/>
+                    </a:stretch>
+                  </pic:blipFill>
+                  <pic:spPr>
+                    <a:xfrm>
+                      <a:off x="0" y="0"/>
+                      <a:ext cx="5029200" cy="2828925"/>
                     </a:xfrm>
                     <a:prstGeom prst="rect"/>
                   </pic:spPr>
@@ -1988,7 +2060,7 @@
         <w:pStyle w:val="ListBullet"/>
       </w:pPr>
       <w:r>
-        <w:t>`screenshots/` contains 13 PNGs referenced from this report and the</w:t>
+        <w:t>`screenshots/` contains 15 PNGs referenced from this report and the</w:t>
       </w:r>
     </w:p>
     <w:p>

</xml_diff>

<commit_message>
ci: add lint, CodeQL, docker-build workflows; fix ruff/black; add README badges
</commit_message>
<xml_diff>
--- a/docs/REPORT.docx
+++ b/docs/REPORT.docx
@@ -37,7 +37,7 @@
     </w:p>
     <w:p>
       <w:r>
-        <w:t>**Deployed API URL:** `&lt;DEPLOYED_URL&gt;` *(see Â§10)*</w:t>
+        <w:t>**Deployed API URL:** &lt;https://heart-api-bxq0.onrender.com&gt;</w:t>
       </w:r>
     </w:p>
     <w:p/>
@@ -1704,44 +1704,173 @@
     <w:p/>
     <w:p>
       <w:r>
-        <w:t>**Deployed API URL:** `&lt;DEPLOYED_URL&gt;` *(fill in after first deploy)*</w:t>
+        <w:t>**Deployed API URL:** &lt;https://heart-api-bxq0.onrender.com&gt;</w:t>
+      </w:r>
+    </w:p>
+    <w:p>
+      <w:r>
+        <w:t>**Swagger:** &lt;https://heart-api-bxq0.onrender.com/docs&gt;</w:t>
+      </w:r>
+    </w:p>
+    <w:p>
+      <w:r>
+        <w:t>**Health:** &lt;https://heart-api-bxq0.onrender.com/health&gt;</w:t>
       </w:r>
     </w:p>
     <w:p/>
     <w:p>
       <w:r>
-        <w:drawing>
-          <wp:inline xmlns:a="http://schemas.openxmlformats.org/drawingml/2006/main" xmlns:pic="http://schemas.openxmlformats.org/drawingml/2006/picture">
-            <wp:extent cx="5029200" cy="2766060"/>
-            <wp:docPr id="10" name="Picture 10"/>
-            <wp:cNvGraphicFramePr>
-              <a:graphicFrameLocks noChangeAspect="1"/>
-            </wp:cNvGraphicFramePr>
-            <a:graphic>
-              <a:graphicData uri="http://schemas.openxmlformats.org/drawingml/2006/picture">
-                <pic:pic>
-                  <pic:nvPicPr>
-                    <pic:cNvPr id="0" name="10_loadbalancer_endpoint.png"/>
-                    <pic:cNvPicPr/>
-                  </pic:nvPicPr>
-                  <pic:blipFill>
-                    <a:blip r:embed="rId18"/>
-                    <a:stretch>
-                      <a:fillRect/>
-                    </a:stretch>
-                  </pic:blipFill>
-                  <pic:spPr>
-                    <a:xfrm>
-                      <a:off x="0" y="0"/>
-                      <a:ext cx="5029200" cy="2766060"/>
-                    </a:xfrm>
-                    <a:prstGeom prst="rect"/>
-                  </pic:spPr>
-                </pic:pic>
-              </a:graphicData>
-            </a:graphic>
-          </wp:inline>
-        </w:drawing>
+        <w:t>End-to-end verification (executed against the live URL):</w:t>
+      </w:r>
+    </w:p>
+    <w:p/>
+    <w:tbl>
+      <w:tblPr>
+        <w:tblStyle w:val="LightGrid-Accent1"/>
+        <w:tblW w:type="auto" w:w="0"/>
+        <w:tblLook w:firstColumn="1" w:firstRow="1" w:lastColumn="0" w:lastRow="0" w:noHBand="0" w:noVBand="1" w:val="04A0"/>
+      </w:tblPr>
+      <w:tblGrid>
+        <w:gridCol w:w="4320"/>
+        <w:gridCol w:w="4320"/>
+      </w:tblGrid>
+      <w:tr>
+        <w:tc>
+          <w:tcPr>
+            <w:tcW w:type="dxa" w:w="4320"/>
+          </w:tcPr>
+          <w:p>
+            <w:r>
+              <w:rPr>
+                <w:b/>
+              </w:rPr>
+              <w:t>Endpoint</w:t>
+            </w:r>
+          </w:p>
+        </w:tc>
+        <w:tc>
+          <w:tcPr>
+            <w:tcW w:type="dxa" w:w="4320"/>
+          </w:tcPr>
+          <w:p>
+            <w:r>
+              <w:rPr>
+                <w:b/>
+              </w:rPr>
+              <w:t>Result</w:t>
+            </w:r>
+          </w:p>
+        </w:tc>
+      </w:tr>
+      <w:tr>
+        <w:tc>
+          <w:tcPr>
+            <w:tcW w:type="dxa" w:w="4320"/>
+          </w:tcPr>
+          <w:p>
+            <w:r>
+              <w:t>`GET /health`</w:t>
+            </w:r>
+          </w:p>
+        </w:tc>
+        <w:tc>
+          <w:tcPr>
+            <w:tcW w:type="dxa" w:w="4320"/>
+          </w:tcPr>
+          <w:p>
+            <w:r>
+              <w:t>`{"status":"ok","model_loaded":true,"version":"1.0.0"}`</w:t>
+            </w:r>
+          </w:p>
+        </w:tc>
+      </w:tr>
+      <w:tr>
+        <w:tc>
+          <w:tcPr>
+            <w:tcW w:type="dxa" w:w="4320"/>
+          </w:tcPr>
+          <w:p>
+            <w:r>
+              <w:t>`POST /predict` (high-risk sample)</w:t>
+            </w:r>
+          </w:p>
+        </w:tc>
+        <w:tc>
+          <w:tcPr>
+            <w:tcW w:type="dxa" w:w="4320"/>
+          </w:tcPr>
+          <w:p>
+            <w:r>
+              <w:t>`prediction=1, label="disease", probability_disease=0.997`</w:t>
+            </w:r>
+          </w:p>
+        </w:tc>
+      </w:tr>
+      <w:tr>
+        <w:tc>
+          <w:tcPr>
+            <w:tcW w:type="dxa" w:w="4320"/>
+          </w:tcPr>
+          <w:p>
+            <w:r>
+              <w:t>`POST /predict` (low-risk sample)</w:t>
+            </w:r>
+          </w:p>
+        </w:tc>
+        <w:tc>
+          <w:tcPr>
+            <w:tcW w:type="dxa" w:w="4320"/>
+          </w:tcPr>
+          <w:p>
+            <w:r>
+              <w:t>`prediction=0, label="no_disease", probability_disease=0.0045`</w:t>
+            </w:r>
+          </w:p>
+        </w:tc>
+      </w:tr>
+      <w:tr>
+        <w:tc>
+          <w:tcPr>
+            <w:tcW w:type="dxa" w:w="4320"/>
+          </w:tcPr>
+          <w:p>
+            <w:r>
+              <w:t>`GET /metrics`</w:t>
+            </w:r>
+          </w:p>
+        </w:tc>
+        <w:tc>
+          <w:tcPr>
+            <w:tcW w:type="dxa" w:w="4320"/>
+          </w:tcPr>
+          <w:p>
+            <w:r>
+              <w:t>Emits Prometheus exposition; `/metrics` excluded from self-instrumentation</w:t>
+            </w:r>
+          </w:p>
+        </w:tc>
+      </w:tr>
+    </w:tbl>
+    <w:p/>
+    <w:p/>
+    <w:p>
+      <w:r>
+        <w:t>[image not found: ../screenshots/14_render_dashboard.png]</w:t>
+      </w:r>
+    </w:p>
+    <w:p>
+      <w:r>
+        <w:t>[image not found: ../screenshots/15_render_logs.png]</w:t>
+      </w:r>
+    </w:p>
+    <w:p>
+      <w:r>
+        <w:t>[image not found: ../screenshots/16_render_swagger.png]</w:t>
+      </w:r>
+    </w:p>
+    <w:p>
+      <w:r>
+        <w:t>[image not found: ../screenshots/17_render_predict.png]</w:t>
       </w:r>
     </w:p>
     <w:p>
@@ -1749,7 +1878,7 @@
         <w:drawing>
           <wp:inline xmlns:a="http://schemas.openxmlformats.org/drawingml/2006/main" xmlns:pic="http://schemas.openxmlformats.org/drawingml/2006/picture">
             <wp:extent cx="5029200" cy="3023806"/>
-            <wp:docPr id="11" name="Picture 11"/>
+            <wp:docPr id="10" name="Picture 10"/>
             <wp:cNvGraphicFramePr>
               <a:graphicFrameLocks noChangeAspect="1"/>
             </wp:cNvGraphicFramePr>
@@ -1761,7 +1890,7 @@
                     <pic:cNvPicPr/>
                   </pic:nvPicPr>
                   <pic:blipFill>
-                    <a:blip r:embed="rId19"/>
+                    <a:blip r:embed="rId18"/>
                     <a:stretch>
                       <a:fillRect/>
                     </a:stretch>
@@ -1880,6 +2009,42 @@
         <w:drawing>
           <wp:inline xmlns:a="http://schemas.openxmlformats.org/drawingml/2006/main" xmlns:pic="http://schemas.openxmlformats.org/drawingml/2006/picture">
             <wp:extent cx="5029200" cy="2828925"/>
+            <wp:docPr id="11" name="Picture 11"/>
+            <wp:cNvGraphicFramePr>
+              <a:graphicFrameLocks noChangeAspect="1"/>
+            </wp:cNvGraphicFramePr>
+            <a:graphic>
+              <a:graphicData uri="http://schemas.openxmlformats.org/drawingml/2006/picture">
+                <pic:pic>
+                  <pic:nvPicPr>
+                    <pic:cNvPr id="0" name="12_grafana_dashboard.png"/>
+                    <pic:cNvPicPr/>
+                  </pic:nvPicPr>
+                  <pic:blipFill>
+                    <a:blip r:embed="rId19"/>
+                    <a:stretch>
+                      <a:fillRect/>
+                    </a:stretch>
+                  </pic:blipFill>
+                  <pic:spPr>
+                    <a:xfrm>
+                      <a:off x="0" y="0"/>
+                      <a:ext cx="5029200" cy="2828925"/>
+                    </a:xfrm>
+                    <a:prstGeom prst="rect"/>
+                  </pic:spPr>
+                </pic:pic>
+              </a:graphicData>
+            </a:graphic>
+          </wp:inline>
+        </w:drawing>
+      </w:r>
+    </w:p>
+    <w:p>
+      <w:r>
+        <w:drawing>
+          <wp:inline xmlns:a="http://schemas.openxmlformats.org/drawingml/2006/main" xmlns:pic="http://schemas.openxmlformats.org/drawingml/2006/picture">
+            <wp:extent cx="5029200" cy="2828925"/>
             <wp:docPr id="12" name="Picture 12"/>
             <wp:cNvGraphicFramePr>
               <a:graphicFrameLocks noChangeAspect="1"/>
@@ -1888,7 +2053,7 @@
               <a:graphicData uri="http://schemas.openxmlformats.org/drawingml/2006/picture">
                 <pic:pic>
                   <pic:nvPicPr>
-                    <pic:cNvPr id="0" name="12_grafana_dashboard.png"/>
+                    <pic:cNvPr id="0" name="13_prometheus_targets.png"/>
                     <pic:cNvPicPr/>
                   </pic:nvPicPr>
                   <pic:blipFill>
@@ -1924,7 +2089,7 @@
               <a:graphicData uri="http://schemas.openxmlformats.org/drawingml/2006/picture">
                 <pic:pic>
                   <pic:nvPicPr>
-                    <pic:cNvPr id="0" name="13_prometheus_targets.png"/>
+                    <pic:cNvPr id="0" name="06_prometheus_query.png"/>
                     <pic:cNvPicPr/>
                   </pic:nvPicPr>
                   <pic:blipFill>
@@ -1960,47 +2125,11 @@
               <a:graphicData uri="http://schemas.openxmlformats.org/drawingml/2006/picture">
                 <pic:pic>
                   <pic:nvPicPr>
-                    <pic:cNvPr id="0" name="06_prometheus_query.png"/>
+                    <pic:cNvPr id="0" name="07_metrics_endpoint.png"/>
                     <pic:cNvPicPr/>
                   </pic:nvPicPr>
                   <pic:blipFill>
                     <a:blip r:embed="rId22"/>
-                    <a:stretch>
-                      <a:fillRect/>
-                    </a:stretch>
-                  </pic:blipFill>
-                  <pic:spPr>
-                    <a:xfrm>
-                      <a:off x="0" y="0"/>
-                      <a:ext cx="5029200" cy="2828925"/>
-                    </a:xfrm>
-                    <a:prstGeom prst="rect"/>
-                  </pic:spPr>
-                </pic:pic>
-              </a:graphicData>
-            </a:graphic>
-          </wp:inline>
-        </w:drawing>
-      </w:r>
-    </w:p>
-    <w:p>
-      <w:r>
-        <w:drawing>
-          <wp:inline xmlns:a="http://schemas.openxmlformats.org/drawingml/2006/main" xmlns:pic="http://schemas.openxmlformats.org/drawingml/2006/picture">
-            <wp:extent cx="5029200" cy="2828925"/>
-            <wp:docPr id="15" name="Picture 15"/>
-            <wp:cNvGraphicFramePr>
-              <a:graphicFrameLocks noChangeAspect="1"/>
-            </wp:cNvGraphicFramePr>
-            <a:graphic>
-              <a:graphicData uri="http://schemas.openxmlformats.org/drawingml/2006/picture">
-                <pic:pic>
-                  <pic:nvPicPr>
-                    <pic:cNvPr id="0" name="07_metrics_endpoint.png"/>
-                    <pic:cNvPicPr/>
-                  </pic:nvPicPr>
-                  <pic:blipFill>
-                    <a:blip r:embed="rId23"/>
                     <a:stretch>
                       <a:fillRect/>
                     </a:stretch>
@@ -2065,15 +2194,7 @@
     </w:p>
     <w:p>
       <w:r>
-        <w:t xml:space="preserve">  demo video (`docs/demo_slideshow.mp4`).</w:t>
-      </w:r>
-    </w:p>
-    <w:p>
-      <w:pPr>
-        <w:pStyle w:val="ListBullet"/>
-      </w:pPr>
-      <w:r>
-        <w:t>`docs/NARRATION_SCRIPT.md` is the timed narration for the video.</w:t>
+        <w:t xml:space="preserve">  demo video (`docs/demo_video.mp4`).</w:t>
       </w:r>
     </w:p>
     <w:p/>
@@ -2297,7 +2418,7 @@
           </w:tcPr>
           <w:p>
             <w:r>
-              <w:t>`screenshots/` (13 PNGs)</w:t>
+              <w:t>`screenshots/` (19 PNGs)</w:t>
             </w:r>
           </w:p>
         </w:tc>
@@ -2341,7 +2462,7 @@
           </w:tcPr>
           <w:p>
             <w:r>
-              <w:t>`docs/demo_slideshow.mp4`</w:t>
+              <w:t>`docs/demo_video.mp4`</w:t>
             </w:r>
           </w:p>
         </w:tc>
@@ -2363,7 +2484,7 @@
           </w:tcPr>
           <w:p>
             <w:r>
-              <w:t>`&lt;DEPLOYED_URL&gt;` (Render) â€” local: `kubectl port-forward svc/heart-api 8000:80`</w:t>
+              <w:t>&lt;https://heart-api-bxq0.onrender.com&gt; (Render) â€” local: `kubectl port-forward svc/heart-api 8000:80`</w:t>
             </w:r>
           </w:p>
         </w:tc>

</xml_diff>

<commit_message>
docs: point all references to new GitHub account and Render URL
</commit_message>
<xml_diff>
--- a/docs/REPORT.docx
+++ b/docs/REPORT.docx
@@ -32,12 +32,12 @@
     </w:p>
     <w:p>
       <w:r>
-        <w:t>**Repository:** `https://github.com/dd-mtech123/heart-disease-mlops`</w:t>
+        <w:t>**Repository:** `https://github.com/ddmtech2025cs05056/heart-disease-mlops`</w:t>
       </w:r>
     </w:p>
     <w:p>
       <w:r>
-        <w:t>**Deployed API URL:** &lt;https://heart-api-bxq0.onrender.com&gt;</w:t>
+        <w:t>**Deployed API URL:** &lt;https://heart-disease-mlops-yhb7.onrender.com&gt;</w:t>
       </w:r>
     </w:p>
     <w:p/>
@@ -164,7 +164,7 @@
           <w:color w:val="333333"/>
           <w:sz w:val="18"/>
         </w:rPr>
-        <w:t>git clone https://github.com/dd-mtech123/heart-disease-mlops.git</w:t>
+        <w:t>git clone https://github.com/ddmtech2025cs05056/heart-disease-mlops.git</w:t>
         <w:br/>
         <w:t>cd heart-disease-mlops</w:t>
         <w:br/>
@@ -1704,17 +1704,17 @@
     <w:p/>
     <w:p>
       <w:r>
-        <w:t>**Deployed API URL:** &lt;https://heart-api-bxq0.onrender.com&gt;</w:t>
+        <w:t>**Deployed API URL:** &lt;https://heart-disease-mlops-yhb7.onrender.com&gt;</w:t>
       </w:r>
     </w:p>
     <w:p>
       <w:r>
-        <w:t>**Swagger:** &lt;https://heart-api-bxq0.onrender.com/docs&gt;</w:t>
+        <w:t>**Swagger:** &lt;https://heart-disease-mlops-yhb7.onrender.com/docs&gt;</w:t>
       </w:r>
     </w:p>
     <w:p>
       <w:r>
-        <w:t>**Health:** &lt;https://heart-api-bxq0.onrender.com/health&gt;</w:t>
+        <w:t>**Health:** &lt;https://heart-disease-mlops-yhb7.onrender.com/health&gt;</w:t>
       </w:r>
     </w:p>
     <w:p/>
@@ -2264,7 +2264,7 @@
           </w:tcPr>
           <w:p>
             <w:r>
-              <w:t>`https://github.com/dd-mtech123/heart-disease-mlops`</w:t>
+              <w:t>`https://github.com/ddmtech2025cs05056/heart-disease-mlops`</w:t>
             </w:r>
           </w:p>
         </w:tc>
@@ -2484,7 +2484,7 @@
           </w:tcPr>
           <w:p>
             <w:r>
-              <w:t>&lt;https://heart-api-bxq0.onrender.com&gt; (Render) â€” local: `kubectl port-forward svc/heart-api 8000:80`</w:t>
+              <w:t>&lt;https://heart-disease-mlops-yhb7.onrender.com&gt; (Render) â€” local: `kubectl port-forward svc/heart-api 8000:80`</w:t>
             </w:r>
           </w:p>
         </w:tc>

</xml_diff>

<commit_message>
docs: add prominent live-deliverables block (live API, Swagger predict, demo video)
</commit_message>
<xml_diff>
--- a/docs/REPORT.docx
+++ b/docs/REPORT.docx
@@ -40,6 +40,146 @@
         <w:t>**Deployed API URL:** &lt;https://heart-disease-mlops-yhb7.onrender.com&gt;</w:t>
       </w:r>
     </w:p>
+    <w:p/>
+    <w:p/>
+    <w:p/>
+    <w:p>
+      <w:pPr>
+        <w:pStyle w:val="Heading1"/>
+      </w:pPr>
+      <w:r>
+        <w:t>🚀 Live deliverables</w:t>
+      </w:r>
+    </w:p>
+    <w:p/>
+    <w:tbl>
+      <w:tblPr>
+        <w:tblStyle w:val="LightGrid-Accent1"/>
+        <w:tblW w:type="auto" w:w="0"/>
+        <w:tblLook w:firstColumn="1" w:firstRow="1" w:lastColumn="0" w:lastRow="0" w:noHBand="0" w:noVBand="1" w:val="04A0"/>
+      </w:tblPr>
+      <w:tblGrid>
+        <w:gridCol w:w="4320"/>
+        <w:gridCol w:w="4320"/>
+      </w:tblGrid>
+      <w:tr>
+        <w:tc>
+          <w:tcPr>
+            <w:tcW w:type="dxa" w:w="4320"/>
+          </w:tcPr>
+          <w:p>
+            <w:r>
+              <w:rPr>
+                <w:b/>
+              </w:rPr>
+              <w:t>Artefact</w:t>
+            </w:r>
+          </w:p>
+        </w:tc>
+        <w:tc>
+          <w:tcPr>
+            <w:tcW w:type="dxa" w:w="4320"/>
+          </w:tcPr>
+          <w:p>
+            <w:r>
+              <w:rPr>
+                <w:b/>
+              </w:rPr>
+              <w:t>Link</w:t>
+            </w:r>
+          </w:p>
+        </w:tc>
+      </w:tr>
+      <w:tr>
+        <w:tc>
+          <w:tcPr>
+            <w:tcW w:type="dxa" w:w="4320"/>
+          </w:tcPr>
+          <w:p>
+            <w:r>
+              <w:t>🎥 **Demo video**</w:t>
+            </w:r>
+          </w:p>
+        </w:tc>
+        <w:tc>
+          <w:tcPr>
+            <w:tcW w:type="dxa" w:w="4320"/>
+          </w:tcPr>
+          <w:p>
+            <w:r>
+              <w:t>[`docs/demo_video.mp4`](demo_video.mp4)</w:t>
+            </w:r>
+          </w:p>
+        </w:tc>
+      </w:tr>
+      <w:tr>
+        <w:tc>
+          <w:tcPr>
+            <w:tcW w:type="dxa" w:w="4320"/>
+          </w:tcPr>
+          <w:p>
+            <w:r>
+              <w:t>🌐 **Live API (Render)**</w:t>
+            </w:r>
+          </w:p>
+        </w:tc>
+        <w:tc>
+          <w:tcPr>
+            <w:tcW w:type="dxa" w:w="4320"/>
+          </w:tcPr>
+          <w:p>
+            <w:r>
+              <w:t>&lt;https://heart-disease-mlops-yhb7.onrender.com&gt;</w:t>
+            </w:r>
+          </w:p>
+        </w:tc>
+      </w:tr>
+      <w:tr>
+        <w:tc>
+          <w:tcPr>
+            <w:tcW w:type="dxa" w:w="4320"/>
+          </w:tcPr>
+          <w:p>
+            <w:r>
+              <w:t>📘 **Try `/predict` (Swagger)**</w:t>
+            </w:r>
+          </w:p>
+        </w:tc>
+        <w:tc>
+          <w:tcPr>
+            <w:tcW w:type="dxa" w:w="4320"/>
+          </w:tcPr>
+          <w:p>
+            <w:r>
+              <w:t>&lt;https://heart-disease-mlops-yhb7.onrender.com/docs#/inference/predict_predict_post&gt;</w:t>
+            </w:r>
+          </w:p>
+        </w:tc>
+      </w:tr>
+      <w:tr>
+        <w:tc>
+          <w:tcPr>
+            <w:tcW w:type="dxa" w:w="4320"/>
+          </w:tcPr>
+          <w:p>
+            <w:r>
+              <w:t>❤️ **Health check**</w:t>
+            </w:r>
+          </w:p>
+        </w:tc>
+        <w:tc>
+          <w:tcPr>
+            <w:tcW w:type="dxa" w:w="4320"/>
+          </w:tcPr>
+          <w:p>
+            <w:r>
+              <w:t>&lt;https://heart-disease-mlops-yhb7.onrender.com/health&gt;</w:t>
+            </w:r>
+          </w:p>
+        </w:tc>
+      </w:tr>
+    </w:tbl>
+    <w:p/>
     <w:p/>
     <w:p/>
     <w:p/>

</xml_diff>

<commit_message>
docs: add submitted demo video and update all references
</commit_message>
<xml_diff>
--- a/docs/REPORT.docx
+++ b/docs/REPORT.docx
@@ -107,7 +107,7 @@
           </w:tcPr>
           <w:p>
             <w:r>
-              <w:t>[`docs/demo_video.mp4`](demo_video.mp4)</w:t>
+              <w:t>[`docs/2026-05-09 17-51-37.mp4`](2026-05-09%2017-51-37.mp4)</w:t>
             </w:r>
           </w:p>
         </w:tc>
@@ -2334,7 +2334,7 @@
     </w:p>
     <w:p>
       <w:r>
-        <w:t xml:space="preserve">  demo video (`docs/demo_video.mp4`).</w:t>
+        <w:t xml:space="preserve">  demo video (`docs/2026-05-09 17-51-37.mp4`).</w:t>
       </w:r>
     </w:p>
     <w:p/>
@@ -2602,7 +2602,7 @@
           </w:tcPr>
           <w:p>
             <w:r>
-              <w:t>`docs/demo_video.mp4`</w:t>
+              <w:t>`docs/2026-05-09 17-51-37.mp4`</w:t>
             </w:r>
           </w:p>
         </w:tc>

</xml_diff>

<commit_message>
docs: add Google Drive streaming link as alternate demo video URL
</commit_message>
<xml_diff>
--- a/docs/REPORT.docx
+++ b/docs/REPORT.docx
@@ -97,7 +97,7 @@
           </w:tcPr>
           <w:p>
             <w:r>
-              <w:t>🎥 **Demo video**</w:t>
+              <w:t>🎥 **Demo video (in repo)**</w:t>
             </w:r>
           </w:p>
         </w:tc>
@@ -108,6 +108,28 @@
           <w:p>
             <w:r>
               <w:t>[`docs/2026-05-09 17-51-37.mp4`](2026-05-09%2017-51-37.mp4)</w:t>
+            </w:r>
+          </w:p>
+        </w:tc>
+      </w:tr>
+      <w:tr>
+        <w:tc>
+          <w:tcPr>
+            <w:tcW w:type="dxa" w:w="4320"/>
+          </w:tcPr>
+          <w:p>
+            <w:r>
+              <w:t>🎥 **Demo video (Google Drive — streaming)**</w:t>
+            </w:r>
+          </w:p>
+        </w:tc>
+        <w:tc>
+          <w:tcPr>
+            <w:tcW w:type="dxa" w:w="4320"/>
+          </w:tcPr>
+          <w:p>
+            <w:r>
+              <w:t>&lt;https://drive.google.com/file/d/106ABOgXefeEAvOQdUCnteJ9P6vjYF_M1/view?usp=drive_link&gt;</w:t>
             </w:r>
           </w:p>
         </w:tc>

</xml_diff>

<commit_message>
docs: add PDF report alongside DOCX/MD; new build_report_pdf.py script
</commit_message>
<xml_diff>
--- a/docs/REPORT.docx
+++ b/docs/REPORT.docx
@@ -130,6 +130,50 @@
           <w:p>
             <w:r>
               <w:t>&lt;https://drive.google.com/file/d/106ABOgXefeEAvOQdUCnteJ9P6vjYF_M1/view?usp=drive_link&gt;</w:t>
+            </w:r>
+          </w:p>
+        </w:tc>
+      </w:tr>
+      <w:tr>
+        <w:tc>
+          <w:tcPr>
+            <w:tcW w:type="dxa" w:w="4320"/>
+          </w:tcPr>
+          <w:p>
+            <w:r>
+              <w:t>📄 **Final report (PDF)**</w:t>
+            </w:r>
+          </w:p>
+        </w:tc>
+        <w:tc>
+          <w:tcPr>
+            <w:tcW w:type="dxa" w:w="4320"/>
+          </w:tcPr>
+          <w:p>
+            <w:r>
+              <w:t>[`docs/REPORT.pdf`](REPORT.pdf)</w:t>
+            </w:r>
+          </w:p>
+        </w:tc>
+      </w:tr>
+      <w:tr>
+        <w:tc>
+          <w:tcPr>
+            <w:tcW w:type="dxa" w:w="4320"/>
+          </w:tcPr>
+          <w:p>
+            <w:r>
+              <w:t>📝 **Final report (Word)**</w:t>
+            </w:r>
+          </w:p>
+        </w:tc>
+        <w:tc>
+          <w:tcPr>
+            <w:tcW w:type="dxa" w:w="4320"/>
+          </w:tcPr>
+          <w:p>
+            <w:r>
+              <w:t>[`docs/REPORT.docx`](REPORT.docx)</w:t>
             </w:r>
           </w:p>
         </w:tc>
@@ -2327,7 +2371,7 @@
         <w:pStyle w:val="ListBullet"/>
       </w:pPr>
       <w:r>
-        <w:t>This document â€” `docs/REPORT.md` (also exported as `REPORT.docx`).</w:t>
+        <w:t>This document â€” `docs/REPORT.md` (also exported as `REPORT.docx` and `REPORT.pdf`).</w:t>
       </w:r>
     </w:p>
     <w:p>
@@ -2592,7 +2636,7 @@
           </w:tcPr>
           <w:p>
             <w:r>
-              <w:t>Final 10-page report (.docx)</w:t>
+              <w:t>Final 10-page report (.pdf, .docx, .md)</w:t>
             </w:r>
           </w:p>
         </w:tc>
@@ -2602,7 +2646,7 @@
           </w:tcPr>
           <w:p>
             <w:r>
-              <w:t>`docs/REPORT.docx`</w:t>
+              <w:t>`docs/REPORT.pdf`, `docs/REPORT.docx`, `docs/REPORT.md`</w:t>
             </w:r>
           </w:p>
         </w:tc>

</xml_diff>

<commit_message>
docs: clean PDF/DOCX - repair UTF-8 mojibake, render bold/code/links, simplify deliverables
</commit_message>
<xml_diff>
--- a/docs/REPORT.docx
+++ b/docs/REPORT.docx
@@ -7,37 +7,87 @@
         <w:pStyle w:val="Title"/>
       </w:pPr>
       <w:r>
-        <w:t>MLOps Assignment 1 â€” Final Report</w:t>
+        <w:t>MLOps Assignment 1 — Final Report</w:t>
       </w:r>
     </w:p>
     <w:p>
       <w:r>
-        <w:t>**Course:** MLOps (S2-25_AMLCSZG523)</w:t>
+        <w:rPr>
+          <w:b/>
+        </w:rPr>
+        <w:t>Course:</w:t>
+      </w:r>
+      <w:r>
+        <w:t xml:space="preserve"> MLOps (S2-25_AMLCSZG523)</w:t>
       </w:r>
     </w:p>
     <w:p>
       <w:r>
-        <w:t>**Project:** End-to-End Heart Disease Prediction</w:t>
+        <w:rPr>
+          <w:b/>
+        </w:rPr>
+        <w:t>Project:</w:t>
+      </w:r>
+      <w:r>
+        <w:t xml:space="preserve"> End-to-End Heart Disease Prediction</w:t>
       </w:r>
     </w:p>
     <w:p>
       <w:r>
-        <w:t>**Author:** Deepak Dharmani (BITS ID: 2025CS05056)</w:t>
+        <w:rPr>
+          <w:b/>
+        </w:rPr>
+        <w:t>Author:</w:t>
+      </w:r>
+      <w:r>
+        <w:t xml:space="preserve"> Deepak Dharmani (BITS ID: 2025CS05056)</w:t>
       </w:r>
     </w:p>
     <w:p>
       <w:r>
-        <w:t>**Submission date:** 5-May-2026</w:t>
+        <w:rPr>
+          <w:b/>
+        </w:rPr>
+        <w:t>Submission date:</w:t>
+      </w:r>
+      <w:r>
+        <w:t xml:space="preserve"> 5-May-2026</w:t>
       </w:r>
     </w:p>
     <w:p>
       <w:r>
-        <w:t>**Repository:** `https://github.com/ddmtech2025cs05056/heart-disease-mlops`</w:t>
+        <w:rPr>
+          <w:b/>
+        </w:rPr>
+        <w:t>Repository:</w:t>
+      </w:r>
+      <w:r>
+        <w:t xml:space="preserve"> </w:t>
+      </w:r>
+      <w:r>
+        <w:rPr>
+          <w:rFonts w:ascii="Consolas" w:hAnsi="Consolas"/>
+          <w:color w:val="333333"/>
+          <w:sz w:val="20"/>
+        </w:rPr>
+        <w:t>https://github.com/ddmtech2025cs05056/heart-disease-mlops</w:t>
       </w:r>
     </w:p>
     <w:p>
       <w:r>
-        <w:t>**Deployed API URL:** &lt;https://heart-disease-mlops-yhb7.onrender.com&gt;</w:t>
+        <w:rPr>
+          <w:b/>
+        </w:rPr>
+        <w:t>Deployed API URL:</w:t>
+      </w:r>
+      <w:r>
+        <w:t xml:space="preserve"> </w:t>
+      </w:r>
+      <w:r>
+        <w:rPr>
+          <w:color w:val="1F497D"/>
+        </w:rPr>
+        <w:t>https://heart-disease-mlops-yhb7.onrender.com</w:t>
       </w:r>
     </w:p>
     <w:p/>
@@ -68,6 +118,7 @@
             <w:tcW w:type="dxa" w:w="4320"/>
           </w:tcPr>
           <w:p>
+            <w:r/>
             <w:r>
               <w:rPr>
                 <w:b/>
@@ -81,6 +132,7 @@
             <w:tcW w:type="dxa" w:w="4320"/>
           </w:tcPr>
           <w:p>
+            <w:r/>
             <w:r>
               <w:rPr>
                 <w:b/>
@@ -96,8 +148,15 @@
             <w:tcW w:type="dxa" w:w="4320"/>
           </w:tcPr>
           <w:p>
+            <w:r/>
             <w:r>
-              <w:t>🎥 **Demo video (in repo)**</w:t>
+              <w:t xml:space="preserve">🎥 </w:t>
+            </w:r>
+            <w:r>
+              <w:rPr>
+                <w:b/>
+              </w:rPr>
+              <w:t>Demo video (in repo)</w:t>
             </w:r>
           </w:p>
         </w:tc>
@@ -106,8 +165,16 @@
             <w:tcW w:type="dxa" w:w="4320"/>
           </w:tcPr>
           <w:p>
+            <w:r/>
             <w:r>
-              <w:t>[`docs/2026-05-09 17-51-37.mp4`](2026-05-09%2017-51-37.mp4)</w:t>
+              <w:t>`docs/2026-05-09 17-51-37.mp4`</w:t>
+            </w:r>
+            <w:r>
+              <w:rPr>
+                <w:color w:val="555555"/>
+                <w:sz w:val="18"/>
+              </w:rPr>
+              <w:t xml:space="preserve"> (2026-05-09%2017-51-37.mp4)</w:t>
             </w:r>
           </w:p>
         </w:tc>
@@ -118,8 +185,15 @@
             <w:tcW w:type="dxa" w:w="4320"/>
           </w:tcPr>
           <w:p>
+            <w:r/>
             <w:r>
-              <w:t>🎥 **Demo video (Google Drive — streaming)**</w:t>
+              <w:t xml:space="preserve">🎥 </w:t>
+            </w:r>
+            <w:r>
+              <w:rPr>
+                <w:b/>
+              </w:rPr>
+              <w:t>Demo video (Google Drive — streaming)</w:t>
             </w:r>
           </w:p>
         </w:tc>
@@ -128,8 +202,12 @@
             <w:tcW w:type="dxa" w:w="4320"/>
           </w:tcPr>
           <w:p>
+            <w:r/>
             <w:r>
-              <w:t>&lt;https://drive.google.com/file/d/106ABOgXefeEAvOQdUCnteJ9P6vjYF_M1/view?usp=drive_link&gt;</w:t>
+              <w:rPr>
+                <w:color w:val="1F497D"/>
+              </w:rPr>
+              <w:t>https://drive.google.com/file/d/106ABOgXefeEAvOQdUCnteJ9P6vjYF_M1/view?usp=drive_link</w:t>
             </w:r>
           </w:p>
         </w:tc>
@@ -140,8 +218,15 @@
             <w:tcW w:type="dxa" w:w="4320"/>
           </w:tcPr>
           <w:p>
+            <w:r/>
             <w:r>
-              <w:t>📄 **Final report (PDF)**</w:t>
+              <w:t xml:space="preserve">📄 </w:t>
+            </w:r>
+            <w:r>
+              <w:rPr>
+                <w:b/>
+              </w:rPr>
+              <w:t>Final report (PDF)</w:t>
             </w:r>
           </w:p>
         </w:tc>
@@ -150,8 +235,9 @@
             <w:tcW w:type="dxa" w:w="4320"/>
           </w:tcPr>
           <w:p>
+            <w:r/>
             <w:r>
-              <w:t>[`docs/REPORT.pdf`](REPORT.pdf)</w:t>
+              <w:t>`docs/REPORT.pdf`</w:t>
             </w:r>
           </w:p>
         </w:tc>
@@ -162,8 +248,15 @@
             <w:tcW w:type="dxa" w:w="4320"/>
           </w:tcPr>
           <w:p>
+            <w:r/>
             <w:r>
-              <w:t>📝 **Final report (Word)**</w:t>
+              <w:t xml:space="preserve">📝 </w:t>
+            </w:r>
+            <w:r>
+              <w:rPr>
+                <w:b/>
+              </w:rPr>
+              <w:t>Final report (Word)</w:t>
             </w:r>
           </w:p>
         </w:tc>
@@ -172,8 +265,9 @@
             <w:tcW w:type="dxa" w:w="4320"/>
           </w:tcPr>
           <w:p>
+            <w:r/>
             <w:r>
-              <w:t>[`docs/REPORT.docx`](REPORT.docx)</w:t>
+              <w:t>`docs/REPORT.docx`</w:t>
             </w:r>
           </w:p>
         </w:tc>
@@ -184,8 +278,15 @@
             <w:tcW w:type="dxa" w:w="4320"/>
           </w:tcPr>
           <w:p>
+            <w:r/>
             <w:r>
-              <w:t>🌐 **Live API (Render)**</w:t>
+              <w:t xml:space="preserve">🌐 </w:t>
+            </w:r>
+            <w:r>
+              <w:rPr>
+                <w:b/>
+              </w:rPr>
+              <w:t>Live API (Render)</w:t>
             </w:r>
           </w:p>
         </w:tc>
@@ -194,8 +295,12 @@
             <w:tcW w:type="dxa" w:w="4320"/>
           </w:tcPr>
           <w:p>
+            <w:r/>
             <w:r>
-              <w:t>&lt;https://heart-disease-mlops-yhb7.onrender.com&gt;</w:t>
+              <w:rPr>
+                <w:color w:val="1F497D"/>
+              </w:rPr>
+              <w:t>https://heart-disease-mlops-yhb7.onrender.com</w:t>
             </w:r>
           </w:p>
         </w:tc>
@@ -206,8 +311,15 @@
             <w:tcW w:type="dxa" w:w="4320"/>
           </w:tcPr>
           <w:p>
+            <w:r/>
             <w:r>
-              <w:t>📘 **Try `/predict` (Swagger)**</w:t>
+              <w:t xml:space="preserve">📘 </w:t>
+            </w:r>
+            <w:r>
+              <w:rPr>
+                <w:b/>
+              </w:rPr>
+              <w:t>Try `/predict` (Swagger)</w:t>
             </w:r>
           </w:p>
         </w:tc>
@@ -216,8 +328,12 @@
             <w:tcW w:type="dxa" w:w="4320"/>
           </w:tcPr>
           <w:p>
+            <w:r/>
             <w:r>
-              <w:t>&lt;https://heart-disease-mlops-yhb7.onrender.com/docs#/inference/predict_predict_post&gt;</w:t>
+              <w:rPr>
+                <w:color w:val="1F497D"/>
+              </w:rPr>
+              <w:t>https://heart-disease-mlops-yhb7.onrender.com/docs#/inference/predict_predict_post</w:t>
             </w:r>
           </w:p>
         </w:tc>
@@ -228,8 +344,15 @@
             <w:tcW w:type="dxa" w:w="4320"/>
           </w:tcPr>
           <w:p>
+            <w:r/>
             <w:r>
-              <w:t>❤️ **Health check**</w:t>
+              <w:t xml:space="preserve">❤️ </w:t>
+            </w:r>
+            <w:r>
+              <w:rPr>
+                <w:b/>
+              </w:rPr>
+              <w:t>Health check</w:t>
             </w:r>
           </w:p>
         </w:tc>
@@ -238,8 +361,12 @@
             <w:tcW w:type="dxa" w:w="4320"/>
           </w:tcPr>
           <w:p>
+            <w:r/>
             <w:r>
-              <w:t>&lt;https://heart-disease-mlops-yhb7.onrender.com/health&gt;</w:t>
+              <w:rPr>
+                <w:color w:val="1F497D"/>
+              </w:rPr>
+              <w:t>https://heart-disease-mlops-yhb7.onrender.com/health</w:t>
             </w:r>
           </w:p>
         </w:tc>
@@ -270,7 +397,7 @@
     </w:p>
     <w:p>
       <w:r>
-        <w:t>Cleveland â€” 303 rows Ã— 14 columns). It exercises every stage of the</w:t>
+        <w:t>Cleveland — 303 rows × 14 columns). It exercises every stage of the</w:t>
       </w:r>
     </w:p>
     <w:p>
@@ -296,53 +423,202 @@
     </w:p>
     <w:p>
       <w:r>
-        <w:t>4. **MLflow** experiment tracking (params / metrics / plots / artefacts)</w:t>
+        <w:t xml:space="preserve">4. </w:t>
+      </w:r>
+      <w:r>
+        <w:rPr>
+          <w:b/>
+        </w:rPr>
+        <w:t>MLflow</w:t>
+      </w:r>
+      <w:r>
+        <w:t xml:space="preserve"> experiment tracking (params / metrics / plots / artefacts)</w:t>
       </w:r>
     </w:p>
     <w:p>
       <w:r>
-        <w:t>5. Reusable model artefact (`models/heart_pipeline.joblib`)</w:t>
+        <w:t>5. Reusable model artefact (</w:t>
+      </w:r>
+      <w:r>
+        <w:rPr>
+          <w:rFonts w:ascii="Consolas" w:hAnsi="Consolas"/>
+          <w:color w:val="333333"/>
+          <w:sz w:val="20"/>
+        </w:rPr>
+        <w:t>models/heart_pipeline.joblib</w:t>
+      </w:r>
+      <w:r>
+        <w:t>)</w:t>
       </w:r>
     </w:p>
     <w:p>
       <w:r>
-        <w:t>6. **pytest** unit + integration tests with **GitHub Actions** CI</w:t>
+        <w:t xml:space="preserve">6. </w:t>
+      </w:r>
+      <w:r>
+        <w:rPr>
+          <w:b/>
+        </w:rPr>
+        <w:t>pytest</w:t>
+      </w:r>
+      <w:r>
+        <w:t xml:space="preserve"> unit + integration tests with </w:t>
+      </w:r>
+      <w:r>
+        <w:rPr>
+          <w:b/>
+        </w:rPr>
+        <w:t>GitHub Actions</w:t>
+      </w:r>
+      <w:r>
+        <w:t xml:space="preserve"> CI</w:t>
       </w:r>
     </w:p>
     <w:p>
       <w:r>
-        <w:t>7. **FastAPI** prediction service exposed via **Docker**</w:t>
+        <w:t xml:space="preserve">7. </w:t>
+      </w:r>
+      <w:r>
+        <w:rPr>
+          <w:b/>
+        </w:rPr>
+        <w:t>FastAPI</w:t>
+      </w:r>
+      <w:r>
+        <w:t xml:space="preserve"> prediction service exposed via </w:t>
+      </w:r>
+      <w:r>
+        <w:rPr>
+          <w:b/>
+        </w:rPr>
+        <w:t>Docker</w:t>
       </w:r>
     </w:p>
     <w:p>
       <w:r>
-        <w:t>8. **Kubernetes** deployment (raw manifests **and** Helm chart) with</w:t>
+        <w:t xml:space="preserve">8. </w:t>
+      </w:r>
+      <w:r>
+        <w:rPr>
+          <w:b/>
+        </w:rPr>
+        <w:t>Kubernetes</w:t>
+      </w:r>
+      <w:r>
+        <w:t xml:space="preserve"> deployment (raw manifests </w:t>
+      </w:r>
+      <w:r>
+        <w:rPr>
+          <w:b/>
+        </w:rPr>
+        <w:t>and</w:t>
+      </w:r>
+      <w:r>
+        <w:t xml:space="preserve"> Helm chart) with</w:t>
       </w:r>
     </w:p>
     <w:p>
       <w:r>
-        <w:t xml:space="preserve">   `LoadBalancer`, `Ingress`, and `HorizontalPodAutoscaler`</w:t>
+        <w:t xml:space="preserve">   </w:t>
+      </w:r>
+      <w:r>
+        <w:rPr>
+          <w:rFonts w:ascii="Consolas" w:hAnsi="Consolas"/>
+          <w:color w:val="333333"/>
+          <w:sz w:val="20"/>
+        </w:rPr>
+        <w:t>LoadBalancer</w:t>
+      </w:r>
+      <w:r>
+        <w:t xml:space="preserve">, </w:t>
+      </w:r>
+      <w:r>
+        <w:rPr>
+          <w:rFonts w:ascii="Consolas" w:hAnsi="Consolas"/>
+          <w:color w:val="333333"/>
+          <w:sz w:val="20"/>
+        </w:rPr>
+        <w:t>Ingress</w:t>
+      </w:r>
+      <w:r>
+        <w:t xml:space="preserve">, and </w:t>
+      </w:r>
+      <w:r>
+        <w:rPr>
+          <w:rFonts w:ascii="Consolas" w:hAnsi="Consolas"/>
+          <w:color w:val="333333"/>
+          <w:sz w:val="20"/>
+        </w:rPr>
+        <w:t>HorizontalPodAutoscaler</w:t>
       </w:r>
     </w:p>
     <w:p>
       <w:r>
-        <w:t>9. **Render.com** Docker blueprint for a one-click public URL</w:t>
+        <w:t xml:space="preserve">9. </w:t>
+      </w:r>
+      <w:r>
+        <w:rPr>
+          <w:b/>
+        </w:rPr>
+        <w:t>Render.com</w:t>
+      </w:r>
+      <w:r>
+        <w:t xml:space="preserve"> Docker blueprint for a one-click public URL</w:t>
       </w:r>
     </w:p>
     <w:p>
       <w:r>
-        <w:t>10. **Prometheus + Grafana** observability and structured JSON logs</w:t>
+        <w:t xml:space="preserve">10. </w:t>
+      </w:r>
+      <w:r>
+        <w:rPr>
+          <w:b/>
+        </w:rPr>
+        <w:t>Prometheus + Grafana</w:t>
+      </w:r>
+      <w:r>
+        <w:t xml:space="preserve"> observability and structured JSON logs</w:t>
       </w:r>
     </w:p>
     <w:p/>
     <w:p>
       <w:r>
-        <w:t>**Best model on a stratified 20% test set:** Logistic Regression with</w:t>
+        <w:rPr>
+          <w:b/>
+        </w:rPr>
+        <w:t>Best model on a stratified 20% test set:</w:t>
+      </w:r>
+      <w:r>
+        <w:t xml:space="preserve"> Logistic Regression with</w:t>
       </w:r>
     </w:p>
     <w:p>
       <w:r>
-        <w:t>**ROC-AUC = 0.967**, **Accuracy = 0.885**, **F1 = 0.881**.</w:t>
+        <w:rPr>
+          <w:b/>
+        </w:rPr>
+        <w:t>ROC-AUC = 0.967</w:t>
+      </w:r>
+      <w:r>
+        <w:t xml:space="preserve">, </w:t>
+      </w:r>
+      <w:r>
+        <w:rPr>
+          <w:b/>
+        </w:rPr>
+        <w:t>Accuracy = 0.885</w:t>
+      </w:r>
+      <w:r>
+        <w:t xml:space="preserve">, </w:t>
+      </w:r>
+      <w:r>
+        <w:rPr>
+          <w:b/>
+        </w:rPr>
+        <w:t>F1 = 0.881</w:t>
+      </w:r>
+      <w:r>
+        <w:t>.</w:t>
       </w:r>
     </w:p>
     <w:p/>
@@ -388,7 +664,40 @@
     <w:p/>
     <w:p>
       <w:r>
-        <w:t>A `Makefile` and `environment.yml` are provided for `make`-based and Conda</w:t>
+        <w:t xml:space="preserve">A </w:t>
+      </w:r>
+      <w:r>
+        <w:rPr>
+          <w:rFonts w:ascii="Consolas" w:hAnsi="Consolas"/>
+          <w:color w:val="333333"/>
+          <w:sz w:val="20"/>
+        </w:rPr>
+        <w:t>Makefile</w:t>
+      </w:r>
+      <w:r>
+        <w:t xml:space="preserve"> and </w:t>
+      </w:r>
+      <w:r>
+        <w:rPr>
+          <w:rFonts w:ascii="Consolas" w:hAnsi="Consolas"/>
+          <w:color w:val="333333"/>
+          <w:sz w:val="20"/>
+        </w:rPr>
+        <w:t>environment.yml</w:t>
+      </w:r>
+      <w:r>
+        <w:t xml:space="preserve"> are provided for </w:t>
+      </w:r>
+      <w:r>
+        <w:rPr>
+          <w:rFonts w:ascii="Consolas" w:hAnsi="Consolas"/>
+          <w:color w:val="333333"/>
+          <w:sz w:val="20"/>
+        </w:rPr>
+        <w:t>make</w:t>
+      </w:r>
+      <w:r>
+        <w:t>-based and Conda</w:t>
       </w:r>
     </w:p>
     <w:p>
@@ -404,7 +713,7 @@
         <w:pStyle w:val="Heading1"/>
       </w:pPr>
       <w:r>
-        <w:t>3. Dataset and EDA *(Task 1 â€” 5 marks)*</w:t>
+        <w:t>3. Dataset and EDA *(Task 1 — 5 marks)*</w:t>
       </w:r>
     </w:p>
     <w:p/>
@@ -415,13 +724,43 @@
     </w:p>
     <w:p>
       <w:r>
-        <w:t>`src/data/download.py`. `src/data/preprocess.py` then:</w:t>
+        <w:rPr>
+          <w:rFonts w:ascii="Consolas" w:hAnsi="Consolas"/>
+          <w:color w:val="333333"/>
+          <w:sz w:val="20"/>
+        </w:rPr>
+        <w:t>src/data/download.py</w:t>
+      </w:r>
+      <w:r>
+        <w:t xml:space="preserve">. </w:t>
+      </w:r>
+      <w:r>
+        <w:rPr>
+          <w:rFonts w:ascii="Consolas" w:hAnsi="Consolas"/>
+          <w:color w:val="333333"/>
+          <w:sz w:val="20"/>
+        </w:rPr>
+        <w:t>src/data/preprocess.py</w:t>
+      </w:r>
+      <w:r>
+        <w:t xml:space="preserve"> then:</w:t>
       </w:r>
     </w:p>
     <w:p/>
     <w:p>
       <w:r>
-        <w:t>1. Replaces the literal `?` placeholders with NaN.</w:t>
+        <w:t xml:space="preserve">1. Replaces the literal </w:t>
+      </w:r>
+      <w:r>
+        <w:rPr>
+          <w:rFonts w:ascii="Consolas" w:hAnsi="Consolas"/>
+          <w:color w:val="333333"/>
+          <w:sz w:val="20"/>
+        </w:rPr>
+        <w:t>?</w:t>
+      </w:r>
+      <w:r>
+        <w:t xml:space="preserve"> placeholders with NaN.</w:t>
       </w:r>
     </w:p>
     <w:p>
@@ -431,18 +770,73 @@
     </w:p>
     <w:p>
       <w:r>
-        <w:t>3. Imputes missing values with column medians (`ca`, `thal` â€” six rows).</w:t>
+        <w:t>3. Imputes missing values with column medians (</w:t>
+      </w:r>
+      <w:r>
+        <w:rPr>
+          <w:rFonts w:ascii="Consolas" w:hAnsi="Consolas"/>
+          <w:color w:val="333333"/>
+          <w:sz w:val="20"/>
+        </w:rPr>
+        <w:t>ca</w:t>
+      </w:r>
+      <w:r>
+        <w:t xml:space="preserve">, </w:t>
+      </w:r>
+      <w:r>
+        <w:rPr>
+          <w:rFonts w:ascii="Consolas" w:hAnsi="Consolas"/>
+          <w:color w:val="333333"/>
+          <w:sz w:val="20"/>
+        </w:rPr>
+        <w:t>thal</w:t>
+      </w:r>
+      <w:r>
+        <w:t xml:space="preserve"> — six rows).</w:t>
       </w:r>
     </w:p>
     <w:p>
       <w:r>
-        <w:t>4. Binarises the multi-class `num` field into a binary `target` (0 vs 1+).</w:t>
+        <w:t xml:space="preserve">4. Binarises the multi-class </w:t>
+      </w:r>
+      <w:r>
+        <w:rPr>
+          <w:rFonts w:ascii="Consolas" w:hAnsi="Consolas"/>
+          <w:color w:val="333333"/>
+          <w:sz w:val="20"/>
+        </w:rPr>
+        <w:t>num</w:t>
+      </w:r>
+      <w:r>
+        <w:t xml:space="preserve"> field into a binary </w:t>
+      </w:r>
+      <w:r>
+        <w:rPr>
+          <w:rFonts w:ascii="Consolas" w:hAnsi="Consolas"/>
+          <w:color w:val="333333"/>
+          <w:sz w:val="20"/>
+        </w:rPr>
+        <w:t>target</w:t>
+      </w:r>
+      <w:r>
+        <w:t xml:space="preserve"> (0 vs 1+).</w:t>
       </w:r>
     </w:p>
     <w:p/>
     <w:p>
       <w:r>
-        <w:t>EDA highlights (notebook: `notebooks/01_eda.ipynb`):</w:t>
+        <w:t xml:space="preserve">EDA highlights (notebook: </w:t>
+      </w:r>
+      <w:r>
+        <w:rPr>
+          <w:rFonts w:ascii="Consolas" w:hAnsi="Consolas"/>
+          <w:color w:val="333333"/>
+          <w:sz w:val="20"/>
+        </w:rPr>
+        <w:t>notebooks/01_eda.ipynb</w:t>
+      </w:r>
+      <w:r>
+        <w:t>):</w:t>
       </w:r>
     </w:p>
     <w:p/>
@@ -462,6 +856,7 @@
             <w:tcW w:type="dxa" w:w="4320"/>
           </w:tcPr>
           <w:p>
+            <w:r/>
             <w:r>
               <w:rPr>
                 <w:b/>
@@ -475,6 +870,7 @@
             <w:tcW w:type="dxa" w:w="4320"/>
           </w:tcPr>
           <w:p>
+            <w:r/>
             <w:r>
               <w:rPr>
                 <w:b/>
@@ -490,8 +886,9 @@
             <w:tcW w:type="dxa" w:w="4320"/>
           </w:tcPr>
           <w:p>
+            <w:r/>
             <w:r>
-              <w:t>Rows Ã— cols</w:t>
+              <w:t>Rows × cols</w:t>
             </w:r>
           </w:p>
         </w:tc>
@@ -500,8 +897,9 @@
             <w:tcW w:type="dxa" w:w="4320"/>
           </w:tcPr>
           <w:p>
+            <w:r/>
             <w:r>
-              <w:t>303 Ã— 14</w:t>
+              <w:t>303 × 14</w:t>
             </w:r>
           </w:p>
         </w:tc>
@@ -512,6 +910,7 @@
             <w:tcW w:type="dxa" w:w="4320"/>
           </w:tcPr>
           <w:p>
+            <w:r/>
             <w:r>
               <w:t>Class balance</w:t>
             </w:r>
@@ -522,6 +921,7 @@
             <w:tcW w:type="dxa" w:w="4320"/>
           </w:tcPr>
           <w:p>
+            <w:r/>
             <w:r>
               <w:t>54% no-disease / 46% disease</w:t>
             </w:r>
@@ -534,6 +934,7 @@
             <w:tcW w:type="dxa" w:w="4320"/>
           </w:tcPr>
           <w:p>
+            <w:r/>
             <w:r>
               <w:t>Missing values</w:t>
             </w:r>
@@ -544,8 +945,20 @@
             <w:tcW w:type="dxa" w:w="4320"/>
           </w:tcPr>
           <w:p>
+            <w:r/>
             <w:r>
-              <w:t>6 (after `?`â†’NaN)</w:t>
+              <w:t xml:space="preserve">6 (after </w:t>
+            </w:r>
+            <w:r>
+              <w:rPr>
+                <w:rFonts w:ascii="Consolas" w:hAnsi="Consolas"/>
+                <w:color w:val="333333"/>
+                <w:sz w:val="20"/>
+              </w:rPr>
+              <w:t>?</w:t>
+            </w:r>
+            <w:r>
+              <w:t>→NaN)</w:t>
             </w:r>
           </w:p>
         </w:tc>
@@ -556,6 +969,7 @@
             <w:tcW w:type="dxa" w:w="4320"/>
           </w:tcPr>
           <w:p>
+            <w:r/>
             <w:r>
               <w:t>Top</w:t>
             </w:r>
@@ -566,6 +980,7 @@
             <w:tcW w:type="dxa" w:w="4320"/>
           </w:tcPr>
           <w:p>
+            <w:r/>
             <w:r>
               <w:t>Pearson</w:t>
             </w:r>
@@ -655,13 +1070,32 @@
         <w:pStyle w:val="Heading1"/>
       </w:pPr>
       <w:r>
-        <w:t>4. Feature engineering and modelling *(Task 2 â€” 8 marks)*</w:t>
+        <w:t>4. Feature engineering and modelling *(Task 2 — 8 marks)*</w:t>
       </w:r>
     </w:p>
     <w:p/>
     <w:p>
       <w:r>
-        <w:t>`src/features/pipeline.py` builds a shared `ColumnTransformer`:</w:t>
+        <w:rPr>
+          <w:rFonts w:ascii="Consolas" w:hAnsi="Consolas"/>
+          <w:color w:val="333333"/>
+          <w:sz w:val="20"/>
+        </w:rPr>
+        <w:t>src/features/pipeline.py</w:t>
+      </w:r>
+      <w:r>
+        <w:t xml:space="preserve"> builds a shared </w:t>
+      </w:r>
+      <w:r>
+        <w:rPr>
+          <w:rFonts w:ascii="Consolas" w:hAnsi="Consolas"/>
+          <w:color w:val="333333"/>
+          <w:sz w:val="20"/>
+        </w:rPr>
+        <w:t>ColumnTransformer</w:t>
+      </w:r>
+      <w:r>
+        <w:t>:</w:t>
       </w:r>
     </w:p>
     <w:p/>
@@ -670,12 +1104,84 @@
         <w:pStyle w:val="ListBullet"/>
       </w:pPr>
       <w:r>
-        <w:t>**Numeric** (`age`, `trestbps`, `chol`, `thalach`, `oldpeak`):</w:t>
+        <w:rPr>
+          <w:b/>
+        </w:rPr>
+        <w:t>Numeric</w:t>
+      </w:r>
+      <w:r>
+        <w:t xml:space="preserve"> (</w:t>
+      </w:r>
+      <w:r>
+        <w:rPr>
+          <w:rFonts w:ascii="Consolas" w:hAnsi="Consolas"/>
+          <w:color w:val="333333"/>
+          <w:sz w:val="20"/>
+        </w:rPr>
+        <w:t>age</w:t>
+      </w:r>
+      <w:r>
+        <w:t xml:space="preserve">, </w:t>
+      </w:r>
+      <w:r>
+        <w:rPr>
+          <w:rFonts w:ascii="Consolas" w:hAnsi="Consolas"/>
+          <w:color w:val="333333"/>
+          <w:sz w:val="20"/>
+        </w:rPr>
+        <w:t>trestbps</w:t>
+      </w:r>
+      <w:r>
+        <w:t xml:space="preserve">, </w:t>
+      </w:r>
+      <w:r>
+        <w:rPr>
+          <w:rFonts w:ascii="Consolas" w:hAnsi="Consolas"/>
+          <w:color w:val="333333"/>
+          <w:sz w:val="20"/>
+        </w:rPr>
+        <w:t>chol</w:t>
+      </w:r>
+      <w:r>
+        <w:t xml:space="preserve">, </w:t>
+      </w:r>
+      <w:r>
+        <w:rPr>
+          <w:rFonts w:ascii="Consolas" w:hAnsi="Consolas"/>
+          <w:color w:val="333333"/>
+          <w:sz w:val="20"/>
+        </w:rPr>
+        <w:t>thalach</w:t>
+      </w:r>
+      <w:r>
+        <w:t xml:space="preserve">, </w:t>
+      </w:r>
+      <w:r>
+        <w:rPr>
+          <w:rFonts w:ascii="Consolas" w:hAnsi="Consolas"/>
+          <w:color w:val="333333"/>
+          <w:sz w:val="20"/>
+        </w:rPr>
+        <w:t>oldpeak</w:t>
+      </w:r>
+      <w:r>
+        <w:t>):</w:t>
       </w:r>
     </w:p>
     <w:p>
       <w:r>
-        <w:t xml:space="preserve">  median impute â†’ `StandardScaler`.</w:t>
+        <w:t xml:space="preserve">  median impute → </w:t>
+      </w:r>
+      <w:r>
+        <w:rPr>
+          <w:rFonts w:ascii="Consolas" w:hAnsi="Consolas"/>
+          <w:color w:val="333333"/>
+          <w:sz w:val="20"/>
+        </w:rPr>
+        <w:t>StandardScaler</w:t>
+      </w:r>
+      <w:r>
+        <w:t>.</w:t>
       </w:r>
     </w:p>
     <w:p>
@@ -683,23 +1189,158 @@
         <w:pStyle w:val="ListBullet"/>
       </w:pPr>
       <w:r>
-        <w:t>**Categorical** (`sex`, `cp`, `fbs`, `restecg`, `exang`, `slope`, `ca`,</w:t>
+        <w:rPr>
+          <w:b/>
+        </w:rPr>
+        <w:t>Categorical</w:t>
+      </w:r>
+      <w:r>
+        <w:t xml:space="preserve"> (</w:t>
+      </w:r>
+      <w:r>
+        <w:rPr>
+          <w:rFonts w:ascii="Consolas" w:hAnsi="Consolas"/>
+          <w:color w:val="333333"/>
+          <w:sz w:val="20"/>
+        </w:rPr>
+        <w:t>sex</w:t>
+      </w:r>
+      <w:r>
+        <w:t xml:space="preserve">, </w:t>
+      </w:r>
+      <w:r>
+        <w:rPr>
+          <w:rFonts w:ascii="Consolas" w:hAnsi="Consolas"/>
+          <w:color w:val="333333"/>
+          <w:sz w:val="20"/>
+        </w:rPr>
+        <w:t>cp</w:t>
+      </w:r>
+      <w:r>
+        <w:t xml:space="preserve">, </w:t>
+      </w:r>
+      <w:r>
+        <w:rPr>
+          <w:rFonts w:ascii="Consolas" w:hAnsi="Consolas"/>
+          <w:color w:val="333333"/>
+          <w:sz w:val="20"/>
+        </w:rPr>
+        <w:t>fbs</w:t>
+      </w:r>
+      <w:r>
+        <w:t xml:space="preserve">, </w:t>
+      </w:r>
+      <w:r>
+        <w:rPr>
+          <w:rFonts w:ascii="Consolas" w:hAnsi="Consolas"/>
+          <w:color w:val="333333"/>
+          <w:sz w:val="20"/>
+        </w:rPr>
+        <w:t>restecg</w:t>
+      </w:r>
+      <w:r>
+        <w:t xml:space="preserve">, </w:t>
+      </w:r>
+      <w:r>
+        <w:rPr>
+          <w:rFonts w:ascii="Consolas" w:hAnsi="Consolas"/>
+          <w:color w:val="333333"/>
+          <w:sz w:val="20"/>
+        </w:rPr>
+        <w:t>exang</w:t>
+      </w:r>
+      <w:r>
+        <w:t xml:space="preserve">, </w:t>
+      </w:r>
+      <w:r>
+        <w:rPr>
+          <w:rFonts w:ascii="Consolas" w:hAnsi="Consolas"/>
+          <w:color w:val="333333"/>
+          <w:sz w:val="20"/>
+        </w:rPr>
+        <w:t>slope</w:t>
+      </w:r>
+      <w:r>
+        <w:t xml:space="preserve">, </w:t>
+      </w:r>
+      <w:r>
+        <w:rPr>
+          <w:rFonts w:ascii="Consolas" w:hAnsi="Consolas"/>
+          <w:color w:val="333333"/>
+          <w:sz w:val="20"/>
+        </w:rPr>
+        <w:t>ca</w:t>
+      </w:r>
+      <w:r>
+        <w:t>,</w:t>
       </w:r>
     </w:p>
     <w:p>
       <w:r>
-        <w:t xml:space="preserve">  `thal`): most-frequent impute â†’ `OneHotEncoder(handle_unknown="ignore")`.</w:t>
+        <w:t xml:space="preserve">  </w:t>
+      </w:r>
+      <w:r>
+        <w:rPr>
+          <w:rFonts w:ascii="Consolas" w:hAnsi="Consolas"/>
+          <w:color w:val="333333"/>
+          <w:sz w:val="20"/>
+        </w:rPr>
+        <w:t>thal</w:t>
+      </w:r>
+      <w:r>
+        <w:t xml:space="preserve">): most-frequent impute → </w:t>
+      </w:r>
+      <w:r>
+        <w:rPr>
+          <w:rFonts w:ascii="Consolas" w:hAnsi="Consolas"/>
+          <w:color w:val="333333"/>
+          <w:sz w:val="20"/>
+        </w:rPr>
+        <w:t>OneHotEncoder(handle_unknown="ignore")</w:t>
+      </w:r>
+      <w:r>
+        <w:t>.</w:t>
       </w:r>
     </w:p>
     <w:p/>
     <w:p>
       <w:r>
-        <w:t>`src/models/train.py` drops this preprocessor in front of three classifiers</w:t>
+        <w:rPr>
+          <w:rFonts w:ascii="Consolas" w:hAnsi="Consolas"/>
+          <w:color w:val="333333"/>
+          <w:sz w:val="20"/>
+        </w:rPr>
+        <w:t>src/models/train.py</w:t>
+      </w:r>
+      <w:r>
+        <w:t xml:space="preserve"> drops this preprocessor in front of three classifiers</w:t>
       </w:r>
     </w:p>
     <w:p>
       <w:r>
-        <w:t>and runs `GridSearchCV` (5-fold stratified, `scoring="roc_auc"`):</w:t>
+        <w:t xml:space="preserve">and runs </w:t>
+      </w:r>
+      <w:r>
+        <w:rPr>
+          <w:rFonts w:ascii="Consolas" w:hAnsi="Consolas"/>
+          <w:color w:val="333333"/>
+          <w:sz w:val="20"/>
+        </w:rPr>
+        <w:t>GridSearchCV</w:t>
+      </w:r>
+      <w:r>
+        <w:t xml:space="preserve"> (5-fold stratified, </w:t>
+      </w:r>
+      <w:r>
+        <w:rPr>
+          <w:rFonts w:ascii="Consolas" w:hAnsi="Consolas"/>
+          <w:color w:val="333333"/>
+          <w:sz w:val="20"/>
+        </w:rPr>
+        <w:t>scoring="roc_auc"</w:t>
+      </w:r>
+      <w:r>
+        <w:t>):</w:t>
       </w:r>
     </w:p>
     <w:p/>
@@ -720,6 +1361,7 @@
             <w:tcW w:type="dxa" w:w="2880"/>
           </w:tcPr>
           <w:p>
+            <w:r/>
             <w:r>
               <w:rPr>
                 <w:b/>
@@ -733,6 +1375,7 @@
             <w:tcW w:type="dxa" w:w="2880"/>
           </w:tcPr>
           <w:p>
+            <w:r/>
             <w:r>
               <w:rPr>
                 <w:b/>
@@ -746,6 +1389,7 @@
             <w:tcW w:type="dxa" w:w="2880"/>
           </w:tcPr>
           <w:p>
+            <w:r/>
             <w:r>
               <w:rPr>
                 <w:b/>
@@ -761,6 +1405,7 @@
             <w:tcW w:type="dxa" w:w="2880"/>
           </w:tcPr>
           <w:p>
+            <w:r/>
             <w:r>
               <w:t>LogisticRegression</w:t>
             </w:r>
@@ -771,8 +1416,25 @@
             <w:tcW w:type="dxa" w:w="2880"/>
           </w:tcPr>
           <w:p>
+            <w:r/>
             <w:r>
-              <w:t>`C in {0.1, 1, 10}`, `penalty=l2`</w:t>
+              <w:rPr>
+                <w:rFonts w:ascii="Consolas" w:hAnsi="Consolas"/>
+                <w:color w:val="333333"/>
+                <w:sz w:val="20"/>
+              </w:rPr>
+              <w:t>C in {0.1, 1, 10}</w:t>
+            </w:r>
+            <w:r>
+              <w:t xml:space="preserve">, </w:t>
+            </w:r>
+            <w:r>
+              <w:rPr>
+                <w:rFonts w:ascii="Consolas" w:hAnsi="Consolas"/>
+                <w:color w:val="333333"/>
+                <w:sz w:val="20"/>
+              </w:rPr>
+              <w:t>penalty=l2</w:t>
             </w:r>
           </w:p>
         </w:tc>
@@ -781,8 +1443,12 @@
             <w:tcW w:type="dxa" w:w="2880"/>
           </w:tcPr>
           <w:p>
+            <w:r/>
             <w:r>
-              <w:t>**0.902**</w:t>
+              <w:rPr>
+                <w:b/>
+              </w:rPr>
+              <w:t>0.902</w:t>
             </w:r>
           </w:p>
         </w:tc>
@@ -793,6 +1459,7 @@
             <w:tcW w:type="dxa" w:w="2880"/>
           </w:tcPr>
           <w:p>
+            <w:r/>
             <w:r>
               <w:t>RandomForest</w:t>
             </w:r>
@@ -803,8 +1470,25 @@
             <w:tcW w:type="dxa" w:w="2880"/>
           </w:tcPr>
           <w:p>
+            <w:r/>
             <w:r>
-              <w:t>`n_estimators in {100, 300}`, `max_depth in {None, 5, 10}`</w:t>
+              <w:rPr>
+                <w:rFonts w:ascii="Consolas" w:hAnsi="Consolas"/>
+                <w:color w:val="333333"/>
+                <w:sz w:val="20"/>
+              </w:rPr>
+              <w:t>n_estimators in {100, 300}</w:t>
+            </w:r>
+            <w:r>
+              <w:t xml:space="preserve">, </w:t>
+            </w:r>
+            <w:r>
+              <w:rPr>
+                <w:rFonts w:ascii="Consolas" w:hAnsi="Consolas"/>
+                <w:color w:val="333333"/>
+                <w:sz w:val="20"/>
+              </w:rPr>
+              <w:t>max_depth in {None, 5, 10}</w:t>
             </w:r>
           </w:p>
         </w:tc>
@@ -813,6 +1497,7 @@
             <w:tcW w:type="dxa" w:w="2880"/>
           </w:tcPr>
           <w:p>
+            <w:r/>
             <w:r>
               <w:t>0.897</w:t>
             </w:r>
@@ -825,6 +1510,7 @@
             <w:tcW w:type="dxa" w:w="2880"/>
           </w:tcPr>
           <w:p>
+            <w:r/>
             <w:r>
               <w:t>XGBoost</w:t>
             </w:r>
@@ -835,8 +1521,36 @@
             <w:tcW w:type="dxa" w:w="2880"/>
           </w:tcPr>
           <w:p>
+            <w:r/>
             <w:r>
-              <w:t>`n_estimators in {100, 300}`, `max_depth in {3, 5}`, `lr in {0.05, 0.1}`</w:t>
+              <w:rPr>
+                <w:rFonts w:ascii="Consolas" w:hAnsi="Consolas"/>
+                <w:color w:val="333333"/>
+                <w:sz w:val="20"/>
+              </w:rPr>
+              <w:t>n_estimators in {100, 300}</w:t>
+            </w:r>
+            <w:r>
+              <w:t xml:space="preserve">, </w:t>
+            </w:r>
+            <w:r>
+              <w:rPr>
+                <w:rFonts w:ascii="Consolas" w:hAnsi="Consolas"/>
+                <w:color w:val="333333"/>
+                <w:sz w:val="20"/>
+              </w:rPr>
+              <w:t>max_depth in {3, 5}</w:t>
+            </w:r>
+            <w:r>
+              <w:t xml:space="preserve">, </w:t>
+            </w:r>
+            <w:r>
+              <w:rPr>
+                <w:rFonts w:ascii="Consolas" w:hAnsi="Consolas"/>
+                <w:color w:val="333333"/>
+                <w:sz w:val="20"/>
+              </w:rPr>
+              <w:t>lr in {0.05, 0.1}</w:t>
             </w:r>
           </w:p>
         </w:tc>
@@ -845,6 +1559,7 @@
             <w:tcW w:type="dxa" w:w="2880"/>
           </w:tcPr>
           <w:p>
+            <w:r/>
             <w:r>
               <w:t>0.869</w:t>
             </w:r>
@@ -856,7 +1571,10 @@
     <w:p/>
     <w:p>
       <w:r>
-        <w:t>**Held-out test metrics (20%, stratified) â€” actual values from this training run:**</w:t>
+        <w:rPr>
+          <w:b/>
+        </w:rPr>
+        <w:t>Held-out test metrics (20%, stratified) — actual values from this training run:</w:t>
       </w:r>
     </w:p>
     <w:p/>
@@ -880,6 +1598,7 @@
             <w:tcW w:type="dxa" w:w="1440"/>
           </w:tcPr>
           <w:p>
+            <w:r/>
             <w:r>
               <w:rPr>
                 <w:b/>
@@ -893,6 +1612,7 @@
             <w:tcW w:type="dxa" w:w="1440"/>
           </w:tcPr>
           <w:p>
+            <w:r/>
             <w:r>
               <w:rPr>
                 <w:b/>
@@ -906,6 +1626,7 @@
             <w:tcW w:type="dxa" w:w="1440"/>
           </w:tcPr>
           <w:p>
+            <w:r/>
             <w:r>
               <w:rPr>
                 <w:b/>
@@ -919,6 +1640,7 @@
             <w:tcW w:type="dxa" w:w="1440"/>
           </w:tcPr>
           <w:p>
+            <w:r/>
             <w:r>
               <w:rPr>
                 <w:b/>
@@ -932,6 +1654,7 @@
             <w:tcW w:type="dxa" w:w="1440"/>
           </w:tcPr>
           <w:p>
+            <w:r/>
             <w:r>
               <w:rPr>
                 <w:b/>
@@ -945,6 +1668,7 @@
             <w:tcW w:type="dxa" w:w="1440"/>
           </w:tcPr>
           <w:p>
+            <w:r/>
             <w:r>
               <w:rPr>
                 <w:b/>
@@ -960,8 +1684,12 @@
             <w:tcW w:type="dxa" w:w="1440"/>
           </w:tcPr>
           <w:p>
+            <w:r/>
             <w:r>
-              <w:t>**LogisticRegression**</w:t>
+              <w:rPr>
+                <w:b/>
+              </w:rPr>
+              <w:t>LogisticRegression</w:t>
             </w:r>
           </w:p>
         </w:tc>
@@ -970,8 +1698,12 @@
             <w:tcW w:type="dxa" w:w="1440"/>
           </w:tcPr>
           <w:p>
+            <w:r/>
             <w:r>
-              <w:t>**0.885**</w:t>
+              <w:rPr>
+                <w:b/>
+              </w:rPr>
+              <w:t>0.885</w:t>
             </w:r>
           </w:p>
         </w:tc>
@@ -980,8 +1712,12 @@
             <w:tcW w:type="dxa" w:w="1440"/>
           </w:tcPr>
           <w:p>
+            <w:r/>
             <w:r>
-              <w:t>**0.839**</w:t>
+              <w:rPr>
+                <w:b/>
+              </w:rPr>
+              <w:t>0.839</w:t>
             </w:r>
           </w:p>
         </w:tc>
@@ -990,8 +1726,12 @@
             <w:tcW w:type="dxa" w:w="1440"/>
           </w:tcPr>
           <w:p>
+            <w:r/>
             <w:r>
-              <w:t>**0.929**</w:t>
+              <w:rPr>
+                <w:b/>
+              </w:rPr>
+              <w:t>0.929</w:t>
             </w:r>
           </w:p>
         </w:tc>
@@ -1000,8 +1740,12 @@
             <w:tcW w:type="dxa" w:w="1440"/>
           </w:tcPr>
           <w:p>
+            <w:r/>
             <w:r>
-              <w:t>**0.881**</w:t>
+              <w:rPr>
+                <w:b/>
+              </w:rPr>
+              <w:t>0.881</w:t>
             </w:r>
           </w:p>
         </w:tc>
@@ -1010,8 +1754,12 @@
             <w:tcW w:type="dxa" w:w="1440"/>
           </w:tcPr>
           <w:p>
+            <w:r/>
             <w:r>
-              <w:t>**0.967**</w:t>
+              <w:rPr>
+                <w:b/>
+              </w:rPr>
+              <w:t>0.967</w:t>
             </w:r>
           </w:p>
         </w:tc>
@@ -1022,6 +1770,7 @@
             <w:tcW w:type="dxa" w:w="1440"/>
           </w:tcPr>
           <w:p>
+            <w:r/>
             <w:r>
               <w:t>RandomForest</w:t>
             </w:r>
@@ -1032,6 +1781,7 @@
             <w:tcW w:type="dxa" w:w="1440"/>
           </w:tcPr>
           <w:p>
+            <w:r/>
             <w:r>
               <w:t>0.869</w:t>
             </w:r>
@@ -1042,6 +1792,7 @@
             <w:tcW w:type="dxa" w:w="1440"/>
           </w:tcPr>
           <w:p>
+            <w:r/>
             <w:r>
               <w:t>0.813</w:t>
             </w:r>
@@ -1052,6 +1803,7 @@
             <w:tcW w:type="dxa" w:w="1440"/>
           </w:tcPr>
           <w:p>
+            <w:r/>
             <w:r>
               <w:t>0.929</w:t>
             </w:r>
@@ -1062,6 +1814,7 @@
             <w:tcW w:type="dxa" w:w="1440"/>
           </w:tcPr>
           <w:p>
+            <w:r/>
             <w:r>
               <w:t>0.867</w:t>
             </w:r>
@@ -1072,6 +1825,7 @@
             <w:tcW w:type="dxa" w:w="1440"/>
           </w:tcPr>
           <w:p>
+            <w:r/>
             <w:r>
               <w:t>0.943</w:t>
             </w:r>
@@ -1084,6 +1838,7 @@
             <w:tcW w:type="dxa" w:w="1440"/>
           </w:tcPr>
           <w:p>
+            <w:r/>
             <w:r>
               <w:t>XGBoost</w:t>
             </w:r>
@@ -1094,6 +1849,7 @@
             <w:tcW w:type="dxa" w:w="1440"/>
           </w:tcPr>
           <w:p>
+            <w:r/>
             <w:r>
               <w:t>0.902</w:t>
             </w:r>
@@ -1104,6 +1860,7 @@
             <w:tcW w:type="dxa" w:w="1440"/>
           </w:tcPr>
           <w:p>
+            <w:r/>
             <w:r>
               <w:t>0.867</w:t>
             </w:r>
@@ -1114,6 +1871,7 @@
             <w:tcW w:type="dxa" w:w="1440"/>
           </w:tcPr>
           <w:p>
+            <w:r/>
             <w:r>
               <w:t>0.929</w:t>
             </w:r>
@@ -1124,6 +1882,7 @@
             <w:tcW w:type="dxa" w:w="1440"/>
           </w:tcPr>
           <w:p>
+            <w:r/>
             <w:r>
               <w:t>0.897</w:t>
             </w:r>
@@ -1134,6 +1893,7 @@
             <w:tcW w:type="dxa" w:w="1440"/>
           </w:tcPr>
           <w:p>
+            <w:r/>
             <w:r>
               <w:t>0.932</w:t>
             </w:r>
@@ -1155,12 +1915,31 @@
     </w:p>
     <w:p>
       <w:r>
-        <w:t>serve. We persist its fitted pipeline to `models/heart_pipeline.joblib`</w:t>
+        <w:t xml:space="preserve">serve. We persist its fitted pipeline to </w:t>
+      </w:r>
+      <w:r>
+        <w:rPr>
+          <w:rFonts w:ascii="Consolas" w:hAnsi="Consolas"/>
+          <w:color w:val="333333"/>
+          <w:sz w:val="20"/>
+        </w:rPr>
+        <w:t>models/heart_pipeline.joblib</w:t>
       </w:r>
     </w:p>
     <w:p>
       <w:r>
-        <w:t>and write the headline metrics to `models/best_model.json`.</w:t>
+        <w:t xml:space="preserve">and write the headline metrics to </w:t>
+      </w:r>
+      <w:r>
+        <w:rPr>
+          <w:rFonts w:ascii="Consolas" w:hAnsi="Consolas"/>
+          <w:color w:val="333333"/>
+          <w:sz w:val="20"/>
+        </w:rPr>
+        <w:t>models/best_model.json</w:t>
+      </w:r>
+      <w:r>
+        <w:t>.</w:t>
       </w:r>
     </w:p>
     <w:p/>
@@ -1171,18 +1950,48 @@
         <w:pStyle w:val="Heading1"/>
       </w:pPr>
       <w:r>
-        <w:t>5. Experiment tracking *(Task 3 â€” 5 marks)*</w:t>
+        <w:t>5. Experiment tracking *(Task 3 — 5 marks)*</w:t>
       </w:r>
     </w:p>
     <w:p/>
     <w:p>
       <w:r>
-        <w:t>MLflow is wired into `train.py` via `mlflow.set_tracking_uri()` and</w:t>
+        <w:t xml:space="preserve">MLflow is wired into </w:t>
+      </w:r>
+      <w:r>
+        <w:rPr>
+          <w:rFonts w:ascii="Consolas" w:hAnsi="Consolas"/>
+          <w:color w:val="333333"/>
+          <w:sz w:val="20"/>
+        </w:rPr>
+        <w:t>train.py</w:t>
+      </w:r>
+      <w:r>
+        <w:t xml:space="preserve"> via </w:t>
+      </w:r>
+      <w:r>
+        <w:rPr>
+          <w:rFonts w:ascii="Consolas" w:hAnsi="Consolas"/>
+          <w:color w:val="333333"/>
+          <w:sz w:val="20"/>
+        </w:rPr>
+        <w:t>mlflow.set_tracking_uri()</w:t>
+      </w:r>
+      <w:r>
+        <w:t xml:space="preserve"> and</w:t>
       </w:r>
     </w:p>
     <w:p>
       <w:r>
-        <w:t>`mlflow.start_run()`. Each run logs:</w:t>
+        <w:rPr>
+          <w:rFonts w:ascii="Consolas" w:hAnsi="Consolas"/>
+          <w:color w:val="333333"/>
+          <w:sz w:val="20"/>
+        </w:rPr>
+        <w:t>mlflow.start_run()</w:t>
+      </w:r>
+      <w:r>
+        <w:t>. Each run logs:</w:t>
       </w:r>
     </w:p>
     <w:p/>
@@ -1191,7 +2000,15 @@
         <w:pStyle w:val="ListBullet"/>
       </w:pPr>
       <w:r>
-        <w:t>All hyper-parameters from `gs.best_params_`</w:t>
+        <w:t xml:space="preserve">All hyper-parameters from </w:t>
+      </w:r>
+      <w:r>
+        <w:rPr>
+          <w:rFonts w:ascii="Consolas" w:hAnsi="Consolas"/>
+          <w:color w:val="333333"/>
+          <w:sz w:val="20"/>
+        </w:rPr>
+        <w:t>gs.best_params_</w:t>
       </w:r>
     </w:p>
     <w:p>
@@ -1207,7 +2024,48 @@
         <w:pStyle w:val="ListBullet"/>
       </w:pPr>
       <w:r>
-        <w:t>Three plots (`roc_*.png`, `pr_*.png`, `cm_*.png`) under `plots/`</w:t>
+        <w:t>Three plots (</w:t>
+      </w:r>
+      <w:r>
+        <w:rPr>
+          <w:rFonts w:ascii="Consolas" w:hAnsi="Consolas"/>
+          <w:color w:val="333333"/>
+          <w:sz w:val="20"/>
+        </w:rPr>
+        <w:t>roc_*.png</w:t>
+      </w:r>
+      <w:r>
+        <w:t xml:space="preserve">, </w:t>
+      </w:r>
+      <w:r>
+        <w:rPr>
+          <w:rFonts w:ascii="Consolas" w:hAnsi="Consolas"/>
+          <w:color w:val="333333"/>
+          <w:sz w:val="20"/>
+        </w:rPr>
+        <w:t>pr_*.png</w:t>
+      </w:r>
+      <w:r>
+        <w:t xml:space="preserve">, </w:t>
+      </w:r>
+      <w:r>
+        <w:rPr>
+          <w:rFonts w:ascii="Consolas" w:hAnsi="Consolas"/>
+          <w:color w:val="333333"/>
+          <w:sz w:val="20"/>
+        </w:rPr>
+        <w:t>cm_*.png</w:t>
+      </w:r>
+      <w:r>
+        <w:t xml:space="preserve">) under </w:t>
+      </w:r>
+      <w:r>
+        <w:rPr>
+          <w:rFonts w:ascii="Consolas" w:hAnsi="Consolas"/>
+          <w:color w:val="333333"/>
+          <w:sz w:val="20"/>
+        </w:rPr>
+        <w:t>plots/</w:t>
       </w:r>
     </w:p>
     <w:p>
@@ -1215,13 +2073,41 @@
         <w:pStyle w:val="ListBullet"/>
       </w:pPr>
       <w:r>
-        <w:t>The fitted sklearn pipeline under `model/`</w:t>
+        <w:t xml:space="preserve">The fitted sklearn pipeline under </w:t>
+      </w:r>
+      <w:r>
+        <w:rPr>
+          <w:rFonts w:ascii="Consolas" w:hAnsi="Consolas"/>
+          <w:color w:val="333333"/>
+          <w:sz w:val="20"/>
+        </w:rPr>
+        <w:t>model/</w:t>
       </w:r>
     </w:p>
     <w:p/>
     <w:p>
       <w:r>
-        <w:t>To browse: `mlflow ui --backend-store-uri ./mlruns` â†’ &lt;http://localhost:5000&gt;.</w:t>
+        <w:t xml:space="preserve">To browse: </w:t>
+      </w:r>
+      <w:r>
+        <w:rPr>
+          <w:rFonts w:ascii="Consolas" w:hAnsi="Consolas"/>
+          <w:color w:val="333333"/>
+          <w:sz w:val="20"/>
+        </w:rPr>
+        <w:t>mlflow ui --backend-store-uri ./mlruns</w:t>
+      </w:r>
+      <w:r>
+        <w:t xml:space="preserve"> → </w:t>
+      </w:r>
+      <w:r>
+        <w:rPr>
+          <w:color w:val="1F497D"/>
+        </w:rPr>
+        <w:t>http://localhost:5000</w:t>
+      </w:r>
+      <w:r>
+        <w:t>.</w:t>
       </w:r>
     </w:p>
     <w:p/>
@@ -1305,7 +2191,7 @@
         <w:pStyle w:val="Heading1"/>
       </w:pPr>
       <w:r>
-        <w:t>6. Packaging and reproducibility *(Task 4 â€” 7 marks)*</w:t>
+        <w:t>6. Packaging and reproducibility *(Task 4 — 7 marks)*</w:t>
       </w:r>
     </w:p>
     <w:p/>
@@ -1314,12 +2200,51 @@
         <w:pStyle w:val="ListBullet"/>
       </w:pPr>
       <w:r>
-        <w:t>**Artefact format:** `joblib`-pickled sklearn `Pipeline` (preprocessor +</w:t>
+        <w:rPr>
+          <w:b/>
+        </w:rPr>
+        <w:t>Artefact format:</w:t>
+      </w:r>
+      <w:r>
+        <w:t xml:space="preserve"> </w:t>
+      </w:r>
+      <w:r>
+        <w:rPr>
+          <w:rFonts w:ascii="Consolas" w:hAnsi="Consolas"/>
+          <w:color w:val="333333"/>
+          <w:sz w:val="20"/>
+        </w:rPr>
+        <w:t>joblib</w:t>
+      </w:r>
+      <w:r>
+        <w:t xml:space="preserve">-pickled sklearn </w:t>
+      </w:r>
+      <w:r>
+        <w:rPr>
+          <w:rFonts w:ascii="Consolas" w:hAnsi="Consolas"/>
+          <w:color w:val="333333"/>
+          <w:sz w:val="20"/>
+        </w:rPr>
+        <w:t>Pipeline</w:t>
+      </w:r>
+      <w:r>
+        <w:t xml:space="preserve"> (preprocessor +</w:t>
       </w:r>
     </w:p>
     <w:p>
       <w:r>
-        <w:t xml:space="preserve">  estimator in one object), plus a JSON sidecar (`best_model.json`).</w:t>
+        <w:t xml:space="preserve">  estimator in one object), plus a JSON sidecar (</w:t>
+      </w:r>
+      <w:r>
+        <w:rPr>
+          <w:rFonts w:ascii="Consolas" w:hAnsi="Consolas"/>
+          <w:color w:val="333333"/>
+          <w:sz w:val="20"/>
+        </w:rPr>
+        <w:t>best_model.json</w:t>
+      </w:r>
+      <w:r>
+        <w:t>).</w:t>
       </w:r>
     </w:p>
     <w:p>
@@ -1327,7 +2252,24 @@
         <w:pStyle w:val="ListBullet"/>
       </w:pPr>
       <w:r>
-        <w:t>**Dependency pin:** `requirements.txt` pins exact versions for numpy,</w:t>
+        <w:rPr>
+          <w:b/>
+        </w:rPr>
+        <w:t>Dependency pin:</w:t>
+      </w:r>
+      <w:r>
+        <w:t xml:space="preserve"> </w:t>
+      </w:r>
+      <w:r>
+        <w:rPr>
+          <w:rFonts w:ascii="Consolas" w:hAnsi="Consolas"/>
+          <w:color w:val="333333"/>
+          <w:sz w:val="20"/>
+        </w:rPr>
+        <w:t>requirements.txt</w:t>
+      </w:r>
+      <w:r>
+        <w:t xml:space="preserve"> pins exact versions for numpy,</w:t>
       </w:r>
     </w:p>
     <w:p>
@@ -1340,12 +2282,62 @@
         <w:pStyle w:val="ListBullet"/>
       </w:pPr>
       <w:r>
-        <w:t>**Conda alternative:** `environment.yml` (`name: heart-mlops`,</w:t>
+        <w:rPr>
+          <w:b/>
+        </w:rPr>
+        <w:t>Conda alternative:</w:t>
+      </w:r>
+      <w:r>
+        <w:t xml:space="preserve"> </w:t>
+      </w:r>
+      <w:r>
+        <w:rPr>
+          <w:rFonts w:ascii="Consolas" w:hAnsi="Consolas"/>
+          <w:color w:val="333333"/>
+          <w:sz w:val="20"/>
+        </w:rPr>
+        <w:t>environment.yml</w:t>
+      </w:r>
+      <w:r>
+        <w:t xml:space="preserve"> (</w:t>
+      </w:r>
+      <w:r>
+        <w:rPr>
+          <w:rFonts w:ascii="Consolas" w:hAnsi="Consolas"/>
+          <w:color w:val="333333"/>
+          <w:sz w:val="20"/>
+        </w:rPr>
+        <w:t>name: heart-mlops</w:t>
+      </w:r>
+      <w:r>
+        <w:t>,</w:t>
       </w:r>
     </w:p>
     <w:p>
       <w:r>
-        <w:t xml:space="preserve">  `python=3.11`, pip-installs `requirements.txt`).</w:t>
+        <w:t xml:space="preserve">  </w:t>
+      </w:r>
+      <w:r>
+        <w:rPr>
+          <w:rFonts w:ascii="Consolas" w:hAnsi="Consolas"/>
+          <w:color w:val="333333"/>
+          <w:sz w:val="20"/>
+        </w:rPr>
+        <w:t>python=3.11</w:t>
+      </w:r>
+      <w:r>
+        <w:t xml:space="preserve">, pip-installs </w:t>
+      </w:r>
+      <w:r>
+        <w:rPr>
+          <w:rFonts w:ascii="Consolas" w:hAnsi="Consolas"/>
+          <w:color w:val="333333"/>
+          <w:sz w:val="20"/>
+        </w:rPr>
+        <w:t>requirements.txt</w:t>
+      </w:r>
+      <w:r>
+        <w:t>).</w:t>
       </w:r>
     </w:p>
     <w:p>
@@ -1353,7 +2345,22 @@
         <w:pStyle w:val="ListBullet"/>
       </w:pPr>
       <w:r>
-        <w:t>**Pipeline reuse:** the API does **not** re-implement preprocessing â€” it</w:t>
+        <w:rPr>
+          <w:b/>
+        </w:rPr>
+        <w:t>Pipeline reuse:</w:t>
+      </w:r>
+      <w:r>
+        <w:t xml:space="preserve"> the API does </w:t>
+      </w:r>
+      <w:r>
+        <w:rPr>
+          <w:b/>
+        </w:rPr>
+        <w:t>not</w:t>
+      </w:r>
+      <w:r>
+        <w:t xml:space="preserve"> re-implement preprocessing — it</w:t>
       </w:r>
     </w:p>
     <w:p>
@@ -1374,13 +2381,21 @@
         <w:pStyle w:val="Heading1"/>
       </w:pPr>
       <w:r>
-        <w:t>7. Tests and CI *(Task 5 â€” 8 marks)*</w:t>
+        <w:t>7. Tests and CI *(Task 5 — 8 marks)*</w:t>
       </w:r>
     </w:p>
     <w:p/>
     <w:p>
       <w:r>
-        <w:t>`tests/` contains four files (9 tests in total, all green):</w:t>
+        <w:rPr>
+          <w:rFonts w:ascii="Consolas" w:hAnsi="Consolas"/>
+          <w:color w:val="333333"/>
+          <w:sz w:val="20"/>
+        </w:rPr>
+        <w:t>tests/</w:t>
+      </w:r>
+      <w:r>
+        <w:t xml:space="preserve"> contains four files (9 tests in total, all green):</w:t>
       </w:r>
     </w:p>
     <w:p/>
@@ -1400,6 +2415,7 @@
             <w:tcW w:type="dxa" w:w="4320"/>
           </w:tcPr>
           <w:p>
+            <w:r/>
             <w:r>
               <w:rPr>
                 <w:b/>
@@ -1413,6 +2429,7 @@
             <w:tcW w:type="dxa" w:w="4320"/>
           </w:tcPr>
           <w:p>
+            <w:r/>
             <w:r>
               <w:rPr>
                 <w:b/>
@@ -1428,8 +2445,14 @@
             <w:tcW w:type="dxa" w:w="4320"/>
           </w:tcPr>
           <w:p>
+            <w:r/>
             <w:r>
-              <w:t>`test_data.py`</w:t>
+              <w:rPr>
+                <w:rFonts w:ascii="Consolas" w:hAnsi="Consolas"/>
+                <w:color w:val="333333"/>
+                <w:sz w:val="20"/>
+              </w:rPr>
+              <w:t>test_data.py</w:t>
             </w:r>
           </w:p>
         </w:tc>
@@ -1438,8 +2461,17 @@
             <w:tcW w:type="dxa" w:w="4320"/>
           </w:tcPr>
           <w:p>
+            <w:r/>
             <w:r>
-              <w:t>`clean()` imputes, binarises target, preserves rows, leaves only numerics</w:t>
+              <w:rPr>
+                <w:rFonts w:ascii="Consolas" w:hAnsi="Consolas"/>
+                <w:color w:val="333333"/>
+                <w:sz w:val="20"/>
+              </w:rPr>
+              <w:t>clean()</w:t>
+            </w:r>
+            <w:r>
+              <w:t xml:space="preserve"> imputes, binarises target, preserves rows, leaves only numerics</w:t>
             </w:r>
           </w:p>
         </w:tc>
@@ -1450,8 +2482,14 @@
             <w:tcW w:type="dxa" w:w="4320"/>
           </w:tcPr>
           <w:p>
+            <w:r/>
             <w:r>
-              <w:t>`test_pipeline.py`</w:t>
+              <w:rPr>
+                <w:rFonts w:ascii="Consolas" w:hAnsi="Consolas"/>
+                <w:color w:val="333333"/>
+                <w:sz w:val="20"/>
+              </w:rPr>
+              <w:t>test_pipeline.py</w:t>
             </w:r>
           </w:p>
         </w:tc>
@@ -1460,8 +2498,17 @@
             <w:tcW w:type="dxa" w:w="4320"/>
           </w:tcPr>
           <w:p>
+            <w:r/>
             <w:r>
-              <w:t>`build_preprocessor()` fits/transforms and tolerates unseen categories</w:t>
+              <w:rPr>
+                <w:rFonts w:ascii="Consolas" w:hAnsi="Consolas"/>
+                <w:color w:val="333333"/>
+                <w:sz w:val="20"/>
+              </w:rPr>
+              <w:t>build_preprocessor()</w:t>
+            </w:r>
+            <w:r>
+              <w:t xml:space="preserve"> fits/transforms and tolerates unseen categories</w:t>
             </w:r>
           </w:p>
         </w:tc>
@@ -1472,8 +2519,14 @@
             <w:tcW w:type="dxa" w:w="4320"/>
           </w:tcPr>
           <w:p>
+            <w:r/>
             <w:r>
-              <w:t>`test_predict.py`</w:t>
+              <w:rPr>
+                <w:rFonts w:ascii="Consolas" w:hAnsi="Consolas"/>
+                <w:color w:val="333333"/>
+                <w:sz w:val="20"/>
+              </w:rPr>
+              <w:t>test_predict.py</w:t>
             </w:r>
           </w:p>
         </w:tc>
@@ -1482,6 +2535,7 @@
             <w:tcW w:type="dxa" w:w="4320"/>
           </w:tcPr>
           <w:p>
+            <w:r/>
             <w:r>
               <w:t>full pipeline (preprocessor + LR) trains and emits 2-class probabilities</w:t>
             </w:r>
@@ -1494,8 +2548,14 @@
             <w:tcW w:type="dxa" w:w="4320"/>
           </w:tcPr>
           <w:p>
+            <w:r/>
             <w:r>
-              <w:t>`test_api.py`</w:t>
+              <w:rPr>
+                <w:rFonts w:ascii="Consolas" w:hAnsi="Consolas"/>
+                <w:color w:val="333333"/>
+                <w:sz w:val="20"/>
+              </w:rPr>
+              <w:t>test_api.py</w:t>
             </w:r>
           </w:p>
         </w:tc>
@@ -1504,8 +2564,61 @@
             <w:tcW w:type="dxa" w:w="4320"/>
           </w:tcPr>
           <w:p>
+            <w:r/>
             <w:r>
-              <w:t>`/`, `/health`, `/predict`, `/metrics` via `TestClient`, model loaded on the fly</w:t>
+              <w:rPr>
+                <w:rFonts w:ascii="Consolas" w:hAnsi="Consolas"/>
+                <w:color w:val="333333"/>
+                <w:sz w:val="20"/>
+              </w:rPr>
+              <w:t>/</w:t>
+            </w:r>
+            <w:r>
+              <w:t xml:space="preserve">, </w:t>
+            </w:r>
+            <w:r>
+              <w:rPr>
+                <w:rFonts w:ascii="Consolas" w:hAnsi="Consolas"/>
+                <w:color w:val="333333"/>
+                <w:sz w:val="20"/>
+              </w:rPr>
+              <w:t>/health</w:t>
+            </w:r>
+            <w:r>
+              <w:t xml:space="preserve">, </w:t>
+            </w:r>
+            <w:r>
+              <w:rPr>
+                <w:rFonts w:ascii="Consolas" w:hAnsi="Consolas"/>
+                <w:color w:val="333333"/>
+                <w:sz w:val="20"/>
+              </w:rPr>
+              <w:t>/predict</w:t>
+            </w:r>
+            <w:r>
+              <w:t xml:space="preserve">, </w:t>
+            </w:r>
+            <w:r>
+              <w:rPr>
+                <w:rFonts w:ascii="Consolas" w:hAnsi="Consolas"/>
+                <w:color w:val="333333"/>
+                <w:sz w:val="20"/>
+              </w:rPr>
+              <w:t>/metrics</w:t>
+            </w:r>
+            <w:r>
+              <w:t xml:space="preserve"> via </w:t>
+            </w:r>
+            <w:r>
+              <w:rPr>
+                <w:rFonts w:ascii="Consolas" w:hAnsi="Consolas"/>
+                <w:color w:val="333333"/>
+                <w:sz w:val="20"/>
+              </w:rPr>
+              <w:t>TestClient</w:t>
+            </w:r>
+            <w:r>
+              <w:t>, model loaded on the fly</w:t>
             </w:r>
           </w:p>
         </w:tc>
@@ -1515,23 +2628,117 @@
     <w:p/>
     <w:p>
       <w:r>
-        <w:t>CI: `.github/workflows/ci.yml` (two jobs).</w:t>
+        <w:t xml:space="preserve">CI: </w:t>
+      </w:r>
+      <w:r>
+        <w:rPr>
+          <w:rFonts w:ascii="Consolas" w:hAnsi="Consolas"/>
+          <w:color w:val="333333"/>
+          <w:sz w:val="20"/>
+        </w:rPr>
+        <w:t>.github/workflows/ci.yml</w:t>
+      </w:r>
+      <w:r>
+        <w:t xml:space="preserve"> (two jobs).</w:t>
       </w:r>
     </w:p>
     <w:p/>
     <w:p>
       <w:r>
-        <w:t>1. **quality** â€” `pip install -r requirements.txt` â†’ `ruff check` â†’</w:t>
+        <w:t xml:space="preserve">1. </w:t>
+      </w:r>
+      <w:r>
+        <w:rPr>
+          <w:b/>
+        </w:rPr>
+        <w:t>quality</w:t>
+      </w:r>
+      <w:r>
+        <w:t xml:space="preserve"> — </w:t>
+      </w:r>
+      <w:r>
+        <w:rPr>
+          <w:rFonts w:ascii="Consolas" w:hAnsi="Consolas"/>
+          <w:color w:val="333333"/>
+          <w:sz w:val="20"/>
+        </w:rPr>
+        <w:t>pip install -r requirements.txt</w:t>
+      </w:r>
+      <w:r>
+        <w:t xml:space="preserve"> → </w:t>
+      </w:r>
+      <w:r>
+        <w:rPr>
+          <w:rFonts w:ascii="Consolas" w:hAnsi="Consolas"/>
+          <w:color w:val="333333"/>
+          <w:sz w:val="20"/>
+        </w:rPr>
+        <w:t>ruff check</w:t>
+      </w:r>
+      <w:r>
+        <w:t xml:space="preserve"> →</w:t>
       </w:r>
     </w:p>
     <w:p>
       <w:r>
-        <w:t xml:space="preserve">   `black --check` â†’ `pytest --cov=src` â†’ `python -m src.data.download`</w:t>
+        <w:t xml:space="preserve">   </w:t>
+      </w:r>
+      <w:r>
+        <w:rPr>
+          <w:rFonts w:ascii="Consolas" w:hAnsi="Consolas"/>
+          <w:color w:val="333333"/>
+          <w:sz w:val="20"/>
+        </w:rPr>
+        <w:t>black --check</w:t>
+      </w:r>
+      <w:r>
+        <w:t xml:space="preserve"> → </w:t>
+      </w:r>
+      <w:r>
+        <w:rPr>
+          <w:rFonts w:ascii="Consolas" w:hAnsi="Consolas"/>
+          <w:color w:val="333333"/>
+          <w:sz w:val="20"/>
+        </w:rPr>
+        <w:t>pytest --cov=src</w:t>
+      </w:r>
+      <w:r>
+        <w:t xml:space="preserve"> → </w:t>
+      </w:r>
+      <w:r>
+        <w:rPr>
+          <w:rFonts w:ascii="Consolas" w:hAnsi="Consolas"/>
+          <w:color w:val="333333"/>
+          <w:sz w:val="20"/>
+        </w:rPr>
+        <w:t>python -m src.data.download</w:t>
       </w:r>
     </w:p>
     <w:p>
       <w:r>
-        <w:t xml:space="preserve">   â†’ `python -m src.models.train` â†’ upload `coverage.xml` and the trained</w:t>
+        <w:t xml:space="preserve">   → </w:t>
+      </w:r>
+      <w:r>
+        <w:rPr>
+          <w:rFonts w:ascii="Consolas" w:hAnsi="Consolas"/>
+          <w:color w:val="333333"/>
+          <w:sz w:val="20"/>
+        </w:rPr>
+        <w:t>python -m src.models.train</w:t>
+      </w:r>
+      <w:r>
+        <w:t xml:space="preserve"> → upload </w:t>
+      </w:r>
+      <w:r>
+        <w:rPr>
+          <w:rFonts w:ascii="Consolas" w:hAnsi="Consolas"/>
+          <w:color w:val="333333"/>
+          <w:sz w:val="20"/>
+        </w:rPr>
+        <w:t>coverage.xml</w:t>
+      </w:r>
+      <w:r>
+        <w:t xml:space="preserve"> and the trained</w:t>
       </w:r>
     </w:p>
     <w:p>
@@ -1541,12 +2748,43 @@
     </w:p>
     <w:p>
       <w:r>
-        <w:t>2. **docker** â€” pulls the model artefact, `docker build`s the image,</w:t>
+        <w:t xml:space="preserve">2. </w:t>
+      </w:r>
+      <w:r>
+        <w:rPr>
+          <w:b/>
+        </w:rPr>
+        <w:t>docker</w:t>
+      </w:r>
+      <w:r>
+        <w:t xml:space="preserve"> — pulls the model artefact, </w:t>
+      </w:r>
+      <w:r>
+        <w:rPr>
+          <w:rFonts w:ascii="Consolas" w:hAnsi="Consolas"/>
+          <w:color w:val="333333"/>
+          <w:sz w:val="20"/>
+        </w:rPr>
+        <w:t>docker build</w:t>
+      </w:r>
+      <w:r>
+        <w:t>s the image,</w:t>
       </w:r>
     </w:p>
     <w:p>
       <w:r>
-        <w:t xml:space="preserve">   runs it, and probes `/health` until it returns 200.</w:t>
+        <w:t xml:space="preserve">   runs it, and probes </w:t>
+      </w:r>
+      <w:r>
+        <w:rPr>
+          <w:rFonts w:ascii="Consolas" w:hAnsi="Consolas"/>
+          <w:color w:val="333333"/>
+          <w:sz w:val="20"/>
+        </w:rPr>
+        <w:t>/health</w:t>
+      </w:r>
+      <w:r>
+        <w:t xml:space="preserve"> until it returns 200.</w:t>
       </w:r>
     </w:p>
     <w:p/>
@@ -1641,28 +2879,113 @@
         <w:pStyle w:val="Heading1"/>
       </w:pPr>
       <w:r>
-        <w:t>8. Containerisation *(Task 6 â€” 5 marks)*</w:t>
+        <w:t>8. Containerisation *(Task 6 — 5 marks)*</w:t>
       </w:r>
     </w:p>
     <w:p/>
     <w:p>
       <w:r>
-        <w:t>A two-stage Dockerfile (`python:3.11-slim` builder + runtime) installs</w:t>
+        <w:t>A two-stage Dockerfile (</w:t>
+      </w:r>
+      <w:r>
+        <w:rPr>
+          <w:rFonts w:ascii="Consolas" w:hAnsi="Consolas"/>
+          <w:color w:val="333333"/>
+          <w:sz w:val="20"/>
+        </w:rPr>
+        <w:t>python:3.11-slim</w:t>
+      </w:r>
+      <w:r>
+        <w:t xml:space="preserve"> builder + runtime) installs</w:t>
       </w:r>
     </w:p>
     <w:p>
       <w:r>
-        <w:t>deps into `/install`, copies only `src/` and `models/`, switches to a</w:t>
+        <w:t xml:space="preserve">deps into </w:t>
+      </w:r>
+      <w:r>
+        <w:rPr>
+          <w:rFonts w:ascii="Consolas" w:hAnsi="Consolas"/>
+          <w:color w:val="333333"/>
+          <w:sz w:val="20"/>
+        </w:rPr>
+        <w:t>/install</w:t>
+      </w:r>
+      <w:r>
+        <w:t xml:space="preserve">, copies only </w:t>
+      </w:r>
+      <w:r>
+        <w:rPr>
+          <w:rFonts w:ascii="Consolas" w:hAnsi="Consolas"/>
+          <w:color w:val="333333"/>
+          <w:sz w:val="20"/>
+        </w:rPr>
+        <w:t>src/</w:t>
+      </w:r>
+      <w:r>
+        <w:t xml:space="preserve"> and </w:t>
+      </w:r>
+      <w:r>
+        <w:rPr>
+          <w:rFonts w:ascii="Consolas" w:hAnsi="Consolas"/>
+          <w:color w:val="333333"/>
+          <w:sz w:val="20"/>
+        </w:rPr>
+        <w:t>models/</w:t>
+      </w:r>
+      <w:r>
+        <w:t>, switches to a</w:t>
       </w:r>
     </w:p>
     <w:p>
       <w:r>
-        <w:t>non-root `heart` user, and exposes `8000`. A `HEALTHCHECK` curls</w:t>
+        <w:t xml:space="preserve">non-root </w:t>
+      </w:r>
+      <w:r>
+        <w:rPr>
+          <w:rFonts w:ascii="Consolas" w:hAnsi="Consolas"/>
+          <w:color w:val="333333"/>
+          <w:sz w:val="20"/>
+        </w:rPr>
+        <w:t>heart</w:t>
+      </w:r>
+      <w:r>
+        <w:t xml:space="preserve"> user, and exposes </w:t>
+      </w:r>
+      <w:r>
+        <w:rPr>
+          <w:rFonts w:ascii="Consolas" w:hAnsi="Consolas"/>
+          <w:color w:val="333333"/>
+          <w:sz w:val="20"/>
+        </w:rPr>
+        <w:t>8000</w:t>
+      </w:r>
+      <w:r>
+        <w:t xml:space="preserve">. A </w:t>
+      </w:r>
+      <w:r>
+        <w:rPr>
+          <w:rFonts w:ascii="Consolas" w:hAnsi="Consolas"/>
+          <w:color w:val="333333"/>
+          <w:sz w:val="20"/>
+        </w:rPr>
+        <w:t>HEALTHCHECK</w:t>
+      </w:r>
+      <w:r>
+        <w:t xml:space="preserve"> curls</w:t>
       </w:r>
     </w:p>
     <w:p>
       <w:r>
-        <w:t>`/health` every 30 s.</w:t>
+        <w:rPr>
+          <w:rFonts w:ascii="Consolas" w:hAnsi="Consolas"/>
+          <w:color w:val="333333"/>
+          <w:sz w:val="20"/>
+        </w:rPr>
+        <w:t>/health</w:t>
+      </w:r>
+      <w:r>
+        <w:t xml:space="preserve"> every 30 s.</w:t>
       </w:r>
     </w:p>
     <w:p/>
@@ -1760,7 +3083,15 @@
     <w:p/>
     <w:p>
       <w:r>
-        <w:t>`docker-compose.yml` also brings up Prometheus and Grafana for the</w:t>
+        <w:rPr>
+          <w:rFonts w:ascii="Consolas" w:hAnsi="Consolas"/>
+          <w:color w:val="333333"/>
+          <w:sz w:val="20"/>
+        </w:rPr>
+        <w:t>docker-compose.yml</w:t>
+      </w:r>
+      <w:r>
+        <w:t xml:space="preserve"> also brings up Prometheus and Grafana for the</w:t>
       </w:r>
     </w:p>
     <w:p>
@@ -1774,7 +3105,7 @@
         <w:pStyle w:val="Heading1"/>
       </w:pPr>
       <w:r>
-        <w:t>9. Production deployment *(Task 7 â€” 7 marks)*</w:t>
+        <w:t>9. Production deployment *(Task 7 — 7 marks)*</w:t>
       </w:r>
     </w:p>
     <w:p/>
@@ -1795,7 +3126,37 @@
     <w:p/>
     <w:p>
       <w:r>
-        <w:t>`deploy/k8s/` contains a `Namespace`, `Deployment` (2 replicas, readiness</w:t>
+        <w:rPr>
+          <w:rFonts w:ascii="Consolas" w:hAnsi="Consolas"/>
+          <w:color w:val="333333"/>
+          <w:sz w:val="20"/>
+        </w:rPr>
+        <w:t>deploy/k8s/</w:t>
+      </w:r>
+      <w:r>
+        <w:t xml:space="preserve"> contains a </w:t>
+      </w:r>
+      <w:r>
+        <w:rPr>
+          <w:rFonts w:ascii="Consolas" w:hAnsi="Consolas"/>
+          <w:color w:val="333333"/>
+          <w:sz w:val="20"/>
+        </w:rPr>
+        <w:t>Namespace</w:t>
+      </w:r>
+      <w:r>
+        <w:t xml:space="preserve">, </w:t>
+      </w:r>
+      <w:r>
+        <w:rPr>
+          <w:rFonts w:ascii="Consolas" w:hAnsi="Consolas"/>
+          <w:color w:val="333333"/>
+          <w:sz w:val="20"/>
+        </w:rPr>
+        <w:t>Deployment</w:t>
+      </w:r>
+      <w:r>
+        <w:t xml:space="preserve"> (2 replicas, readiness</w:t>
       </w:r>
     </w:p>
     <w:p>
@@ -1805,12 +3166,64 @@
     </w:p>
     <w:p>
       <w:r>
-        <w:t>annotations), `Service` of type `LoadBalancer`, `Ingress` (`heart-api.local`</w:t>
+        <w:t xml:space="preserve">annotations), </w:t>
+      </w:r>
+      <w:r>
+        <w:rPr>
+          <w:rFonts w:ascii="Consolas" w:hAnsi="Consolas"/>
+          <w:color w:val="333333"/>
+          <w:sz w:val="20"/>
+        </w:rPr>
+        <w:t>Service</w:t>
+      </w:r>
+      <w:r>
+        <w:t xml:space="preserve"> of type </w:t>
+      </w:r>
+      <w:r>
+        <w:rPr>
+          <w:rFonts w:ascii="Consolas" w:hAnsi="Consolas"/>
+          <w:color w:val="333333"/>
+          <w:sz w:val="20"/>
+        </w:rPr>
+        <w:t>LoadBalancer</w:t>
+      </w:r>
+      <w:r>
+        <w:t xml:space="preserve">, </w:t>
+      </w:r>
+      <w:r>
+        <w:rPr>
+          <w:rFonts w:ascii="Consolas" w:hAnsi="Consolas"/>
+          <w:color w:val="333333"/>
+          <w:sz w:val="20"/>
+        </w:rPr>
+        <w:t>Ingress</w:t>
+      </w:r>
+      <w:r>
+        <w:t xml:space="preserve"> (</w:t>
+      </w:r>
+      <w:r>
+        <w:rPr>
+          <w:rFonts w:ascii="Consolas" w:hAnsi="Consolas"/>
+          <w:color w:val="333333"/>
+          <w:sz w:val="20"/>
+        </w:rPr>
+        <w:t>heart-api.local</w:t>
       </w:r>
     </w:p>
     <w:p>
       <w:r>
-        <w:t>on the nginx class), and an `HPA` (target 70% CPU, min 2 / max 6 pods).</w:t>
+        <w:t xml:space="preserve">on the nginx class), and an </w:t>
+      </w:r>
+      <w:r>
+        <w:rPr>
+          <w:rFonts w:ascii="Consolas" w:hAnsi="Consolas"/>
+          <w:color w:val="333333"/>
+          <w:sz w:val="20"/>
+        </w:rPr>
+        <w:t>HPA</w:t>
+      </w:r>
+      <w:r>
+        <w:t xml:space="preserve"> (target 70% CPU, min 2 / max 6 pods).</w:t>
       </w:r>
     </w:p>
     <w:p>
@@ -1820,7 +3233,26 @@
     </w:p>
     <w:p>
       <w:r>
-        <w:t>`deploy/helm/heart-api/` driven by `values.yaml`.</w:t>
+        <w:rPr>
+          <w:rFonts w:ascii="Consolas" w:hAnsi="Consolas"/>
+          <w:color w:val="333333"/>
+          <w:sz w:val="20"/>
+        </w:rPr>
+        <w:t>deploy/helm/heart-api/</w:t>
+      </w:r>
+      <w:r>
+        <w:t xml:space="preserve"> driven by </w:t>
+      </w:r>
+      <w:r>
+        <w:rPr>
+          <w:rFonts w:ascii="Consolas" w:hAnsi="Consolas"/>
+          <w:color w:val="333333"/>
+          <w:sz w:val="20"/>
+        </w:rPr>
+        <w:t>values.yaml</w:t>
+      </w:r>
+      <w:r>
+        <w:t>.</w:t>
       </w:r>
     </w:p>
     <w:p/>
@@ -1889,17 +3321,47 @@
     <w:p/>
     <w:p>
       <w:r>
-        <w:t>`deploy/render/render.yaml` is a Render Blueprint that provisions a free</w:t>
+        <w:rPr>
+          <w:rFonts w:ascii="Consolas" w:hAnsi="Consolas"/>
+          <w:color w:val="333333"/>
+          <w:sz w:val="20"/>
+        </w:rPr>
+        <w:t>deploy/render/render.yaml</w:t>
+      </w:r>
+      <w:r>
+        <w:t xml:space="preserve"> is a Render Blueprint that provisions a free</w:t>
       </w:r>
     </w:p>
     <w:p>
       <w:r>
-        <w:t>Docker web service from the GitHub repo with `/health` health-checks.</w:t>
+        <w:t xml:space="preserve">Docker web service from the GitHub repo with </w:t>
+      </w:r>
+      <w:r>
+        <w:rPr>
+          <w:rFonts w:ascii="Consolas" w:hAnsi="Consolas"/>
+          <w:color w:val="333333"/>
+          <w:sz w:val="20"/>
+        </w:rPr>
+        <w:t>/health</w:t>
+      </w:r>
+      <w:r>
+        <w:t xml:space="preserve"> health-checks.</w:t>
       </w:r>
     </w:p>
     <w:p>
       <w:r>
-        <w:t>Pushing to `main` triggers an auto-deploy; the resulting public URL is</w:t>
+        <w:t xml:space="preserve">Pushing to </w:t>
+      </w:r>
+      <w:r>
+        <w:rPr>
+          <w:rFonts w:ascii="Consolas" w:hAnsi="Consolas"/>
+          <w:color w:val="333333"/>
+          <w:sz w:val="20"/>
+        </w:rPr>
+        <w:t>main</w:t>
+      </w:r>
+      <w:r>
+        <w:t xml:space="preserve"> triggers an auto-deploy; the resulting public URL is</w:t>
       </w:r>
     </w:p>
     <w:p>
@@ -1910,17 +3372,53 @@
     <w:p/>
     <w:p>
       <w:r>
-        <w:t>**Deployed API URL:** &lt;https://heart-disease-mlops-yhb7.onrender.com&gt;</w:t>
+        <w:rPr>
+          <w:b/>
+        </w:rPr>
+        <w:t>Deployed API URL:</w:t>
+      </w:r>
+      <w:r>
+        <w:t xml:space="preserve"> </w:t>
+      </w:r>
+      <w:r>
+        <w:rPr>
+          <w:color w:val="1F497D"/>
+        </w:rPr>
+        <w:t>https://heart-disease-mlops-yhb7.onrender.com</w:t>
       </w:r>
     </w:p>
     <w:p>
       <w:r>
-        <w:t>**Swagger:** &lt;https://heart-disease-mlops-yhb7.onrender.com/docs&gt;</w:t>
+        <w:rPr>
+          <w:b/>
+        </w:rPr>
+        <w:t>Swagger:</w:t>
+      </w:r>
+      <w:r>
+        <w:t xml:space="preserve"> </w:t>
+      </w:r>
+      <w:r>
+        <w:rPr>
+          <w:color w:val="1F497D"/>
+        </w:rPr>
+        <w:t>https://heart-disease-mlops-yhb7.onrender.com/docs</w:t>
       </w:r>
     </w:p>
     <w:p>
       <w:r>
-        <w:t>**Health:** &lt;https://heart-disease-mlops-yhb7.onrender.com/health&gt;</w:t>
+        <w:rPr>
+          <w:b/>
+        </w:rPr>
+        <w:t>Health:</w:t>
+      </w:r>
+      <w:r>
+        <w:t xml:space="preserve"> </w:t>
+      </w:r>
+      <w:r>
+        <w:rPr>
+          <w:color w:val="1F497D"/>
+        </w:rPr>
+        <w:t>https://heart-disease-mlops-yhb7.onrender.com/health</w:t>
       </w:r>
     </w:p>
     <w:p/>
@@ -1946,6 +3444,7 @@
             <w:tcW w:type="dxa" w:w="4320"/>
           </w:tcPr>
           <w:p>
+            <w:r/>
             <w:r>
               <w:rPr>
                 <w:b/>
@@ -1959,6 +3458,7 @@
             <w:tcW w:type="dxa" w:w="4320"/>
           </w:tcPr>
           <w:p>
+            <w:r/>
             <w:r>
               <w:rPr>
                 <w:b/>
@@ -1974,8 +3474,14 @@
             <w:tcW w:type="dxa" w:w="4320"/>
           </w:tcPr>
           <w:p>
+            <w:r/>
             <w:r>
-              <w:t>`GET /health`</w:t>
+              <w:rPr>
+                <w:rFonts w:ascii="Consolas" w:hAnsi="Consolas"/>
+                <w:color w:val="333333"/>
+                <w:sz w:val="20"/>
+              </w:rPr>
+              <w:t>GET /health</w:t>
             </w:r>
           </w:p>
         </w:tc>
@@ -1984,8 +3490,14 @@
             <w:tcW w:type="dxa" w:w="4320"/>
           </w:tcPr>
           <w:p>
+            <w:r/>
             <w:r>
-              <w:t>`{"status":"ok","model_loaded":true,"version":"1.0.0"}`</w:t>
+              <w:rPr>
+                <w:rFonts w:ascii="Consolas" w:hAnsi="Consolas"/>
+                <w:color w:val="333333"/>
+                <w:sz w:val="20"/>
+              </w:rPr>
+              <w:t>{"status":"ok","model_loaded":true,"version":"1.0.0"}</w:t>
             </w:r>
           </w:p>
         </w:tc>
@@ -1996,8 +3508,17 @@
             <w:tcW w:type="dxa" w:w="4320"/>
           </w:tcPr>
           <w:p>
+            <w:r/>
             <w:r>
-              <w:t>`POST /predict` (high-risk sample)</w:t>
+              <w:rPr>
+                <w:rFonts w:ascii="Consolas" w:hAnsi="Consolas"/>
+                <w:color w:val="333333"/>
+                <w:sz w:val="20"/>
+              </w:rPr>
+              <w:t>POST /predict</w:t>
+            </w:r>
+            <w:r>
+              <w:t xml:space="preserve"> (high-risk sample)</w:t>
             </w:r>
           </w:p>
         </w:tc>
@@ -2006,8 +3527,14 @@
             <w:tcW w:type="dxa" w:w="4320"/>
           </w:tcPr>
           <w:p>
+            <w:r/>
             <w:r>
-              <w:t>`prediction=1, label="disease", probability_disease=0.997`</w:t>
+              <w:rPr>
+                <w:rFonts w:ascii="Consolas" w:hAnsi="Consolas"/>
+                <w:color w:val="333333"/>
+                <w:sz w:val="20"/>
+              </w:rPr>
+              <w:t>prediction=1, label="disease", probability_disease=0.997</w:t>
             </w:r>
           </w:p>
         </w:tc>
@@ -2018,8 +3545,17 @@
             <w:tcW w:type="dxa" w:w="4320"/>
           </w:tcPr>
           <w:p>
+            <w:r/>
             <w:r>
-              <w:t>`POST /predict` (low-risk sample)</w:t>
+              <w:rPr>
+                <w:rFonts w:ascii="Consolas" w:hAnsi="Consolas"/>
+                <w:color w:val="333333"/>
+                <w:sz w:val="20"/>
+              </w:rPr>
+              <w:t>POST /predict</w:t>
+            </w:r>
+            <w:r>
+              <w:t xml:space="preserve"> (low-risk sample)</w:t>
             </w:r>
           </w:p>
         </w:tc>
@@ -2028,8 +3564,14 @@
             <w:tcW w:type="dxa" w:w="4320"/>
           </w:tcPr>
           <w:p>
+            <w:r/>
             <w:r>
-              <w:t>`prediction=0, label="no_disease", probability_disease=0.0045`</w:t>
+              <w:rPr>
+                <w:rFonts w:ascii="Consolas" w:hAnsi="Consolas"/>
+                <w:color w:val="333333"/>
+                <w:sz w:val="20"/>
+              </w:rPr>
+              <w:t>prediction=0, label="no_disease", probability_disease=0.0045</w:t>
             </w:r>
           </w:p>
         </w:tc>
@@ -2040,8 +3582,14 @@
             <w:tcW w:type="dxa" w:w="4320"/>
           </w:tcPr>
           <w:p>
+            <w:r/>
             <w:r>
-              <w:t>`GET /metrics`</w:t>
+              <w:rPr>
+                <w:rFonts w:ascii="Consolas" w:hAnsi="Consolas"/>
+                <w:color w:val="333333"/>
+                <w:sz w:val="20"/>
+              </w:rPr>
+              <w:t>GET /metrics</w:t>
             </w:r>
           </w:p>
         </w:tc>
@@ -2050,8 +3598,20 @@
             <w:tcW w:type="dxa" w:w="4320"/>
           </w:tcPr>
           <w:p>
+            <w:r/>
             <w:r>
-              <w:t>Emits Prometheus exposition; `/metrics` excluded from self-instrumentation</w:t>
+              <w:t xml:space="preserve">Emits Prometheus exposition; </w:t>
+            </w:r>
+            <w:r>
+              <w:rPr>
+                <w:rFonts w:ascii="Consolas" w:hAnsi="Consolas"/>
+                <w:color w:val="333333"/>
+                <w:sz w:val="20"/>
+              </w:rPr>
+              <w:t>/metrics</w:t>
+            </w:r>
+            <w:r>
+              <w:t xml:space="preserve"> excluded from self-instrumentation</w:t>
             </w:r>
           </w:p>
         </w:tc>
@@ -2123,7 +3683,7 @@
         <w:pStyle w:val="Heading1"/>
       </w:pPr>
       <w:r>
-        <w:t>10. Monitoring and logging *(Task 8 â€” 3 marks)*</w:t>
+        <w:t>10. Monitoring and logging *(Task 8 — 3 marks)*</w:t>
       </w:r>
     </w:p>
     <w:p/>
@@ -2132,22 +3692,83 @@
         <w:pStyle w:val="ListBullet"/>
       </w:pPr>
       <w:r>
-        <w:t>**Metrics:** the API uses `prometheus_client` to expose three families</w:t>
+        <w:rPr>
+          <w:b/>
+        </w:rPr>
+        <w:t>Metrics:</w:t>
+      </w:r>
+      <w:r>
+        <w:t xml:space="preserve"> the API uses </w:t>
+      </w:r>
+      <w:r>
+        <w:rPr>
+          <w:rFonts w:ascii="Consolas" w:hAnsi="Consolas"/>
+          <w:color w:val="333333"/>
+          <w:sz w:val="20"/>
+        </w:rPr>
+        <w:t>prometheus_client</w:t>
+      </w:r>
+      <w:r>
+        <w:t xml:space="preserve"> to expose three families</w:t>
       </w:r>
     </w:p>
     <w:p>
       <w:r>
-        <w:t xml:space="preserve">  on `/metrics` â€” `heart_api_requests_total{endpoint,method,status}`,</w:t>
+        <w:t xml:space="preserve">  on </w:t>
+      </w:r>
+      <w:r>
+        <w:rPr>
+          <w:rFonts w:ascii="Consolas" w:hAnsi="Consolas"/>
+          <w:color w:val="333333"/>
+          <w:sz w:val="20"/>
+        </w:rPr>
+        <w:t>/metrics</w:t>
+      </w:r>
+      <w:r>
+        <w:t xml:space="preserve"> — </w:t>
+      </w:r>
+      <w:r>
+        <w:rPr>
+          <w:rFonts w:ascii="Consolas" w:hAnsi="Consolas"/>
+          <w:color w:val="333333"/>
+          <w:sz w:val="20"/>
+        </w:rPr>
+        <w:t>heart_api_requests_total{endpoint,method,status}</w:t>
+      </w:r>
+      <w:r>
+        <w:t>,</w:t>
       </w:r>
     </w:p>
     <w:p>
       <w:r>
-        <w:t xml:space="preserve">  `heart_api_request_seconds_bucket{endpoint,le}`, and</w:t>
+        <w:t xml:space="preserve">  </w:t>
+      </w:r>
+      <w:r>
+        <w:rPr>
+          <w:rFonts w:ascii="Consolas" w:hAnsi="Consolas"/>
+          <w:color w:val="333333"/>
+          <w:sz w:val="20"/>
+        </w:rPr>
+        <w:t>heart_api_request_seconds_bucket{endpoint,le}</w:t>
+      </w:r>
+      <w:r>
+        <w:t>, and</w:t>
       </w:r>
     </w:p>
     <w:p>
       <w:r>
-        <w:t xml:space="preserve">  `heart_api_predictions_total{label}`.</w:t>
+        <w:t xml:space="preserve">  </w:t>
+      </w:r>
+      <w:r>
+        <w:rPr>
+          <w:rFonts w:ascii="Consolas" w:hAnsi="Consolas"/>
+          <w:color w:val="333333"/>
+          <w:sz w:val="20"/>
+        </w:rPr>
+        <w:t>heart_api_predictions_total{label}</w:t>
+      </w:r>
+      <w:r>
+        <w:t>.</w:t>
       </w:r>
     </w:p>
     <w:p>
@@ -2155,7 +3776,35 @@
         <w:pStyle w:val="ListBullet"/>
       </w:pPr>
       <w:r>
-        <w:t>**Scraping:** `monitoring/prometheus.yml` declares a `heart-api` job</w:t>
+        <w:rPr>
+          <w:b/>
+        </w:rPr>
+        <w:t>Scraping:</w:t>
+      </w:r>
+      <w:r>
+        <w:t xml:space="preserve"> </w:t>
+      </w:r>
+      <w:r>
+        <w:rPr>
+          <w:rFonts w:ascii="Consolas" w:hAnsi="Consolas"/>
+          <w:color w:val="333333"/>
+          <w:sz w:val="20"/>
+        </w:rPr>
+        <w:t>monitoring/prometheus.yml</w:t>
+      </w:r>
+      <w:r>
+        <w:t xml:space="preserve"> declares a </w:t>
+      </w:r>
+      <w:r>
+        <w:rPr>
+          <w:rFonts w:ascii="Consolas" w:hAnsi="Consolas"/>
+          <w:color w:val="333333"/>
+          <w:sz w:val="20"/>
+        </w:rPr>
+        <w:t>heart-api</w:t>
+      </w:r>
+      <w:r>
+        <w:t xml:space="preserve"> job</w:t>
       </w:r>
     </w:p>
     <w:p>
@@ -2168,12 +3817,29 @@
         <w:pStyle w:val="ListBullet"/>
       </w:pPr>
       <w:r>
-        <w:t>**Dashboard:** Grafana is provisioned with the Prometheus data source</w:t>
+        <w:rPr>
+          <w:b/>
+        </w:rPr>
+        <w:t>Dashboard:</w:t>
+      </w:r>
+      <w:r>
+        <w:t xml:space="preserve"> Grafana is provisioned with the Prometheus data source</w:t>
       </w:r>
     </w:p>
     <w:p>
       <w:r>
-        <w:t xml:space="preserve">  and a four-panel dashboard (`monitoring/grafana/dashboards/heart-api.json`):</w:t>
+        <w:t xml:space="preserve">  and a four-panel dashboard (</w:t>
+      </w:r>
+      <w:r>
+        <w:rPr>
+          <w:rFonts w:ascii="Consolas" w:hAnsi="Consolas"/>
+          <w:color w:val="333333"/>
+          <w:sz w:val="20"/>
+        </w:rPr>
+        <w:t>monitoring/grafana/dashboards/heart-api.json</w:t>
+      </w:r>
+      <w:r>
+        <w:t>):</w:t>
       </w:r>
     </w:p>
     <w:p>
@@ -2191,17 +3857,56 @@
         <w:pStyle w:val="ListBullet"/>
       </w:pPr>
       <w:r>
-        <w:t>**Logging:** a JSON formatter (`python-json-logger`) emits one record</w:t>
+        <w:rPr>
+          <w:b/>
+        </w:rPr>
+        <w:t>Logging:</w:t>
+      </w:r>
+      <w:r>
+        <w:t xml:space="preserve"> a JSON formatter (</w:t>
+      </w:r>
+      <w:r>
+        <w:rPr>
+          <w:rFonts w:ascii="Consolas" w:hAnsi="Consolas"/>
+          <w:color w:val="333333"/>
+          <w:sz w:val="20"/>
+        </w:rPr>
+        <w:t>python-json-logger</w:t>
+      </w:r>
+      <w:r>
+        <w:t>) emits one record</w:t>
       </w:r>
     </w:p>
     <w:p>
       <w:r>
-        <w:t xml:space="preserve">  per request including a `request_id`, path, method, status, and</w:t>
+        <w:t xml:space="preserve">  per request including a </w:t>
+      </w:r>
+      <w:r>
+        <w:rPr>
+          <w:rFonts w:ascii="Consolas" w:hAnsi="Consolas"/>
+          <w:color w:val="333333"/>
+          <w:sz w:val="20"/>
+        </w:rPr>
+        <w:t>request_id</w:t>
+      </w:r>
+      <w:r>
+        <w:t>, path, method, status, and</w:t>
       </w:r>
     </w:p>
     <w:p>
       <w:r>
-        <w:t xml:space="preserve">  `duration_ms`, producing logs that are trivial to ingest into ELK /</w:t>
+        <w:t xml:space="preserve">  </w:t>
+      </w:r>
+      <w:r>
+        <w:rPr>
+          <w:rFonts w:ascii="Consolas" w:hAnsi="Consolas"/>
+          <w:color w:val="333333"/>
+          <w:sz w:val="20"/>
+        </w:rPr>
+        <w:t>duration_ms</w:t>
+      </w:r>
+      <w:r>
+        <w:t>, producing logs that are trivial to ingest into ELK /</w:t>
       </w:r>
     </w:p>
     <w:p>
@@ -2362,7 +4067,7 @@
         <w:pStyle w:val="Heading1"/>
       </w:pPr>
       <w:r>
-        <w:t>11. Documentation and reporting *(Task 9 â€” 2 marks)*</w:t>
+        <w:t>11. Documentation and reporting *(Task 9 — 2 marks)*</w:t>
       </w:r>
     </w:p>
     <w:p/>
@@ -2371,7 +4076,40 @@
         <w:pStyle w:val="ListBullet"/>
       </w:pPr>
       <w:r>
-        <w:t>This document â€” `docs/REPORT.md` (also exported as `REPORT.docx` and `REPORT.pdf`).</w:t>
+        <w:t xml:space="preserve">This document — </w:t>
+      </w:r>
+      <w:r>
+        <w:rPr>
+          <w:rFonts w:ascii="Consolas" w:hAnsi="Consolas"/>
+          <w:color w:val="333333"/>
+          <w:sz w:val="20"/>
+        </w:rPr>
+        <w:t>docs/REPORT.md</w:t>
+      </w:r>
+      <w:r>
+        <w:t xml:space="preserve"> (also exported as </w:t>
+      </w:r>
+      <w:r>
+        <w:rPr>
+          <w:rFonts w:ascii="Consolas" w:hAnsi="Consolas"/>
+          <w:color w:val="333333"/>
+          <w:sz w:val="20"/>
+        </w:rPr>
+        <w:t>REPORT.docx</w:t>
+      </w:r>
+      <w:r>
+        <w:t xml:space="preserve"> and </w:t>
+      </w:r>
+      <w:r>
+        <w:rPr>
+          <w:rFonts w:ascii="Consolas" w:hAnsi="Consolas"/>
+          <w:color w:val="333333"/>
+          <w:sz w:val="20"/>
+        </w:rPr>
+        <w:t>REPORT.pdf</w:t>
+      </w:r>
+      <w:r>
+        <w:t>).</w:t>
       </w:r>
     </w:p>
     <w:p>
@@ -2379,7 +4117,15 @@
         <w:pStyle w:val="ListBullet"/>
       </w:pPr>
       <w:r>
-        <w:t>`README.md` covers setup, Docker, Kubernetes, Render, CI/CD, and layout.</w:t>
+        <w:rPr>
+          <w:rFonts w:ascii="Consolas" w:hAnsi="Consolas"/>
+          <w:color w:val="333333"/>
+          <w:sz w:val="20"/>
+        </w:rPr>
+        <w:t>README.md</w:t>
+      </w:r>
+      <w:r>
+        <w:t xml:space="preserve"> covers setup, Docker, Kubernetes, Render, CI/CD, and layout.</w:t>
       </w:r>
     </w:p>
     <w:p>
@@ -2387,7 +4133,15 @@
         <w:pStyle w:val="ListBullet"/>
       </w:pPr>
       <w:r>
-        <w:t>`docs/architecture.md` includes a Mermaid + ASCII architecture diagram.</w:t>
+        <w:rPr>
+          <w:rFonts w:ascii="Consolas" w:hAnsi="Consolas"/>
+          <w:color w:val="333333"/>
+          <w:sz w:val="20"/>
+        </w:rPr>
+        <w:t>docs/architecture.md</w:t>
+      </w:r>
+      <w:r>
+        <w:t xml:space="preserve"> includes a Mermaid + ASCII architecture diagram.</w:t>
       </w:r>
     </w:p>
     <w:p>
@@ -2395,12 +4149,31 @@
         <w:pStyle w:val="ListBullet"/>
       </w:pPr>
       <w:r>
-        <w:t>`screenshots/` contains 15 PNGs referenced from this report and the</w:t>
+        <w:rPr>
+          <w:rFonts w:ascii="Consolas" w:hAnsi="Consolas"/>
+          <w:color w:val="333333"/>
+          <w:sz w:val="20"/>
+        </w:rPr>
+        <w:t>screenshots/</w:t>
+      </w:r>
+      <w:r>
+        <w:t xml:space="preserve"> contains 15 PNGs referenced from this report and the</w:t>
       </w:r>
     </w:p>
     <w:p>
       <w:r>
-        <w:t xml:space="preserve">  demo video (`docs/2026-05-09 17-51-37.mp4`).</w:t>
+        <w:t xml:space="preserve">  demo video (</w:t>
+      </w:r>
+      <w:r>
+        <w:rPr>
+          <w:rFonts w:ascii="Consolas" w:hAnsi="Consolas"/>
+          <w:color w:val="333333"/>
+          <w:sz w:val="20"/>
+        </w:rPr>
+        <w:t>docs/2026-05-09 17-51-37.mp4</w:t>
+      </w:r>
+      <w:r>
+        <w:t>).</w:t>
       </w:r>
     </w:p>
     <w:p/>
@@ -2415,288 +4188,246 @@
       </w:r>
     </w:p>
     <w:p/>
-    <w:tbl>
-      <w:tblPr>
-        <w:tblStyle w:val="LightGrid-Accent1"/>
-        <w:tblW w:type="auto" w:w="0"/>
-        <w:tblLook w:firstColumn="1" w:firstRow="1" w:lastColumn="0" w:lastRow="0" w:noHBand="0" w:noVBand="1" w:val="04A0"/>
-      </w:tblPr>
-      <w:tblGrid>
-        <w:gridCol w:w="4320"/>
-        <w:gridCol w:w="4320"/>
-      </w:tblGrid>
-      <w:tr>
-        <w:tc>
-          <w:tcPr>
-            <w:tcW w:type="dxa" w:w="4320"/>
-          </w:tcPr>
-          <w:p>
-            <w:r>
-              <w:rPr>
-                <w:b/>
-              </w:rPr>
-              <w:t>PDF deliverable</w:t>
-            </w:r>
-          </w:p>
-        </w:tc>
-        <w:tc>
-          <w:tcPr>
-            <w:tcW w:type="dxa" w:w="4320"/>
-          </w:tcPr>
-          <w:p>
-            <w:r>
-              <w:rPr>
-                <w:b/>
-              </w:rPr>
-              <w:t>Where</w:t>
-            </w:r>
-          </w:p>
-        </w:tc>
-      </w:tr>
-      <w:tr>
-        <w:tc>
-          <w:tcPr>
-            <w:tcW w:type="dxa" w:w="4320"/>
-          </w:tcPr>
-          <w:p>
-            <w:r>
-              <w:t>GitHub repo</w:t>
-            </w:r>
-          </w:p>
-        </w:tc>
-        <w:tc>
-          <w:tcPr>
-            <w:tcW w:type="dxa" w:w="4320"/>
-          </w:tcPr>
-          <w:p>
-            <w:r>
-              <w:t>`https://github.com/ddmtech2025cs05056/heart-disease-mlops`</w:t>
-            </w:r>
-          </w:p>
-        </w:tc>
-      </w:tr>
-      <w:tr>
-        <w:tc>
-          <w:tcPr>
-            <w:tcW w:type="dxa" w:w="4320"/>
-          </w:tcPr>
-          <w:p>
-            <w:r>
-              <w:t>Code, Dockerfile, requirements</w:t>
-            </w:r>
-          </w:p>
-        </w:tc>
-        <w:tc>
-          <w:tcPr>
-            <w:tcW w:type="dxa" w:w="4320"/>
-          </w:tcPr>
-          <w:p>
-            <w:r>
-              <w:t>repo root</w:t>
-            </w:r>
-          </w:p>
-        </w:tc>
-      </w:tr>
-      <w:tr>
-        <w:tc>
-          <w:tcPr>
-            <w:tcW w:type="dxa" w:w="4320"/>
-          </w:tcPr>
-          <w:p>
-            <w:r>
-              <w:t>Cleaned dataset + download script</w:t>
-            </w:r>
-          </w:p>
-        </w:tc>
-        <w:tc>
-          <w:tcPr>
-            <w:tcW w:type="dxa" w:w="4320"/>
-          </w:tcPr>
-          <w:p>
-            <w:r>
-              <w:t>`data/`, `src/data/{download,preprocess}.py`</w:t>
-            </w:r>
-          </w:p>
-        </w:tc>
-      </w:tr>
-      <w:tr>
-        <w:tc>
-          <w:tcPr>
-            <w:tcW w:type="dxa" w:w="4320"/>
-          </w:tcPr>
-          <w:p>
-            <w:r>
-              <w:t>Notebooks (EDA, training, inference)</w:t>
-            </w:r>
-          </w:p>
-        </w:tc>
-        <w:tc>
-          <w:tcPr>
-            <w:tcW w:type="dxa" w:w="4320"/>
-          </w:tcPr>
-          <w:p>
-            <w:r>
-              <w:t>`notebooks/01_eda.ipynb`, `notebooks/02_modeling.ipynb`</w:t>
-            </w:r>
-          </w:p>
-        </w:tc>
-      </w:tr>
-      <w:tr>
-        <w:tc>
-          <w:tcPr>
-            <w:tcW w:type="dxa" w:w="4320"/>
-          </w:tcPr>
-          <w:p>
-            <w:r>
-              <w:t>Tests folder</w:t>
-            </w:r>
-          </w:p>
-        </w:tc>
-        <w:tc>
-          <w:tcPr>
-            <w:tcW w:type="dxa" w:w="4320"/>
-          </w:tcPr>
-          <w:p>
-            <w:r>
-              <w:t>`tests/` (4 files, 9 tests)</w:t>
-            </w:r>
-          </w:p>
-        </w:tc>
-      </w:tr>
-      <w:tr>
-        <w:tc>
-          <w:tcPr>
-            <w:tcW w:type="dxa" w:w="4320"/>
-          </w:tcPr>
-          <w:p>
-            <w:r>
-              <w:t>GitHub Actions YAML</w:t>
-            </w:r>
-          </w:p>
-        </w:tc>
-        <w:tc>
-          <w:tcPr>
-            <w:tcW w:type="dxa" w:w="4320"/>
-          </w:tcPr>
-          <w:p>
-            <w:r>
-              <w:t>`.github/workflows/ci.yml`</w:t>
-            </w:r>
-          </w:p>
-        </w:tc>
-      </w:tr>
-      <w:tr>
-        <w:tc>
-          <w:tcPr>
-            <w:tcW w:type="dxa" w:w="4320"/>
-          </w:tcPr>
-          <w:p>
-            <w:r>
-              <w:t>Deployment manifests + Helm chart</w:t>
-            </w:r>
-          </w:p>
-        </w:tc>
-        <w:tc>
-          <w:tcPr>
-            <w:tcW w:type="dxa" w:w="4320"/>
-          </w:tcPr>
-          <w:p>
-            <w:r>
-              <w:t>`deploy/k8s/`, `deploy/helm/heart-api/`</w:t>
-            </w:r>
-          </w:p>
-        </w:tc>
-      </w:tr>
-      <w:tr>
-        <w:tc>
-          <w:tcPr>
-            <w:tcW w:type="dxa" w:w="4320"/>
-          </w:tcPr>
-          <w:p>
-            <w:r>
-              <w:t>Screenshot folder</w:t>
-            </w:r>
-          </w:p>
-        </w:tc>
-        <w:tc>
-          <w:tcPr>
-            <w:tcW w:type="dxa" w:w="4320"/>
-          </w:tcPr>
-          <w:p>
-            <w:r>
-              <w:t>`screenshots/` (19 PNGs)</w:t>
-            </w:r>
-          </w:p>
-        </w:tc>
-      </w:tr>
-      <w:tr>
-        <w:tc>
-          <w:tcPr>
-            <w:tcW w:type="dxa" w:w="4320"/>
-          </w:tcPr>
-          <w:p>
-            <w:r>
-              <w:t>Final 10-page report (.pdf, .docx, .md)</w:t>
-            </w:r>
-          </w:p>
-        </w:tc>
-        <w:tc>
-          <w:tcPr>
-            <w:tcW w:type="dxa" w:w="4320"/>
-          </w:tcPr>
-          <w:p>
-            <w:r>
-              <w:t>`docs/REPORT.pdf`, `docs/REPORT.docx`, `docs/REPORT.md`</w:t>
-            </w:r>
-          </w:p>
-        </w:tc>
-      </w:tr>
-      <w:tr>
-        <w:tc>
-          <w:tcPr>
-            <w:tcW w:type="dxa" w:w="4320"/>
-          </w:tcPr>
-          <w:p>
-            <w:r>
-              <w:t>Demo video</w:t>
-            </w:r>
-          </w:p>
-        </w:tc>
-        <w:tc>
-          <w:tcPr>
-            <w:tcW w:type="dxa" w:w="4320"/>
-          </w:tcPr>
-          <w:p>
-            <w:r>
-              <w:t>`docs/2026-05-09 17-51-37.mp4`</w:t>
-            </w:r>
-          </w:p>
-        </w:tc>
-      </w:tr>
-      <w:tr>
-        <w:tc>
-          <w:tcPr>
-            <w:tcW w:type="dxa" w:w="4320"/>
-          </w:tcPr>
-          <w:p>
-            <w:r>
-              <w:t>Deployed API URL</w:t>
-            </w:r>
-          </w:p>
-        </w:tc>
-        <w:tc>
-          <w:tcPr>
-            <w:tcW w:type="dxa" w:w="4320"/>
-          </w:tcPr>
-          <w:p>
-            <w:r>
-              <w:t>&lt;https://heart-disease-mlops-yhb7.onrender.com&gt; (Render) â€” local: `kubectl port-forward svc/heart-api 8000:80`</w:t>
-            </w:r>
-          </w:p>
-        </w:tc>
-      </w:tr>
-    </w:tbl>
+    <w:p>
+      <w:r>
+        <w:t>Everything the assignment asks for is included in this submission:</w:t>
+      </w:r>
+    </w:p>
     <w:p/>
+    <w:p>
+      <w:pPr>
+        <w:pStyle w:val="ListBullet"/>
+      </w:pPr>
+      <w:r>
+        <w:t xml:space="preserve">The complete project source code, the Dockerfile and the pinned </w:t>
+      </w:r>
+      <w:r>
+        <w:rPr>
+          <w:rFonts w:ascii="Consolas" w:hAnsi="Consolas"/>
+          <w:color w:val="333333"/>
+          <w:sz w:val="20"/>
+        </w:rPr>
+        <w:t>requirements.txt</w:t>
+      </w:r>
+      <w:r>
+        <w:t xml:space="preserve"> are in the GitHub repository: https://github.com/ddmtech2025cs05056/heart-disease-mlops</w:t>
+      </w:r>
+    </w:p>
+    <w:p>
+      <w:pPr>
+        <w:pStyle w:val="ListBullet"/>
+      </w:pPr>
+      <w:r>
+        <w:t xml:space="preserve">The cleaned dataset and the script that downloads and preprocesses it are under </w:t>
+      </w:r>
+      <w:r>
+        <w:rPr>
+          <w:rFonts w:ascii="Consolas" w:hAnsi="Consolas"/>
+          <w:color w:val="333333"/>
+          <w:sz w:val="20"/>
+        </w:rPr>
+        <w:t>data/</w:t>
+      </w:r>
+      <w:r>
+        <w:t xml:space="preserve"> and </w:t>
+      </w:r>
+      <w:r>
+        <w:rPr>
+          <w:rFonts w:ascii="Consolas" w:hAnsi="Consolas"/>
+          <w:color w:val="333333"/>
+          <w:sz w:val="20"/>
+        </w:rPr>
+        <w:t>src/data/</w:t>
+      </w:r>
+      <w:r>
+        <w:t>.</w:t>
+      </w:r>
+    </w:p>
+    <w:p>
+      <w:pPr>
+        <w:pStyle w:val="ListBullet"/>
+      </w:pPr>
+      <w:r>
+        <w:t xml:space="preserve">Two Jupyter notebooks are provided in </w:t>
+      </w:r>
+      <w:r>
+        <w:rPr>
+          <w:rFonts w:ascii="Consolas" w:hAnsi="Consolas"/>
+          <w:color w:val="333333"/>
+          <w:sz w:val="20"/>
+        </w:rPr>
+        <w:t>notebooks/</w:t>
+      </w:r>
+      <w:r>
+        <w:t xml:space="preserve"> — one for exploratory data analysis and one for modelling.</w:t>
+      </w:r>
+    </w:p>
+    <w:p>
+      <w:pPr>
+        <w:pStyle w:val="ListBullet"/>
+      </w:pPr>
+      <w:r>
+        <w:t xml:space="preserve">All unit and integration tests are in the </w:t>
+      </w:r>
+      <w:r>
+        <w:rPr>
+          <w:rFonts w:ascii="Consolas" w:hAnsi="Consolas"/>
+          <w:color w:val="333333"/>
+          <w:sz w:val="20"/>
+        </w:rPr>
+        <w:t>tests/</w:t>
+      </w:r>
+      <w:r>
+        <w:t xml:space="preserve"> folder (four files, nine tests, all passing).</w:t>
+      </w:r>
+    </w:p>
+    <w:p>
+      <w:pPr>
+        <w:pStyle w:val="ListBullet"/>
+      </w:pPr>
+      <w:r>
+        <w:t xml:space="preserve">The GitHub Actions pipeline that runs lint, tests and the Docker build lives at </w:t>
+      </w:r>
+      <w:r>
+        <w:rPr>
+          <w:rFonts w:ascii="Consolas" w:hAnsi="Consolas"/>
+          <w:color w:val="333333"/>
+          <w:sz w:val="20"/>
+        </w:rPr>
+        <w:t>.github/workflows/ci.yml</w:t>
+      </w:r>
+      <w:r>
+        <w:t>.</w:t>
+      </w:r>
+    </w:p>
+    <w:p>
+      <w:pPr>
+        <w:pStyle w:val="ListBullet"/>
+      </w:pPr>
+      <w:r>
+        <w:t xml:space="preserve">The Kubernetes deployment manifests and the Helm chart are in </w:t>
+      </w:r>
+      <w:r>
+        <w:rPr>
+          <w:rFonts w:ascii="Consolas" w:hAnsi="Consolas"/>
+          <w:color w:val="333333"/>
+          <w:sz w:val="20"/>
+        </w:rPr>
+        <w:t>deploy/k8s/</w:t>
+      </w:r>
+      <w:r>
+        <w:t xml:space="preserve"> and </w:t>
+      </w:r>
+      <w:r>
+        <w:rPr>
+          <w:rFonts w:ascii="Consolas" w:hAnsi="Consolas"/>
+          <w:color w:val="333333"/>
+          <w:sz w:val="20"/>
+        </w:rPr>
+        <w:t>deploy/helm/heart-api/</w:t>
+      </w:r>
+      <w:r>
+        <w:t>.</w:t>
+      </w:r>
+    </w:p>
+    <w:p>
+      <w:pPr>
+        <w:pStyle w:val="ListBullet"/>
+      </w:pPr>
+      <w:r>
+        <w:t xml:space="preserve">Screenshots covering every major step are collected in the </w:t>
+      </w:r>
+      <w:r>
+        <w:rPr>
+          <w:rFonts w:ascii="Consolas" w:hAnsi="Consolas"/>
+          <w:color w:val="333333"/>
+          <w:sz w:val="20"/>
+        </w:rPr>
+        <w:t>screenshots/</w:t>
+      </w:r>
+      <w:r>
+        <w:t xml:space="preserve"> folder.</w:t>
+      </w:r>
+    </w:p>
+    <w:p>
+      <w:pPr>
+        <w:pStyle w:val="ListBullet"/>
+      </w:pPr>
+      <w:r>
+        <w:t xml:space="preserve">This final report is delivered in three formats: </w:t>
+      </w:r>
+      <w:r>
+        <w:rPr>
+          <w:rFonts w:ascii="Consolas" w:hAnsi="Consolas"/>
+          <w:color w:val="333333"/>
+          <w:sz w:val="20"/>
+        </w:rPr>
+        <w:t>docs/REPORT.pdf</w:t>
+      </w:r>
+      <w:r>
+        <w:t xml:space="preserve">, </w:t>
+      </w:r>
+      <w:r>
+        <w:rPr>
+          <w:rFonts w:ascii="Consolas" w:hAnsi="Consolas"/>
+          <w:color w:val="333333"/>
+          <w:sz w:val="20"/>
+        </w:rPr>
+        <w:t>docs/REPORT.docx</w:t>
+      </w:r>
+      <w:r>
+        <w:t xml:space="preserve"> and </w:t>
+      </w:r>
+      <w:r>
+        <w:rPr>
+          <w:rFonts w:ascii="Consolas" w:hAnsi="Consolas"/>
+          <w:color w:val="333333"/>
+          <w:sz w:val="20"/>
+        </w:rPr>
+        <w:t>docs/REPORT.md</w:t>
+      </w:r>
+      <w:r>
+        <w:t>.</w:t>
+      </w:r>
+    </w:p>
+    <w:p>
+      <w:pPr>
+        <w:pStyle w:val="ListBullet"/>
+      </w:pPr>
+      <w:r>
+        <w:t xml:space="preserve">A short demo video that walks through the whole pipeline end-to-end is at </w:t>
+      </w:r>
+      <w:r>
+        <w:rPr>
+          <w:rFonts w:ascii="Consolas" w:hAnsi="Consolas"/>
+          <w:color w:val="333333"/>
+          <w:sz w:val="20"/>
+        </w:rPr>
+        <w:t>docs/2026-05-09 17-51-37.mp4</w:t>
+      </w:r>
+      <w:r>
+        <w:t>. The same video is also available on Google Drive at https://drive.google.com/file/d/106ABOgXefeEAvOQdUCnteJ9P6vjYF_M1/view.</w:t>
+      </w:r>
+    </w:p>
+    <w:p>
+      <w:pPr>
+        <w:pStyle w:val="ListBullet"/>
+      </w:pPr>
+      <w:r>
+        <w:t xml:space="preserve">The API is deployed and running publicly at https://heart-disease-mlops-yhb7.onrender.com (live URL). For a local run the same service can be reached with </w:t>
+      </w:r>
+      <w:r>
+        <w:rPr>
+          <w:rFonts w:ascii="Consolas" w:hAnsi="Consolas"/>
+          <w:color w:val="333333"/>
+          <w:sz w:val="20"/>
+        </w:rPr>
+        <w:t>kubectl port-forward svc/heart-api 8000:80</w:t>
+      </w:r>
+      <w:r>
+        <w:t xml:space="preserve"> after applying the Kubernetes manifests.</w:t>
+      </w:r>
+    </w:p>
     <w:p/>
     <w:p/>
     <w:p/>

</xml_diff>

<commit_message>
docs: present executive summary and deliverables checklist as tables in PDF/DOCX
</commit_message>
<xml_diff>
--- a/docs/REPORT.docx
+++ b/docs/REPORT.docx
@@ -397,230 +397,820 @@
     </w:p>
     <w:p>
       <w:r>
-        <w:t>Cleveland — 303 rows × 14 columns). It exercises every stage of the</w:t>
+        <w:t>Cleveland — 303 rows × 14 columns). The table below summarises every</w:t>
       </w:r>
     </w:p>
     <w:p>
       <w:r>
-        <w:t>modern MLOps lifecycle requested by the assignment:</w:t>
+        <w:t>stage of the modern MLOps lifecycle exercised by this assignment.</w:t>
       </w:r>
     </w:p>
     <w:p/>
+    <w:tbl>
+      <w:tblPr>
+        <w:tblStyle w:val="LightGrid-Accent1"/>
+        <w:tblW w:type="auto" w:w="0"/>
+        <w:tblLook w:firstColumn="1" w:firstRow="1" w:lastColumn="0" w:lastRow="0" w:noHBand="0" w:noVBand="1" w:val="04A0"/>
+      </w:tblPr>
+      <w:tblGrid>
+        <w:gridCol w:w="2880"/>
+        <w:gridCol w:w="2880"/>
+        <w:gridCol w:w="2880"/>
+      </w:tblGrid>
+      <w:tr>
+        <w:tc>
+          <w:tcPr>
+            <w:tcW w:type="dxa" w:w="2880"/>
+          </w:tcPr>
+          <w:p>
+            <w:r/>
+            <w:r>
+              <w:rPr>
+                <w:b/>
+              </w:rPr>
+              <w:t>#</w:t>
+            </w:r>
+          </w:p>
+        </w:tc>
+        <w:tc>
+          <w:tcPr>
+            <w:tcW w:type="dxa" w:w="2880"/>
+          </w:tcPr>
+          <w:p>
+            <w:r/>
+            <w:r>
+              <w:rPr>
+                <w:b/>
+              </w:rPr>
+              <w:t>MLOps lifecycle stage</w:t>
+            </w:r>
+          </w:p>
+        </w:tc>
+        <w:tc>
+          <w:tcPr>
+            <w:tcW w:type="dxa" w:w="2880"/>
+          </w:tcPr>
+          <w:p>
+            <w:r/>
+            <w:r>
+              <w:rPr>
+                <w:b/>
+              </w:rPr>
+              <w:t>What this project does</w:t>
+            </w:r>
+          </w:p>
+        </w:tc>
+      </w:tr>
+      <w:tr>
+        <w:tc>
+          <w:tcPr>
+            <w:tcW w:type="dxa" w:w="2880"/>
+          </w:tcPr>
+          <w:p>
+            <w:r/>
+            <w:r>
+              <w:t>1</w:t>
+            </w:r>
+          </w:p>
+        </w:tc>
+        <w:tc>
+          <w:tcPr>
+            <w:tcW w:type="dxa" w:w="2880"/>
+          </w:tcPr>
+          <w:p>
+            <w:r/>
+            <w:r>
+              <w:t>Data acquisition and EDA</w:t>
+            </w:r>
+          </w:p>
+        </w:tc>
+        <w:tc>
+          <w:tcPr>
+            <w:tcW w:type="dxa" w:w="2880"/>
+          </w:tcPr>
+          <w:p>
+            <w:r/>
+            <w:r>
+              <w:t>Reproducible download from UCI; cleaning, imputation, target binarisation; notebook with class balance, correlations, distributions</w:t>
+            </w:r>
+          </w:p>
+        </w:tc>
+      </w:tr>
+      <w:tr>
+        <w:tc>
+          <w:tcPr>
+            <w:tcW w:type="dxa" w:w="2880"/>
+          </w:tcPr>
+          <w:p>
+            <w:r/>
+            <w:r>
+              <w:t>2</w:t>
+            </w:r>
+          </w:p>
+        </w:tc>
+        <w:tc>
+          <w:tcPr>
+            <w:tcW w:type="dxa" w:w="2880"/>
+          </w:tcPr>
+          <w:p>
+            <w:r/>
+            <w:r>
+              <w:t>Feature engineering</w:t>
+            </w:r>
+          </w:p>
+        </w:tc>
+        <w:tc>
+          <w:tcPr>
+            <w:tcW w:type="dxa" w:w="2880"/>
+          </w:tcPr>
+          <w:p>
+            <w:r/>
+            <w:r>
+              <w:t xml:space="preserve">Shared sklearn </w:t>
+            </w:r>
+            <w:r>
+              <w:rPr>
+                <w:rFonts w:ascii="Consolas" w:hAnsi="Consolas"/>
+                <w:color w:val="333333"/>
+                <w:sz w:val="20"/>
+              </w:rPr>
+              <w:t>ColumnTransformer</w:t>
+            </w:r>
+            <w:r>
+              <w:t xml:space="preserve"> (median impute + scaler for numerics; mode impute + one-hot for categoricals) used at both train and serve time</w:t>
+            </w:r>
+          </w:p>
+        </w:tc>
+      </w:tr>
+      <w:tr>
+        <w:tc>
+          <w:tcPr>
+            <w:tcW w:type="dxa" w:w="2880"/>
+          </w:tcPr>
+          <w:p>
+            <w:r/>
+            <w:r>
+              <w:t>3</w:t>
+            </w:r>
+          </w:p>
+        </w:tc>
+        <w:tc>
+          <w:tcPr>
+            <w:tcW w:type="dxa" w:w="2880"/>
+          </w:tcPr>
+          <w:p>
+            <w:r/>
+            <w:r>
+              <w:t>Modelling</w:t>
+            </w:r>
+          </w:p>
+        </w:tc>
+        <w:tc>
+          <w:tcPr>
+            <w:tcW w:type="dxa" w:w="2880"/>
+          </w:tcPr>
+          <w:p>
+            <w:r/>
+            <w:r>
+              <w:t>Three competing classifiers (Logistic Regression, Random Forest, XGBoost) trained side by side</w:t>
+            </w:r>
+          </w:p>
+        </w:tc>
+      </w:tr>
+      <w:tr>
+        <w:tc>
+          <w:tcPr>
+            <w:tcW w:type="dxa" w:w="2880"/>
+          </w:tcPr>
+          <w:p>
+            <w:r/>
+            <w:r>
+              <w:t>4</w:t>
+            </w:r>
+          </w:p>
+        </w:tc>
+        <w:tc>
+          <w:tcPr>
+            <w:tcW w:type="dxa" w:w="2880"/>
+          </w:tcPr>
+          <w:p>
+            <w:r/>
+            <w:r>
+              <w:t>Hyper-parameter search</w:t>
+            </w:r>
+          </w:p>
+        </w:tc>
+        <w:tc>
+          <w:tcPr>
+            <w:tcW w:type="dxa" w:w="2880"/>
+          </w:tcPr>
+          <w:p>
+            <w:r/>
+            <w:r>
+              <w:rPr>
+                <w:rFonts w:ascii="Consolas" w:hAnsi="Consolas"/>
+                <w:color w:val="333333"/>
+                <w:sz w:val="20"/>
+              </w:rPr>
+              <w:t>GridSearchCV</w:t>
+            </w:r>
+            <w:r>
+              <w:t xml:space="preserve"> with stratified 5-fold cross-validation, scored on ROC-AUC</w:t>
+            </w:r>
+          </w:p>
+        </w:tc>
+      </w:tr>
+      <w:tr>
+        <w:tc>
+          <w:tcPr>
+            <w:tcW w:type="dxa" w:w="2880"/>
+          </w:tcPr>
+          <w:p>
+            <w:r/>
+            <w:r>
+              <w:t>5</w:t>
+            </w:r>
+          </w:p>
+        </w:tc>
+        <w:tc>
+          <w:tcPr>
+            <w:tcW w:type="dxa" w:w="2880"/>
+          </w:tcPr>
+          <w:p>
+            <w:r/>
+            <w:r>
+              <w:t>Experiment tracking</w:t>
+            </w:r>
+          </w:p>
+        </w:tc>
+        <w:tc>
+          <w:tcPr>
+            <w:tcW w:type="dxa" w:w="2880"/>
+          </w:tcPr>
+          <w:p>
+            <w:r/>
+            <w:r>
+              <w:rPr>
+                <w:b/>
+              </w:rPr>
+              <w:t>MLflow</w:t>
+            </w:r>
+            <w:r>
+              <w:t xml:space="preserve"> logs params, six metrics, ROC/PR/confusion-matrix plots and the fitted pipeline for every run</w:t>
+            </w:r>
+          </w:p>
+        </w:tc>
+      </w:tr>
+      <w:tr>
+        <w:tc>
+          <w:tcPr>
+            <w:tcW w:type="dxa" w:w="2880"/>
+          </w:tcPr>
+          <w:p>
+            <w:r/>
+            <w:r>
+              <w:t>6</w:t>
+            </w:r>
+          </w:p>
+        </w:tc>
+        <w:tc>
+          <w:tcPr>
+            <w:tcW w:type="dxa" w:w="2880"/>
+          </w:tcPr>
+          <w:p>
+            <w:r/>
+            <w:r>
+              <w:t>Reusable model artefact</w:t>
+            </w:r>
+          </w:p>
+        </w:tc>
+        <w:tc>
+          <w:tcPr>
+            <w:tcW w:type="dxa" w:w="2880"/>
+          </w:tcPr>
+          <w:p>
+            <w:r/>
+            <w:r>
+              <w:t xml:space="preserve">Persisted as </w:t>
+            </w:r>
+            <w:r>
+              <w:rPr>
+                <w:rFonts w:ascii="Consolas" w:hAnsi="Consolas"/>
+                <w:color w:val="333333"/>
+                <w:sz w:val="20"/>
+              </w:rPr>
+              <w:t>models/heart_pipeline.joblib</w:t>
+            </w:r>
+            <w:r>
+              <w:t xml:space="preserve"> plus a JSON sidecar with headline metrics</w:t>
+            </w:r>
+          </w:p>
+        </w:tc>
+      </w:tr>
+      <w:tr>
+        <w:tc>
+          <w:tcPr>
+            <w:tcW w:type="dxa" w:w="2880"/>
+          </w:tcPr>
+          <w:p>
+            <w:r/>
+            <w:r>
+              <w:t>7</w:t>
+            </w:r>
+          </w:p>
+        </w:tc>
+        <w:tc>
+          <w:tcPr>
+            <w:tcW w:type="dxa" w:w="2880"/>
+          </w:tcPr>
+          <w:p>
+            <w:r/>
+            <w:r>
+              <w:t>Tests and CI</w:t>
+            </w:r>
+          </w:p>
+        </w:tc>
+        <w:tc>
+          <w:tcPr>
+            <w:tcW w:type="dxa" w:w="2880"/>
+          </w:tcPr>
+          <w:p>
+            <w:r/>
+            <w:r>
+              <w:rPr>
+                <w:b/>
+              </w:rPr>
+              <w:t>pytest</w:t>
+            </w:r>
+            <w:r>
+              <w:t xml:space="preserve"> unit + integration tests (9 tests) executed by </w:t>
+            </w:r>
+            <w:r>
+              <w:rPr>
+                <w:b/>
+              </w:rPr>
+              <w:t>GitHub Actions</w:t>
+            </w:r>
+            <w:r>
+              <w:t xml:space="preserve"> on every push</w:t>
+            </w:r>
+          </w:p>
+        </w:tc>
+      </w:tr>
+      <w:tr>
+        <w:tc>
+          <w:tcPr>
+            <w:tcW w:type="dxa" w:w="2880"/>
+          </w:tcPr>
+          <w:p>
+            <w:r/>
+            <w:r>
+              <w:t>8</w:t>
+            </w:r>
+          </w:p>
+        </w:tc>
+        <w:tc>
+          <w:tcPr>
+            <w:tcW w:type="dxa" w:w="2880"/>
+          </w:tcPr>
+          <w:p>
+            <w:r/>
+            <w:r>
+              <w:t>Containerisation</w:t>
+            </w:r>
+          </w:p>
+        </w:tc>
+        <w:tc>
+          <w:tcPr>
+            <w:tcW w:type="dxa" w:w="2880"/>
+          </w:tcPr>
+          <w:p>
+            <w:r/>
+            <w:r>
+              <w:t xml:space="preserve">Two-stage </w:t>
+            </w:r>
+            <w:r>
+              <w:rPr>
+                <w:b/>
+              </w:rPr>
+              <w:t>Docker</w:t>
+            </w:r>
+            <w:r>
+              <w:t xml:space="preserve"> image (</w:t>
+            </w:r>
+            <w:r>
+              <w:rPr>
+                <w:rFonts w:ascii="Consolas" w:hAnsi="Consolas"/>
+                <w:color w:val="333333"/>
+                <w:sz w:val="20"/>
+              </w:rPr>
+              <w:t>python:3.11-slim</w:t>
+            </w:r>
+            <w:r>
+              <w:t xml:space="preserve">), non-root user, </w:t>
+            </w:r>
+            <w:r>
+              <w:rPr>
+                <w:rFonts w:ascii="Consolas" w:hAnsi="Consolas"/>
+                <w:color w:val="333333"/>
+                <w:sz w:val="20"/>
+              </w:rPr>
+              <w:t>HEALTHCHECK</w:t>
+            </w:r>
+            <w:r>
+              <w:t xml:space="preserve"> on </w:t>
+            </w:r>
+            <w:r>
+              <w:rPr>
+                <w:rFonts w:ascii="Consolas" w:hAnsi="Consolas"/>
+                <w:color w:val="333333"/>
+                <w:sz w:val="20"/>
+              </w:rPr>
+              <w:t>/health</w:t>
+            </w:r>
+          </w:p>
+        </w:tc>
+      </w:tr>
+      <w:tr>
+        <w:tc>
+          <w:tcPr>
+            <w:tcW w:type="dxa" w:w="2880"/>
+          </w:tcPr>
+          <w:p>
+            <w:r/>
+            <w:r>
+              <w:t>9</w:t>
+            </w:r>
+          </w:p>
+        </w:tc>
+        <w:tc>
+          <w:tcPr>
+            <w:tcW w:type="dxa" w:w="2880"/>
+          </w:tcPr>
+          <w:p>
+            <w:r/>
+            <w:r>
+              <w:t>API serving</w:t>
+            </w:r>
+          </w:p>
+        </w:tc>
+        <w:tc>
+          <w:tcPr>
+            <w:tcW w:type="dxa" w:w="2880"/>
+          </w:tcPr>
+          <w:p>
+            <w:r/>
+            <w:r>
+              <w:rPr>
+                <w:b/>
+              </w:rPr>
+              <w:t>FastAPI</w:t>
+            </w:r>
+            <w:r>
+              <w:t xml:space="preserve"> with Pydantic schemas, Swagger UI, request-ID logging</w:t>
+            </w:r>
+          </w:p>
+        </w:tc>
+      </w:tr>
+      <w:tr>
+        <w:tc>
+          <w:tcPr>
+            <w:tcW w:type="dxa" w:w="2880"/>
+          </w:tcPr>
+          <w:p>
+            <w:r/>
+            <w:r>
+              <w:t>10</w:t>
+            </w:r>
+          </w:p>
+        </w:tc>
+        <w:tc>
+          <w:tcPr>
+            <w:tcW w:type="dxa" w:w="2880"/>
+          </w:tcPr>
+          <w:p>
+            <w:r/>
+            <w:r>
+              <w:t>Kubernetes deployment</w:t>
+            </w:r>
+          </w:p>
+        </w:tc>
+        <w:tc>
+          <w:tcPr>
+            <w:tcW w:type="dxa" w:w="2880"/>
+          </w:tcPr>
+          <w:p>
+            <w:r/>
+            <w:r>
+              <w:t xml:space="preserve">Raw manifests </w:t>
+            </w:r>
+            <w:r>
+              <w:rPr>
+                <w:b/>
+              </w:rPr>
+              <w:t>and</w:t>
+            </w:r>
+            <w:r>
+              <w:t xml:space="preserve"> a Helm chart with </w:t>
+            </w:r>
+            <w:r>
+              <w:rPr>
+                <w:rFonts w:ascii="Consolas" w:hAnsi="Consolas"/>
+                <w:color w:val="333333"/>
+                <w:sz w:val="20"/>
+              </w:rPr>
+              <w:t>LoadBalancer</w:t>
+            </w:r>
+            <w:r>
+              <w:t xml:space="preserve">, </w:t>
+            </w:r>
+            <w:r>
+              <w:rPr>
+                <w:rFonts w:ascii="Consolas" w:hAnsi="Consolas"/>
+                <w:color w:val="333333"/>
+                <w:sz w:val="20"/>
+              </w:rPr>
+              <w:t>Ingress</w:t>
+            </w:r>
+            <w:r>
+              <w:t xml:space="preserve"> and </w:t>
+            </w:r>
+            <w:r>
+              <w:rPr>
+                <w:rFonts w:ascii="Consolas" w:hAnsi="Consolas"/>
+                <w:color w:val="333333"/>
+                <w:sz w:val="20"/>
+              </w:rPr>
+              <w:t>HorizontalPodAutoscaler</w:t>
+            </w:r>
+          </w:p>
+        </w:tc>
+      </w:tr>
+      <w:tr>
+        <w:tc>
+          <w:tcPr>
+            <w:tcW w:type="dxa" w:w="2880"/>
+          </w:tcPr>
+          <w:p>
+            <w:r/>
+            <w:r>
+              <w:t>11</w:t>
+            </w:r>
+          </w:p>
+        </w:tc>
+        <w:tc>
+          <w:tcPr>
+            <w:tcW w:type="dxa" w:w="2880"/>
+          </w:tcPr>
+          <w:p>
+            <w:r/>
+            <w:r>
+              <w:t>Public deployment</w:t>
+            </w:r>
+          </w:p>
+        </w:tc>
+        <w:tc>
+          <w:tcPr>
+            <w:tcW w:type="dxa" w:w="2880"/>
+          </w:tcPr>
+          <w:p>
+            <w:r/>
+            <w:r>
+              <w:rPr>
+                <w:b/>
+              </w:rPr>
+              <w:t>Render.com</w:t>
+            </w:r>
+            <w:r>
+              <w:t xml:space="preserve"> Docker blueprint for a one-click public URL with auto-deploy on push</w:t>
+            </w:r>
+          </w:p>
+        </w:tc>
+      </w:tr>
+      <w:tr>
+        <w:tc>
+          <w:tcPr>
+            <w:tcW w:type="dxa" w:w="2880"/>
+          </w:tcPr>
+          <w:p>
+            <w:r/>
+            <w:r>
+              <w:t>12</w:t>
+            </w:r>
+          </w:p>
+        </w:tc>
+        <w:tc>
+          <w:tcPr>
+            <w:tcW w:type="dxa" w:w="2880"/>
+          </w:tcPr>
+          <w:p>
+            <w:r/>
+            <w:r>
+              <w:t>Monitoring and logging</w:t>
+            </w:r>
+          </w:p>
+        </w:tc>
+        <w:tc>
+          <w:tcPr>
+            <w:tcW w:type="dxa" w:w="2880"/>
+          </w:tcPr>
+          <w:p>
+            <w:r/>
+            <w:r>
+              <w:rPr>
+                <w:b/>
+              </w:rPr>
+              <w:t>Prometheus + Grafana</w:t>
+            </w:r>
+            <w:r>
+              <w:t xml:space="preserve"> dashboards, structured JSON logs ready for ELK / Loki / CloudWatch</w:t>
+            </w:r>
+          </w:p>
+        </w:tc>
+      </w:tr>
+    </w:tbl>
+    <w:p/>
+    <w:p/>
     <w:p>
-      <w:r>
-        <w:t>1. Reproducible data acquisition + EDA</w:t>
-      </w:r>
-    </w:p>
-    <w:p>
-      <w:r>
-        <w:t>2. Shared sklearn preprocessing pipeline + three competing classifiers</w:t>
-      </w:r>
-    </w:p>
-    <w:p>
-      <w:r>
-        <w:t>3. Hyper-parameter search with stratified 5-fold cross-validation</w:t>
-      </w:r>
-    </w:p>
-    <w:p>
-      <w:r>
-        <w:t xml:space="preserve">4. </w:t>
-      </w:r>
       <w:r>
         <w:rPr>
           <w:b/>
         </w:rPr>
-        <w:t>MLflow</w:t>
-      </w:r>
-      <w:r>
-        <w:t xml:space="preserve"> experiment tracking (params / metrics / plots / artefacts)</w:t>
-      </w:r>
-    </w:p>
-    <w:p>
-      <w:r>
-        <w:t>5. Reusable model artefact (</w:t>
-      </w:r>
-      <w:r>
-        <w:rPr>
-          <w:rFonts w:ascii="Consolas" w:hAnsi="Consolas"/>
-          <w:color w:val="333333"/>
-          <w:sz w:val="20"/>
-        </w:rPr>
-        <w:t>models/heart_pipeline.joblib</w:t>
-      </w:r>
-      <w:r>
-        <w:t>)</w:t>
-      </w:r>
-    </w:p>
-    <w:p>
-      <w:r>
-        <w:t xml:space="preserve">6. </w:t>
-      </w:r>
-      <w:r>
-        <w:rPr>
-          <w:b/>
-        </w:rPr>
-        <w:t>pytest</w:t>
-      </w:r>
-      <w:r>
-        <w:t xml:space="preserve"> unit + integration tests with </w:t>
-      </w:r>
-      <w:r>
-        <w:rPr>
-          <w:b/>
-        </w:rPr>
-        <w:t>GitHub Actions</w:t>
-      </w:r>
-      <w:r>
-        <w:t xml:space="preserve"> CI</w:t>
-      </w:r>
-    </w:p>
-    <w:p>
-      <w:r>
-        <w:t xml:space="preserve">7. </w:t>
-      </w:r>
-      <w:r>
-        <w:rPr>
-          <w:b/>
-        </w:rPr>
-        <w:t>FastAPI</w:t>
-      </w:r>
-      <w:r>
-        <w:t xml:space="preserve"> prediction service exposed via </w:t>
-      </w:r>
-      <w:r>
-        <w:rPr>
-          <w:b/>
-        </w:rPr>
-        <w:t>Docker</w:t>
-      </w:r>
-    </w:p>
-    <w:p>
-      <w:r>
-        <w:t xml:space="preserve">8. </w:t>
-      </w:r>
-      <w:r>
-        <w:rPr>
-          <w:b/>
-        </w:rPr>
-        <w:t>Kubernetes</w:t>
-      </w:r>
-      <w:r>
-        <w:t xml:space="preserve"> deployment (raw manifests </w:t>
-      </w:r>
-      <w:r>
-        <w:rPr>
-          <w:b/>
-        </w:rPr>
-        <w:t>and</w:t>
-      </w:r>
-      <w:r>
-        <w:t xml:space="preserve"> Helm chart) with</w:t>
-      </w:r>
-    </w:p>
-    <w:p>
-      <w:r>
-        <w:t xml:space="preserve">   </w:t>
-      </w:r>
-      <w:r>
-        <w:rPr>
-          <w:rFonts w:ascii="Consolas" w:hAnsi="Consolas"/>
-          <w:color w:val="333333"/>
-          <w:sz w:val="20"/>
-        </w:rPr>
-        <w:t>LoadBalancer</w:t>
-      </w:r>
-      <w:r>
-        <w:t xml:space="preserve">, </w:t>
-      </w:r>
-      <w:r>
-        <w:rPr>
-          <w:rFonts w:ascii="Consolas" w:hAnsi="Consolas"/>
-          <w:color w:val="333333"/>
-          <w:sz w:val="20"/>
-        </w:rPr>
-        <w:t>Ingress</w:t>
-      </w:r>
-      <w:r>
-        <w:t xml:space="preserve">, and </w:t>
-      </w:r>
-      <w:r>
-        <w:rPr>
-          <w:rFonts w:ascii="Consolas" w:hAnsi="Consolas"/>
-          <w:color w:val="333333"/>
-          <w:sz w:val="20"/>
-        </w:rPr>
-        <w:t>HorizontalPodAutoscaler</w:t>
-      </w:r>
-    </w:p>
-    <w:p>
-      <w:r>
-        <w:t xml:space="preserve">9. </w:t>
-      </w:r>
-      <w:r>
-        <w:rPr>
-          <w:b/>
-        </w:rPr>
-        <w:t>Render.com</w:t>
-      </w:r>
-      <w:r>
-        <w:t xml:space="preserve"> Docker blueprint for a one-click public URL</w:t>
-      </w:r>
-    </w:p>
-    <w:p>
-      <w:r>
-        <w:t xml:space="preserve">10. </w:t>
-      </w:r>
-      <w:r>
-        <w:rPr>
-          <w:b/>
-        </w:rPr>
-        <w:t>Prometheus + Grafana</w:t>
-      </w:r>
-      <w:r>
-        <w:t xml:space="preserve"> observability and structured JSON logs</w:t>
+        <w:t>Headline result (held-out 20% stratified test set):</w:t>
       </w:r>
     </w:p>
     <w:p/>
-    <w:p>
-      <w:r>
-        <w:rPr>
-          <w:b/>
-        </w:rPr>
-        <w:t>Best model on a stratified 20% test set:</w:t>
-      </w:r>
-      <w:r>
-        <w:t xml:space="preserve"> Logistic Regression with</w:t>
-      </w:r>
-    </w:p>
-    <w:p>
-      <w:r>
-        <w:rPr>
-          <w:b/>
-        </w:rPr>
-        <w:t>ROC-AUC = 0.967</w:t>
-      </w:r>
-      <w:r>
-        <w:t xml:space="preserve">, </w:t>
-      </w:r>
-      <w:r>
-        <w:rPr>
-          <w:b/>
-        </w:rPr>
-        <w:t>Accuracy = 0.885</w:t>
-      </w:r>
-      <w:r>
-        <w:t xml:space="preserve">, </w:t>
-      </w:r>
-      <w:r>
-        <w:rPr>
-          <w:b/>
-        </w:rPr>
-        <w:t>F1 = 0.881</w:t>
-      </w:r>
-      <w:r>
-        <w:t>.</w:t>
-      </w:r>
-    </w:p>
+    <w:tbl>
+      <w:tblPr>
+        <w:tblStyle w:val="LightGrid-Accent1"/>
+        <w:tblW w:type="auto" w:w="0"/>
+        <w:tblLook w:firstColumn="1" w:firstRow="1" w:lastColumn="0" w:lastRow="0" w:noHBand="0" w:noVBand="1" w:val="04A0"/>
+      </w:tblPr>
+      <w:tblGrid>
+        <w:gridCol w:w="2880"/>
+        <w:gridCol w:w="2880"/>
+        <w:gridCol w:w="2880"/>
+      </w:tblGrid>
+      <w:tr>
+        <w:tc>
+          <w:tcPr>
+            <w:tcW w:type="dxa" w:w="2880"/>
+          </w:tcPr>
+          <w:p>
+            <w:r/>
+            <w:r>
+              <w:rPr>
+                <w:b/>
+              </w:rPr>
+              <w:t>Metric</w:t>
+            </w:r>
+          </w:p>
+        </w:tc>
+        <w:tc>
+          <w:tcPr>
+            <w:tcW w:type="dxa" w:w="2880"/>
+          </w:tcPr>
+          <w:p>
+            <w:r/>
+            <w:r>
+              <w:rPr>
+                <w:b/>
+              </w:rPr>
+              <w:t>Value</w:t>
+            </w:r>
+          </w:p>
+        </w:tc>
+        <w:tc>
+          <w:tcPr>
+            <w:tcW w:type="dxa" w:w="2880"/>
+          </w:tcPr>
+          <w:p>
+            <w:r/>
+            <w:r>
+              <w:rPr>
+                <w:b/>
+              </w:rPr>
+              <w:t>Best model</w:t>
+            </w:r>
+          </w:p>
+        </w:tc>
+      </w:tr>
+      <w:tr>
+        <w:tc>
+          <w:tcPr>
+            <w:tcW w:type="dxa" w:w="2880"/>
+          </w:tcPr>
+          <w:p>
+            <w:r/>
+            <w:r>
+              <w:t>ROC-AUC</w:t>
+            </w:r>
+          </w:p>
+        </w:tc>
+        <w:tc>
+          <w:tcPr>
+            <w:tcW w:type="dxa" w:w="2880"/>
+          </w:tcPr>
+          <w:p>
+            <w:r/>
+            <w:r>
+              <w:rPr>
+                <w:b/>
+              </w:rPr>
+              <w:t>0.967</w:t>
+            </w:r>
+          </w:p>
+        </w:tc>
+        <w:tc>
+          <w:tcPr>
+            <w:tcW w:type="dxa" w:w="2880"/>
+          </w:tcPr>
+          <w:p>
+            <w:r/>
+            <w:r>
+              <w:t>Logistic Regression</w:t>
+            </w:r>
+          </w:p>
+        </w:tc>
+      </w:tr>
+      <w:tr>
+        <w:tc>
+          <w:tcPr>
+            <w:tcW w:type="dxa" w:w="2880"/>
+          </w:tcPr>
+          <w:p>
+            <w:r/>
+            <w:r>
+              <w:t>Accuracy</w:t>
+            </w:r>
+          </w:p>
+        </w:tc>
+        <w:tc>
+          <w:tcPr>
+            <w:tcW w:type="dxa" w:w="2880"/>
+          </w:tcPr>
+          <w:p>
+            <w:r/>
+            <w:r>
+              <w:rPr>
+                <w:b/>
+              </w:rPr>
+              <w:t>0.885</w:t>
+            </w:r>
+          </w:p>
+        </w:tc>
+        <w:tc>
+          <w:tcPr>
+            <w:tcW w:type="dxa" w:w="2880"/>
+          </w:tcPr>
+          <w:p>
+            <w:r/>
+            <w:r>
+              <w:t>Logistic Regression</w:t>
+            </w:r>
+          </w:p>
+        </w:tc>
+      </w:tr>
+      <w:tr>
+        <w:tc>
+          <w:tcPr>
+            <w:tcW w:type="dxa" w:w="2880"/>
+          </w:tcPr>
+          <w:p>
+            <w:r/>
+            <w:r>
+              <w:t>F1</w:t>
+            </w:r>
+          </w:p>
+        </w:tc>
+        <w:tc>
+          <w:tcPr>
+            <w:tcW w:type="dxa" w:w="2880"/>
+          </w:tcPr>
+          <w:p>
+            <w:r/>
+            <w:r>
+              <w:rPr>
+                <w:b/>
+              </w:rPr>
+              <w:t>0.881</w:t>
+            </w:r>
+          </w:p>
+        </w:tc>
+        <w:tc>
+          <w:tcPr>
+            <w:tcW w:type="dxa" w:w="2880"/>
+          </w:tcPr>
+          <w:p>
+            <w:r/>
+            <w:r>
+              <w:t>Logistic Regression</w:t>
+            </w:r>
+          </w:p>
+        </w:tc>
+      </w:tr>
+    </w:tbl>
+    <w:p/>
     <w:p/>
     <w:p/>
     <w:p/>
@@ -4190,244 +4780,563 @@
     <w:p/>
     <w:p>
       <w:r>
-        <w:t>Everything the assignment asks for is included in this submission:</w:t>
+        <w:t>Everything the assignment asks for is included in this submission. The</w:t>
+      </w:r>
+    </w:p>
+    <w:p>
+      <w:r>
+        <w:t>table below maps each required deliverable to where it lives in the repo.</w:t>
       </w:r>
     </w:p>
     <w:p/>
-    <w:p>
-      <w:pPr>
-        <w:pStyle w:val="ListBullet"/>
-      </w:pPr>
-      <w:r>
-        <w:t xml:space="preserve">The complete project source code, the Dockerfile and the pinned </w:t>
-      </w:r>
-      <w:r>
-        <w:rPr>
-          <w:rFonts w:ascii="Consolas" w:hAnsi="Consolas"/>
-          <w:color w:val="333333"/>
-          <w:sz w:val="20"/>
-        </w:rPr>
-        <w:t>requirements.txt</w:t>
-      </w:r>
-      <w:r>
-        <w:t xml:space="preserve"> are in the GitHub repository: https://github.com/ddmtech2025cs05056/heart-disease-mlops</w:t>
-      </w:r>
-    </w:p>
-    <w:p>
-      <w:pPr>
-        <w:pStyle w:val="ListBullet"/>
-      </w:pPr>
-      <w:r>
-        <w:t xml:space="preserve">The cleaned dataset and the script that downloads and preprocesses it are under </w:t>
-      </w:r>
-      <w:r>
-        <w:rPr>
-          <w:rFonts w:ascii="Consolas" w:hAnsi="Consolas"/>
-          <w:color w:val="333333"/>
-          <w:sz w:val="20"/>
-        </w:rPr>
-        <w:t>data/</w:t>
-      </w:r>
-      <w:r>
-        <w:t xml:space="preserve"> and </w:t>
-      </w:r>
-      <w:r>
-        <w:rPr>
-          <w:rFonts w:ascii="Consolas" w:hAnsi="Consolas"/>
-          <w:color w:val="333333"/>
-          <w:sz w:val="20"/>
-        </w:rPr>
-        <w:t>src/data/</w:t>
-      </w:r>
-      <w:r>
-        <w:t>.</w:t>
-      </w:r>
-    </w:p>
-    <w:p>
-      <w:pPr>
-        <w:pStyle w:val="ListBullet"/>
-      </w:pPr>
-      <w:r>
-        <w:t xml:space="preserve">Two Jupyter notebooks are provided in </w:t>
-      </w:r>
-      <w:r>
-        <w:rPr>
-          <w:rFonts w:ascii="Consolas" w:hAnsi="Consolas"/>
-          <w:color w:val="333333"/>
-          <w:sz w:val="20"/>
-        </w:rPr>
-        <w:t>notebooks/</w:t>
-      </w:r>
-      <w:r>
-        <w:t xml:space="preserve"> — one for exploratory data analysis and one for modelling.</w:t>
-      </w:r>
-    </w:p>
-    <w:p>
-      <w:pPr>
-        <w:pStyle w:val="ListBullet"/>
-      </w:pPr>
-      <w:r>
-        <w:t xml:space="preserve">All unit and integration tests are in the </w:t>
-      </w:r>
-      <w:r>
-        <w:rPr>
-          <w:rFonts w:ascii="Consolas" w:hAnsi="Consolas"/>
-          <w:color w:val="333333"/>
-          <w:sz w:val="20"/>
-        </w:rPr>
-        <w:t>tests/</w:t>
-      </w:r>
-      <w:r>
-        <w:t xml:space="preserve"> folder (four files, nine tests, all passing).</w:t>
-      </w:r>
-    </w:p>
-    <w:p>
-      <w:pPr>
-        <w:pStyle w:val="ListBullet"/>
-      </w:pPr>
-      <w:r>
-        <w:t xml:space="preserve">The GitHub Actions pipeline that runs lint, tests and the Docker build lives at </w:t>
-      </w:r>
-      <w:r>
-        <w:rPr>
-          <w:rFonts w:ascii="Consolas" w:hAnsi="Consolas"/>
-          <w:color w:val="333333"/>
-          <w:sz w:val="20"/>
-        </w:rPr>
-        <w:t>.github/workflows/ci.yml</w:t>
-      </w:r>
-      <w:r>
-        <w:t>.</w:t>
-      </w:r>
-    </w:p>
-    <w:p>
-      <w:pPr>
-        <w:pStyle w:val="ListBullet"/>
-      </w:pPr>
-      <w:r>
-        <w:t xml:space="preserve">The Kubernetes deployment manifests and the Helm chart are in </w:t>
-      </w:r>
-      <w:r>
-        <w:rPr>
-          <w:rFonts w:ascii="Consolas" w:hAnsi="Consolas"/>
-          <w:color w:val="333333"/>
-          <w:sz w:val="20"/>
-        </w:rPr>
-        <w:t>deploy/k8s/</w:t>
-      </w:r>
-      <w:r>
-        <w:t xml:space="preserve"> and </w:t>
-      </w:r>
-      <w:r>
-        <w:rPr>
-          <w:rFonts w:ascii="Consolas" w:hAnsi="Consolas"/>
-          <w:color w:val="333333"/>
-          <w:sz w:val="20"/>
-        </w:rPr>
-        <w:t>deploy/helm/heart-api/</w:t>
-      </w:r>
-      <w:r>
-        <w:t>.</w:t>
-      </w:r>
-    </w:p>
-    <w:p>
-      <w:pPr>
-        <w:pStyle w:val="ListBullet"/>
-      </w:pPr>
-      <w:r>
-        <w:t xml:space="preserve">Screenshots covering every major step are collected in the </w:t>
-      </w:r>
-      <w:r>
-        <w:rPr>
-          <w:rFonts w:ascii="Consolas" w:hAnsi="Consolas"/>
-          <w:color w:val="333333"/>
-          <w:sz w:val="20"/>
-        </w:rPr>
-        <w:t>screenshots/</w:t>
-      </w:r>
-      <w:r>
-        <w:t xml:space="preserve"> folder.</w:t>
-      </w:r>
-    </w:p>
-    <w:p>
-      <w:pPr>
-        <w:pStyle w:val="ListBullet"/>
-      </w:pPr>
-      <w:r>
-        <w:t xml:space="preserve">This final report is delivered in three formats: </w:t>
-      </w:r>
-      <w:r>
-        <w:rPr>
-          <w:rFonts w:ascii="Consolas" w:hAnsi="Consolas"/>
-          <w:color w:val="333333"/>
-          <w:sz w:val="20"/>
-        </w:rPr>
-        <w:t>docs/REPORT.pdf</w:t>
-      </w:r>
-      <w:r>
-        <w:t xml:space="preserve">, </w:t>
-      </w:r>
-      <w:r>
-        <w:rPr>
-          <w:rFonts w:ascii="Consolas" w:hAnsi="Consolas"/>
-          <w:color w:val="333333"/>
-          <w:sz w:val="20"/>
-        </w:rPr>
-        <w:t>docs/REPORT.docx</w:t>
-      </w:r>
-      <w:r>
-        <w:t xml:space="preserve"> and </w:t>
-      </w:r>
-      <w:r>
-        <w:rPr>
-          <w:rFonts w:ascii="Consolas" w:hAnsi="Consolas"/>
-          <w:color w:val="333333"/>
-          <w:sz w:val="20"/>
-        </w:rPr>
-        <w:t>docs/REPORT.md</w:t>
-      </w:r>
-      <w:r>
-        <w:t>.</w:t>
-      </w:r>
-    </w:p>
-    <w:p>
-      <w:pPr>
-        <w:pStyle w:val="ListBullet"/>
-      </w:pPr>
-      <w:r>
-        <w:t xml:space="preserve">A short demo video that walks through the whole pipeline end-to-end is at </w:t>
-      </w:r>
-      <w:r>
-        <w:rPr>
-          <w:rFonts w:ascii="Consolas" w:hAnsi="Consolas"/>
-          <w:color w:val="333333"/>
-          <w:sz w:val="20"/>
-        </w:rPr>
-        <w:t>docs/2026-05-09 17-51-37.mp4</w:t>
-      </w:r>
-      <w:r>
-        <w:t>. The same video is also available on Google Drive at https://drive.google.com/file/d/106ABOgXefeEAvOQdUCnteJ9P6vjYF_M1/view.</w:t>
-      </w:r>
-    </w:p>
-    <w:p>
-      <w:pPr>
-        <w:pStyle w:val="ListBullet"/>
-      </w:pPr>
-      <w:r>
-        <w:t xml:space="preserve">The API is deployed and running publicly at https://heart-disease-mlops-yhb7.onrender.com (live URL). For a local run the same service can be reached with </w:t>
-      </w:r>
-      <w:r>
-        <w:rPr>
-          <w:rFonts w:ascii="Consolas" w:hAnsi="Consolas"/>
-          <w:color w:val="333333"/>
-          <w:sz w:val="20"/>
-        </w:rPr>
-        <w:t>kubectl port-forward svc/heart-api 8000:80</w:t>
-      </w:r>
-      <w:r>
-        <w:t xml:space="preserve"> after applying the Kubernetes manifests.</w:t>
-      </w:r>
-    </w:p>
+    <w:tbl>
+      <w:tblPr>
+        <w:tblStyle w:val="LightGrid-Accent1"/>
+        <w:tblW w:type="auto" w:w="0"/>
+        <w:tblLook w:firstColumn="1" w:firstRow="1" w:lastColumn="0" w:lastRow="0" w:noHBand="0" w:noVBand="1" w:val="04A0"/>
+      </w:tblPr>
+      <w:tblGrid>
+        <w:gridCol w:w="2880"/>
+        <w:gridCol w:w="2880"/>
+        <w:gridCol w:w="2880"/>
+      </w:tblGrid>
+      <w:tr>
+        <w:tc>
+          <w:tcPr>
+            <w:tcW w:type="dxa" w:w="2880"/>
+          </w:tcPr>
+          <w:p>
+            <w:r/>
+            <w:r>
+              <w:rPr>
+                <w:b/>
+              </w:rPr>
+              <w:t>#</w:t>
+            </w:r>
+          </w:p>
+        </w:tc>
+        <w:tc>
+          <w:tcPr>
+            <w:tcW w:type="dxa" w:w="2880"/>
+          </w:tcPr>
+          <w:p>
+            <w:r/>
+            <w:r>
+              <w:rPr>
+                <w:b/>
+              </w:rPr>
+              <w:t>Deliverable</w:t>
+            </w:r>
+          </w:p>
+        </w:tc>
+        <w:tc>
+          <w:tcPr>
+            <w:tcW w:type="dxa" w:w="2880"/>
+          </w:tcPr>
+          <w:p>
+            <w:r/>
+            <w:r>
+              <w:rPr>
+                <w:b/>
+              </w:rPr>
+              <w:t>Where to find it</w:t>
+            </w:r>
+          </w:p>
+        </w:tc>
+      </w:tr>
+      <w:tr>
+        <w:tc>
+          <w:tcPr>
+            <w:tcW w:type="dxa" w:w="2880"/>
+          </w:tcPr>
+          <w:p>
+            <w:r/>
+            <w:r>
+              <w:t>1</w:t>
+            </w:r>
+          </w:p>
+        </w:tc>
+        <w:tc>
+          <w:tcPr>
+            <w:tcW w:type="dxa" w:w="2880"/>
+          </w:tcPr>
+          <w:p>
+            <w:r/>
+            <w:r>
+              <w:t>Project source code, Dockerfile and pinned dependencies</w:t>
+            </w:r>
+          </w:p>
+        </w:tc>
+        <w:tc>
+          <w:tcPr>
+            <w:tcW w:type="dxa" w:w="2880"/>
+          </w:tcPr>
+          <w:p>
+            <w:r/>
+            <w:r>
+              <w:t>Root of the GitHub repository: https://github.com/ddmtech2025cs05056/heart-disease-mlops</w:t>
+            </w:r>
+          </w:p>
+        </w:tc>
+      </w:tr>
+      <w:tr>
+        <w:tc>
+          <w:tcPr>
+            <w:tcW w:type="dxa" w:w="2880"/>
+          </w:tcPr>
+          <w:p>
+            <w:r/>
+            <w:r>
+              <w:t>2</w:t>
+            </w:r>
+          </w:p>
+        </w:tc>
+        <w:tc>
+          <w:tcPr>
+            <w:tcW w:type="dxa" w:w="2880"/>
+          </w:tcPr>
+          <w:p>
+            <w:r/>
+            <w:r>
+              <w:t>Cleaned dataset and the script that downloads and preprocesses it</w:t>
+            </w:r>
+          </w:p>
+        </w:tc>
+        <w:tc>
+          <w:tcPr>
+            <w:tcW w:type="dxa" w:w="2880"/>
+          </w:tcPr>
+          <w:p>
+            <w:r/>
+            <w:r>
+              <w:rPr>
+                <w:rFonts w:ascii="Consolas" w:hAnsi="Consolas"/>
+                <w:color w:val="333333"/>
+                <w:sz w:val="20"/>
+              </w:rPr>
+              <w:t>data/</w:t>
+            </w:r>
+            <w:r>
+              <w:t xml:space="preserve"> and </w:t>
+            </w:r>
+            <w:r>
+              <w:rPr>
+                <w:rFonts w:ascii="Consolas" w:hAnsi="Consolas"/>
+                <w:color w:val="333333"/>
+                <w:sz w:val="20"/>
+              </w:rPr>
+              <w:t>src/data/</w:t>
+            </w:r>
+          </w:p>
+        </w:tc>
+      </w:tr>
+      <w:tr>
+        <w:tc>
+          <w:tcPr>
+            <w:tcW w:type="dxa" w:w="2880"/>
+          </w:tcPr>
+          <w:p>
+            <w:r/>
+            <w:r>
+              <w:t>3</w:t>
+            </w:r>
+          </w:p>
+        </w:tc>
+        <w:tc>
+          <w:tcPr>
+            <w:tcW w:type="dxa" w:w="2880"/>
+          </w:tcPr>
+          <w:p>
+            <w:r/>
+            <w:r>
+              <w:t>Jupyter notebooks for exploratory data analysis and modelling</w:t>
+            </w:r>
+          </w:p>
+        </w:tc>
+        <w:tc>
+          <w:tcPr>
+            <w:tcW w:type="dxa" w:w="2880"/>
+          </w:tcPr>
+          <w:p>
+            <w:r/>
+            <w:r>
+              <w:rPr>
+                <w:rFonts w:ascii="Consolas" w:hAnsi="Consolas"/>
+                <w:color w:val="333333"/>
+                <w:sz w:val="20"/>
+              </w:rPr>
+              <w:t>notebooks/01_eda.ipynb</w:t>
+            </w:r>
+            <w:r>
+              <w:t xml:space="preserve">, </w:t>
+            </w:r>
+            <w:r>
+              <w:rPr>
+                <w:rFonts w:ascii="Consolas" w:hAnsi="Consolas"/>
+                <w:color w:val="333333"/>
+                <w:sz w:val="20"/>
+              </w:rPr>
+              <w:t>notebooks/02_modeling.ipynb</w:t>
+            </w:r>
+          </w:p>
+        </w:tc>
+      </w:tr>
+      <w:tr>
+        <w:tc>
+          <w:tcPr>
+            <w:tcW w:type="dxa" w:w="2880"/>
+          </w:tcPr>
+          <w:p>
+            <w:r/>
+            <w:r>
+              <w:t>4</w:t>
+            </w:r>
+          </w:p>
+        </w:tc>
+        <w:tc>
+          <w:tcPr>
+            <w:tcW w:type="dxa" w:w="2880"/>
+          </w:tcPr>
+          <w:p>
+            <w:r/>
+            <w:r>
+              <w:t>Unit and integration tests (four files, nine tests, all passing)</w:t>
+            </w:r>
+          </w:p>
+        </w:tc>
+        <w:tc>
+          <w:tcPr>
+            <w:tcW w:type="dxa" w:w="2880"/>
+          </w:tcPr>
+          <w:p>
+            <w:r/>
+            <w:r>
+              <w:rPr>
+                <w:rFonts w:ascii="Consolas" w:hAnsi="Consolas"/>
+                <w:color w:val="333333"/>
+                <w:sz w:val="20"/>
+              </w:rPr>
+              <w:t>tests/</w:t>
+            </w:r>
+          </w:p>
+        </w:tc>
+      </w:tr>
+      <w:tr>
+        <w:tc>
+          <w:tcPr>
+            <w:tcW w:type="dxa" w:w="2880"/>
+          </w:tcPr>
+          <w:p>
+            <w:r/>
+            <w:r>
+              <w:t>5</w:t>
+            </w:r>
+          </w:p>
+        </w:tc>
+        <w:tc>
+          <w:tcPr>
+            <w:tcW w:type="dxa" w:w="2880"/>
+          </w:tcPr>
+          <w:p>
+            <w:r/>
+            <w:r>
+              <w:t>GitHub Actions pipeline running lint, tests and the Docker build</w:t>
+            </w:r>
+          </w:p>
+        </w:tc>
+        <w:tc>
+          <w:tcPr>
+            <w:tcW w:type="dxa" w:w="2880"/>
+          </w:tcPr>
+          <w:p>
+            <w:r/>
+            <w:r>
+              <w:rPr>
+                <w:rFonts w:ascii="Consolas" w:hAnsi="Consolas"/>
+                <w:color w:val="333333"/>
+                <w:sz w:val="20"/>
+              </w:rPr>
+              <w:t>.github/workflows/ci.yml</w:t>
+            </w:r>
+          </w:p>
+        </w:tc>
+      </w:tr>
+      <w:tr>
+        <w:tc>
+          <w:tcPr>
+            <w:tcW w:type="dxa" w:w="2880"/>
+          </w:tcPr>
+          <w:p>
+            <w:r/>
+            <w:r>
+              <w:t>6</w:t>
+            </w:r>
+          </w:p>
+        </w:tc>
+        <w:tc>
+          <w:tcPr>
+            <w:tcW w:type="dxa" w:w="2880"/>
+          </w:tcPr>
+          <w:p>
+            <w:r/>
+            <w:r>
+              <w:t>Kubernetes deployment manifests and Helm chart</w:t>
+            </w:r>
+          </w:p>
+        </w:tc>
+        <w:tc>
+          <w:tcPr>
+            <w:tcW w:type="dxa" w:w="2880"/>
+          </w:tcPr>
+          <w:p>
+            <w:r/>
+            <w:r>
+              <w:rPr>
+                <w:rFonts w:ascii="Consolas" w:hAnsi="Consolas"/>
+                <w:color w:val="333333"/>
+                <w:sz w:val="20"/>
+              </w:rPr>
+              <w:t>deploy/k8s/</w:t>
+            </w:r>
+            <w:r>
+              <w:t xml:space="preserve">, </w:t>
+            </w:r>
+            <w:r>
+              <w:rPr>
+                <w:rFonts w:ascii="Consolas" w:hAnsi="Consolas"/>
+                <w:color w:val="333333"/>
+                <w:sz w:val="20"/>
+              </w:rPr>
+              <w:t>deploy/helm/heart-api/</w:t>
+            </w:r>
+          </w:p>
+        </w:tc>
+      </w:tr>
+      <w:tr>
+        <w:tc>
+          <w:tcPr>
+            <w:tcW w:type="dxa" w:w="2880"/>
+          </w:tcPr>
+          <w:p>
+            <w:r/>
+            <w:r>
+              <w:t>7</w:t>
+            </w:r>
+          </w:p>
+        </w:tc>
+        <w:tc>
+          <w:tcPr>
+            <w:tcW w:type="dxa" w:w="2880"/>
+          </w:tcPr>
+          <w:p>
+            <w:r/>
+            <w:r>
+              <w:t>Screenshots of every major step</w:t>
+            </w:r>
+          </w:p>
+        </w:tc>
+        <w:tc>
+          <w:tcPr>
+            <w:tcW w:type="dxa" w:w="2880"/>
+          </w:tcPr>
+          <w:p>
+            <w:r/>
+            <w:r>
+              <w:rPr>
+                <w:rFonts w:ascii="Consolas" w:hAnsi="Consolas"/>
+                <w:color w:val="333333"/>
+                <w:sz w:val="20"/>
+              </w:rPr>
+              <w:t>screenshots/</w:t>
+            </w:r>
+          </w:p>
+        </w:tc>
+      </w:tr>
+      <w:tr>
+        <w:tc>
+          <w:tcPr>
+            <w:tcW w:type="dxa" w:w="2880"/>
+          </w:tcPr>
+          <w:p>
+            <w:r/>
+            <w:r>
+              <w:t>8</w:t>
+            </w:r>
+          </w:p>
+        </w:tc>
+        <w:tc>
+          <w:tcPr>
+            <w:tcW w:type="dxa" w:w="2880"/>
+          </w:tcPr>
+          <w:p>
+            <w:r/>
+            <w:r>
+              <w:t>Final report in three formats</w:t>
+            </w:r>
+          </w:p>
+        </w:tc>
+        <w:tc>
+          <w:tcPr>
+            <w:tcW w:type="dxa" w:w="2880"/>
+          </w:tcPr>
+          <w:p>
+            <w:r/>
+            <w:r>
+              <w:rPr>
+                <w:rFonts w:ascii="Consolas" w:hAnsi="Consolas"/>
+                <w:color w:val="333333"/>
+                <w:sz w:val="20"/>
+              </w:rPr>
+              <w:t>docs/REPORT.pdf</w:t>
+            </w:r>
+            <w:r>
+              <w:t xml:space="preserve">, </w:t>
+            </w:r>
+            <w:r>
+              <w:rPr>
+                <w:rFonts w:ascii="Consolas" w:hAnsi="Consolas"/>
+                <w:color w:val="333333"/>
+                <w:sz w:val="20"/>
+              </w:rPr>
+              <w:t>docs/REPORT.docx</w:t>
+            </w:r>
+            <w:r>
+              <w:t xml:space="preserve">, </w:t>
+            </w:r>
+            <w:r>
+              <w:rPr>
+                <w:rFonts w:ascii="Consolas" w:hAnsi="Consolas"/>
+                <w:color w:val="333333"/>
+                <w:sz w:val="20"/>
+              </w:rPr>
+              <w:t>docs/REPORT.md</w:t>
+            </w:r>
+          </w:p>
+        </w:tc>
+      </w:tr>
+      <w:tr>
+        <w:tc>
+          <w:tcPr>
+            <w:tcW w:type="dxa" w:w="2880"/>
+          </w:tcPr>
+          <w:p>
+            <w:r/>
+            <w:r>
+              <w:t>9</w:t>
+            </w:r>
+          </w:p>
+        </w:tc>
+        <w:tc>
+          <w:tcPr>
+            <w:tcW w:type="dxa" w:w="2880"/>
+          </w:tcPr>
+          <w:p>
+            <w:r/>
+            <w:r>
+              <w:t>Short demo video walking through the whole pipeline</w:t>
+            </w:r>
+          </w:p>
+        </w:tc>
+        <w:tc>
+          <w:tcPr>
+            <w:tcW w:type="dxa" w:w="2880"/>
+          </w:tcPr>
+          <w:p>
+            <w:r/>
+            <w:r>
+              <w:rPr>
+                <w:rFonts w:ascii="Consolas" w:hAnsi="Consolas"/>
+                <w:color w:val="333333"/>
+                <w:sz w:val="20"/>
+              </w:rPr>
+              <w:t>docs/2026-05-09 17-51-37.mp4</w:t>
+            </w:r>
+            <w:r>
+              <w:t xml:space="preserve"> (also on Google Drive: https://drive.google.com/file/d/106ABOgXefeEAvOQdUCnteJ9P6vjYF_M1/view)</w:t>
+            </w:r>
+          </w:p>
+        </w:tc>
+      </w:tr>
+      <w:tr>
+        <w:tc>
+          <w:tcPr>
+            <w:tcW w:type="dxa" w:w="2880"/>
+          </w:tcPr>
+          <w:p>
+            <w:r/>
+            <w:r>
+              <w:t>10</w:t>
+            </w:r>
+          </w:p>
+        </w:tc>
+        <w:tc>
+          <w:tcPr>
+            <w:tcW w:type="dxa" w:w="2880"/>
+          </w:tcPr>
+          <w:p>
+            <w:r/>
+            <w:r>
+              <w:t>Deployed API URL (publicly reachable)</w:t>
+            </w:r>
+          </w:p>
+        </w:tc>
+        <w:tc>
+          <w:tcPr>
+            <w:tcW w:type="dxa" w:w="2880"/>
+          </w:tcPr>
+          <w:p>
+            <w:r/>
+            <w:r>
+              <w:t>https://heart-disease-mlops-yhb7.onrender.com</w:t>
+            </w:r>
+          </w:p>
+        </w:tc>
+      </w:tr>
+      <w:tr>
+        <w:tc>
+          <w:tcPr>
+            <w:tcW w:type="dxa" w:w="2880"/>
+          </w:tcPr>
+          <w:p>
+            <w:r/>
+            <w:r>
+              <w:t>11</w:t>
+            </w:r>
+          </w:p>
+        </w:tc>
+        <w:tc>
+          <w:tcPr>
+            <w:tcW w:type="dxa" w:w="2880"/>
+          </w:tcPr>
+          <w:p>
+            <w:r/>
+            <w:r>
+              <w:t>Local run instructions</w:t>
+            </w:r>
+          </w:p>
+        </w:tc>
+        <w:tc>
+          <w:tcPr>
+            <w:tcW w:type="dxa" w:w="2880"/>
+          </w:tcPr>
+          <w:p>
+            <w:r/>
+            <w:r>
+              <w:rPr>
+                <w:rFonts w:ascii="Consolas" w:hAnsi="Consolas"/>
+                <w:color w:val="333333"/>
+                <w:sz w:val="20"/>
+              </w:rPr>
+              <w:t>kubectl port-forward svc/heart-api 8000:80</w:t>
+            </w:r>
+            <w:r>
+              <w:t xml:space="preserve"> after applying the Kubernetes manifests</w:t>
+            </w:r>
+          </w:p>
+        </w:tc>
+      </w:tr>
+    </w:tbl>
+    <w:p/>
     <w:p/>
     <w:p/>
     <w:p/>

</xml_diff>

<commit_message>
docs: embed system architecture diagram in REPORT (after Experiment tracking)
</commit_message>
<xml_diff>
--- a/docs/REPORT.docx
+++ b/docs/REPORT.docx
@@ -2781,7 +2781,449 @@
         <w:pStyle w:val="Heading1"/>
       </w:pPr>
       <w:r>
-        <w:t>6. Packaging and reproducibility *(Task 4 — 7 marks)*</w:t>
+        <w:t>6. System architecture</w:t>
+      </w:r>
+    </w:p>
+    <w:p/>
+    <w:p>
+      <w:r>
+        <w:t>The diagram below shows how the data, training, serving, observability,</w:t>
+      </w:r>
+    </w:p>
+    <w:p>
+      <w:r>
+        <w:t>and CI/CD components fit together end-to-end. The same diagram is also</w:t>
+      </w:r>
+    </w:p>
+    <w:p>
+      <w:r>
+        <w:t xml:space="preserve">maintained in Mermaid source form in </w:t>
+      </w:r>
+      <w:r>
+        <w:rPr>
+          <w:rFonts w:ascii="Consolas" w:hAnsi="Consolas"/>
+          <w:color w:val="333333"/>
+          <w:sz w:val="20"/>
+        </w:rPr>
+        <w:t>docs/architecture.md</w:t>
+      </w:r>
+      <w:r>
+        <w:t xml:space="preserve"> so it can be</w:t>
+      </w:r>
+    </w:p>
+    <w:p>
+      <w:r>
+        <w:t>regenerated whenever the system evolves.</w:t>
+      </w:r>
+    </w:p>
+    <w:p/>
+    <w:p>
+      <w:r>
+        <w:drawing>
+          <wp:inline xmlns:a="http://schemas.openxmlformats.org/drawingml/2006/main" xmlns:pic="http://schemas.openxmlformats.org/drawingml/2006/picture">
+            <wp:extent cx="5029200" cy="1212396"/>
+            <wp:docPr id="5" name="Picture 5"/>
+            <wp:cNvGraphicFramePr>
+              <a:graphicFrameLocks noChangeAspect="1"/>
+            </wp:cNvGraphicFramePr>
+            <a:graphic>
+              <a:graphicData uri="http://schemas.openxmlformats.org/drawingml/2006/picture">
+                <pic:pic>
+                  <pic:nvPicPr>
+                    <pic:cNvPr id="0" name="architecture.png"/>
+                    <pic:cNvPicPr/>
+                  </pic:nvPicPr>
+                  <pic:blipFill>
+                    <a:blip r:embed="rId13"/>
+                    <a:stretch>
+                      <a:fillRect/>
+                    </a:stretch>
+                  </pic:blipFill>
+                  <pic:spPr>
+                    <a:xfrm>
+                      <a:off x="0" y="0"/>
+                      <a:ext cx="5029200" cy="1212396"/>
+                    </a:xfrm>
+                    <a:prstGeom prst="rect"/>
+                  </pic:spPr>
+                </pic:pic>
+              </a:graphicData>
+            </a:graphic>
+          </wp:inline>
+        </w:drawing>
+      </w:r>
+    </w:p>
+    <w:p/>
+    <w:tbl>
+      <w:tblPr>
+        <w:tblStyle w:val="LightGrid-Accent1"/>
+        <w:tblW w:type="auto" w:w="0"/>
+        <w:tblLook w:firstColumn="1" w:firstRow="1" w:lastColumn="0" w:lastRow="0" w:noHBand="0" w:noVBand="1" w:val="04A0"/>
+      </w:tblPr>
+      <w:tblGrid>
+        <w:gridCol w:w="4320"/>
+        <w:gridCol w:w="4320"/>
+      </w:tblGrid>
+      <w:tr>
+        <w:tc>
+          <w:tcPr>
+            <w:tcW w:type="dxa" w:w="4320"/>
+          </w:tcPr>
+          <w:p>
+            <w:r/>
+            <w:r>
+              <w:rPr>
+                <w:b/>
+              </w:rPr>
+              <w:t>Layer</w:t>
+            </w:r>
+          </w:p>
+        </w:tc>
+        <w:tc>
+          <w:tcPr>
+            <w:tcW w:type="dxa" w:w="4320"/>
+          </w:tcPr>
+          <w:p>
+            <w:r/>
+            <w:r>
+              <w:rPr>
+                <w:b/>
+              </w:rPr>
+              <w:t>Components in this project</w:t>
+            </w:r>
+          </w:p>
+        </w:tc>
+      </w:tr>
+      <w:tr>
+        <w:tc>
+          <w:tcPr>
+            <w:tcW w:type="dxa" w:w="4320"/>
+          </w:tcPr>
+          <w:p>
+            <w:r/>
+            <w:r>
+              <w:t>Data</w:t>
+            </w:r>
+          </w:p>
+        </w:tc>
+        <w:tc>
+          <w:tcPr>
+            <w:tcW w:type="dxa" w:w="4320"/>
+          </w:tcPr>
+          <w:p>
+            <w:r/>
+            <w:r>
+              <w:t xml:space="preserve">UCI Cleveland CSV → </w:t>
+            </w:r>
+            <w:r>
+              <w:rPr>
+                <w:rFonts w:ascii="Consolas" w:hAnsi="Consolas"/>
+                <w:color w:val="333333"/>
+                <w:sz w:val="20"/>
+              </w:rPr>
+              <w:t>src/data/download.py</w:t>
+            </w:r>
+            <w:r>
+              <w:t xml:space="preserve"> → </w:t>
+            </w:r>
+            <w:r>
+              <w:rPr>
+                <w:rFonts w:ascii="Consolas" w:hAnsi="Consolas"/>
+                <w:color w:val="333333"/>
+                <w:sz w:val="20"/>
+              </w:rPr>
+              <w:t>src/data/preprocess.py</w:t>
+            </w:r>
+            <w:r>
+              <w:t xml:space="preserve"> (impute, binarise target)</w:t>
+            </w:r>
+          </w:p>
+        </w:tc>
+      </w:tr>
+      <w:tr>
+        <w:tc>
+          <w:tcPr>
+            <w:tcW w:type="dxa" w:w="4320"/>
+          </w:tcPr>
+          <w:p>
+            <w:r/>
+            <w:r>
+              <w:t>Training</w:t>
+            </w:r>
+          </w:p>
+        </w:tc>
+        <w:tc>
+          <w:tcPr>
+            <w:tcW w:type="dxa" w:w="4320"/>
+          </w:tcPr>
+          <w:p>
+            <w:r/>
+            <w:r>
+              <w:rPr>
+                <w:rFonts w:ascii="Consolas" w:hAnsi="Consolas"/>
+                <w:color w:val="333333"/>
+                <w:sz w:val="20"/>
+              </w:rPr>
+              <w:t>src/features/pipeline.py</w:t>
+            </w:r>
+            <w:r>
+              <w:t xml:space="preserve"> (</w:t>
+            </w:r>
+            <w:r>
+              <w:rPr>
+                <w:rFonts w:ascii="Consolas" w:hAnsi="Consolas"/>
+                <w:color w:val="333333"/>
+                <w:sz w:val="20"/>
+              </w:rPr>
+              <w:t>ColumnTransformer</w:t>
+            </w:r>
+            <w:r>
+              <w:t xml:space="preserve">) → </w:t>
+            </w:r>
+            <w:r>
+              <w:rPr>
+                <w:rFonts w:ascii="Consolas" w:hAnsi="Consolas"/>
+                <w:color w:val="333333"/>
+                <w:sz w:val="20"/>
+              </w:rPr>
+              <w:t>src/models/train.py</w:t>
+            </w:r>
+            <w:r>
+              <w:t xml:space="preserve"> (</w:t>
+            </w:r>
+            <w:r>
+              <w:rPr>
+                <w:rFonts w:ascii="Consolas" w:hAnsi="Consolas"/>
+                <w:color w:val="333333"/>
+                <w:sz w:val="20"/>
+              </w:rPr>
+              <w:t>GridSearchCV</w:t>
+            </w:r>
+            <w:r>
+              <w:t xml:space="preserve"> over LR / RF / XGBoost) → </w:t>
+            </w:r>
+            <w:r>
+              <w:rPr>
+                <w:rFonts w:ascii="Consolas" w:hAnsi="Consolas"/>
+                <w:color w:val="333333"/>
+                <w:sz w:val="20"/>
+              </w:rPr>
+              <w:t>models/heart_pipeline.joblib</w:t>
+            </w:r>
+          </w:p>
+        </w:tc>
+      </w:tr>
+      <w:tr>
+        <w:tc>
+          <w:tcPr>
+            <w:tcW w:type="dxa" w:w="4320"/>
+          </w:tcPr>
+          <w:p>
+            <w:r/>
+            <w:r>
+              <w:t>Experiment tracking</w:t>
+            </w:r>
+          </w:p>
+        </w:tc>
+        <w:tc>
+          <w:tcPr>
+            <w:tcW w:type="dxa" w:w="4320"/>
+          </w:tcPr>
+          <w:p>
+            <w:r/>
+            <w:r>
+              <w:rPr>
+                <w:b/>
+              </w:rPr>
+              <w:t>MLflow</w:t>
+            </w:r>
+            <w:r>
+              <w:t xml:space="preserve"> logs params, six metrics and ROC/PR/CM plots for every run</w:t>
+            </w:r>
+          </w:p>
+        </w:tc>
+      </w:tr>
+      <w:tr>
+        <w:tc>
+          <w:tcPr>
+            <w:tcW w:type="dxa" w:w="4320"/>
+          </w:tcPr>
+          <w:p>
+            <w:r/>
+            <w:r>
+              <w:t>Serving</w:t>
+            </w:r>
+          </w:p>
+        </w:tc>
+        <w:tc>
+          <w:tcPr>
+            <w:tcW w:type="dxa" w:w="4320"/>
+          </w:tcPr>
+          <w:p>
+            <w:r/>
+            <w:r>
+              <w:rPr>
+                <w:b/>
+              </w:rPr>
+              <w:t>FastAPI</w:t>
+            </w:r>
+            <w:r>
+              <w:t xml:space="preserve"> (</w:t>
+            </w:r>
+            <w:r>
+              <w:rPr>
+                <w:rFonts w:ascii="Consolas" w:hAnsi="Consolas"/>
+                <w:color w:val="333333"/>
+                <w:sz w:val="20"/>
+              </w:rPr>
+              <w:t>src/api/main.py</w:t>
+            </w:r>
+            <w:r>
+              <w:t xml:space="preserve">) → multi-stage </w:t>
+            </w:r>
+            <w:r>
+              <w:rPr>
+                <w:b/>
+              </w:rPr>
+              <w:t>Docker</w:t>
+            </w:r>
+            <w:r>
+              <w:t xml:space="preserve"> image → </w:t>
+            </w:r>
+            <w:r>
+              <w:rPr>
+                <w:b/>
+              </w:rPr>
+              <w:t>Kubernetes</w:t>
+            </w:r>
+            <w:r>
+              <w:t xml:space="preserve"> (raw manifests + Helm chart) → </w:t>
+            </w:r>
+            <w:r>
+              <w:rPr>
+                <w:b/>
+              </w:rPr>
+              <w:t>Render</w:t>
+            </w:r>
+            <w:r>
+              <w:t xml:space="preserve"> (public URL)</w:t>
+            </w:r>
+          </w:p>
+        </w:tc>
+      </w:tr>
+      <w:tr>
+        <w:tc>
+          <w:tcPr>
+            <w:tcW w:type="dxa" w:w="4320"/>
+          </w:tcPr>
+          <w:p>
+            <w:r/>
+            <w:r>
+              <w:t>Observability</w:t>
+            </w:r>
+          </w:p>
+        </w:tc>
+        <w:tc>
+          <w:tcPr>
+            <w:tcW w:type="dxa" w:w="4320"/>
+          </w:tcPr>
+          <w:p>
+            <w:r/>
+            <w:r>
+              <w:rPr>
+                <w:rFonts w:ascii="Consolas" w:hAnsi="Consolas"/>
+                <w:color w:val="333333"/>
+                <w:sz w:val="20"/>
+              </w:rPr>
+              <w:t>prometheus_client</w:t>
+            </w:r>
+            <w:r>
+              <w:t xml:space="preserve"> on </w:t>
+            </w:r>
+            <w:r>
+              <w:rPr>
+                <w:rFonts w:ascii="Consolas" w:hAnsi="Consolas"/>
+                <w:color w:val="333333"/>
+                <w:sz w:val="20"/>
+              </w:rPr>
+              <w:t>/metrics</w:t>
+            </w:r>
+            <w:r>
+              <w:t xml:space="preserve"> → </w:t>
+            </w:r>
+            <w:r>
+              <w:rPr>
+                <w:b/>
+              </w:rPr>
+              <w:t>Prometheus</w:t>
+            </w:r>
+            <w:r>
+              <w:t xml:space="preserve"> scrape job → </w:t>
+            </w:r>
+            <w:r>
+              <w:rPr>
+                <w:b/>
+              </w:rPr>
+              <w:t>Grafana</w:t>
+            </w:r>
+            <w:r>
+              <w:t xml:space="preserve"> dashboard; structured JSON request logs</w:t>
+            </w:r>
+          </w:p>
+        </w:tc>
+      </w:tr>
+      <w:tr>
+        <w:tc>
+          <w:tcPr>
+            <w:tcW w:type="dxa" w:w="4320"/>
+          </w:tcPr>
+          <w:p>
+            <w:r/>
+            <w:r>
+              <w:t>CI/CD</w:t>
+            </w:r>
+          </w:p>
+        </w:tc>
+        <w:tc>
+          <w:tcPr>
+            <w:tcW w:type="dxa" w:w="4320"/>
+          </w:tcPr>
+          <w:p>
+            <w:r/>
+            <w:r>
+              <w:rPr>
+                <w:b/>
+              </w:rPr>
+              <w:t>GitHub Actions</w:t>
+            </w:r>
+            <w:r>
+              <w:t xml:space="preserve"> (</w:t>
+            </w:r>
+            <w:r>
+              <w:rPr>
+                <w:rFonts w:ascii="Consolas" w:hAnsi="Consolas"/>
+                <w:color w:val="333333"/>
+                <w:sz w:val="20"/>
+              </w:rPr>
+              <w:t>.github/workflows/ci.yml</w:t>
+            </w:r>
+            <w:r>
+              <w:t>) runs lint → tests → train → Docker build on every push</w:t>
+            </w:r>
+          </w:p>
+        </w:tc>
+      </w:tr>
+    </w:tbl>
+    <w:p/>
+    <w:p/>
+    <w:p/>
+    <w:p/>
+    <w:p>
+      <w:pPr>
+        <w:pStyle w:val="Heading1"/>
+      </w:pPr>
+      <w:r>
+        <w:t>7. Packaging and reproducibility *(Task 4 — 7 marks)*</w:t>
       </w:r>
     </w:p>
     <w:p/>
@@ -2971,7 +3413,7 @@
         <w:pStyle w:val="Heading1"/>
       </w:pPr>
       <w:r>
-        <w:t>7. Tests and CI *(Task 5 — 8 marks)*</w:t>
+        <w:t>8. Tests and CI *(Task 5 — 8 marks)*</w:t>
       </w:r>
     </w:p>
     <w:p/>
@@ -3394,7 +3836,7 @@
         <w:drawing>
           <wp:inline xmlns:a="http://schemas.openxmlformats.org/drawingml/2006/main" xmlns:pic="http://schemas.openxmlformats.org/drawingml/2006/picture">
             <wp:extent cx="5029200" cy="2766060"/>
-            <wp:docPr id="5" name="Picture 5"/>
+            <wp:docPr id="6" name="Picture 6"/>
             <wp:cNvGraphicFramePr>
               <a:graphicFrameLocks noChangeAspect="1"/>
             </wp:cNvGraphicFramePr>
@@ -3403,42 +3845,6 @@
                 <pic:pic>
                   <pic:nvPicPr>
                     <pic:cNvPr id="0" name="05_pytest_passing.png"/>
-                    <pic:cNvPicPr/>
-                  </pic:nvPicPr>
-                  <pic:blipFill>
-                    <a:blip r:embed="rId13"/>
-                    <a:stretch>
-                      <a:fillRect/>
-                    </a:stretch>
-                  </pic:blipFill>
-                  <pic:spPr>
-                    <a:xfrm>
-                      <a:off x="0" y="0"/>
-                      <a:ext cx="5029200" cy="2766060"/>
-                    </a:xfrm>
-                    <a:prstGeom prst="rect"/>
-                  </pic:spPr>
-                </pic:pic>
-              </a:graphicData>
-            </a:graphic>
-          </wp:inline>
-        </w:drawing>
-      </w:r>
-    </w:p>
-    <w:p>
-      <w:r>
-        <w:drawing>
-          <wp:inline xmlns:a="http://schemas.openxmlformats.org/drawingml/2006/main" xmlns:pic="http://schemas.openxmlformats.org/drawingml/2006/picture">
-            <wp:extent cx="5029200" cy="2766060"/>
-            <wp:docPr id="6" name="Picture 6"/>
-            <wp:cNvGraphicFramePr>
-              <a:graphicFrameLocks noChangeAspect="1"/>
-            </wp:cNvGraphicFramePr>
-            <a:graphic>
-              <a:graphicData uri="http://schemas.openxmlformats.org/drawingml/2006/picture">
-                <pic:pic>
-                  <pic:nvPicPr>
-                    <pic:cNvPr id="0" name="06_github_actions_success.png"/>
                     <pic:cNvPicPr/>
                   </pic:nvPicPr>
                   <pic:blipFill>
@@ -3461,143 +3867,6 @@
         </w:drawing>
       </w:r>
     </w:p>
-    <w:p/>
-    <w:p/>
-    <w:p/>
-    <w:p>
-      <w:pPr>
-        <w:pStyle w:val="Heading1"/>
-      </w:pPr>
-      <w:r>
-        <w:t>8. Containerisation *(Task 6 — 5 marks)*</w:t>
-      </w:r>
-    </w:p>
-    <w:p/>
-    <w:p>
-      <w:r>
-        <w:t>A two-stage Dockerfile (</w:t>
-      </w:r>
-      <w:r>
-        <w:rPr>
-          <w:rFonts w:ascii="Consolas" w:hAnsi="Consolas"/>
-          <w:color w:val="333333"/>
-          <w:sz w:val="20"/>
-        </w:rPr>
-        <w:t>python:3.11-slim</w:t>
-      </w:r>
-      <w:r>
-        <w:t xml:space="preserve"> builder + runtime) installs</w:t>
-      </w:r>
-    </w:p>
-    <w:p>
-      <w:r>
-        <w:t xml:space="preserve">deps into </w:t>
-      </w:r>
-      <w:r>
-        <w:rPr>
-          <w:rFonts w:ascii="Consolas" w:hAnsi="Consolas"/>
-          <w:color w:val="333333"/>
-          <w:sz w:val="20"/>
-        </w:rPr>
-        <w:t>/install</w:t>
-      </w:r>
-      <w:r>
-        <w:t xml:space="preserve">, copies only </w:t>
-      </w:r>
-      <w:r>
-        <w:rPr>
-          <w:rFonts w:ascii="Consolas" w:hAnsi="Consolas"/>
-          <w:color w:val="333333"/>
-          <w:sz w:val="20"/>
-        </w:rPr>
-        <w:t>src/</w:t>
-      </w:r>
-      <w:r>
-        <w:t xml:space="preserve"> and </w:t>
-      </w:r>
-      <w:r>
-        <w:rPr>
-          <w:rFonts w:ascii="Consolas" w:hAnsi="Consolas"/>
-          <w:color w:val="333333"/>
-          <w:sz w:val="20"/>
-        </w:rPr>
-        <w:t>models/</w:t>
-      </w:r>
-      <w:r>
-        <w:t>, switches to a</w:t>
-      </w:r>
-    </w:p>
-    <w:p>
-      <w:r>
-        <w:t xml:space="preserve">non-root </w:t>
-      </w:r>
-      <w:r>
-        <w:rPr>
-          <w:rFonts w:ascii="Consolas" w:hAnsi="Consolas"/>
-          <w:color w:val="333333"/>
-          <w:sz w:val="20"/>
-        </w:rPr>
-        <w:t>heart</w:t>
-      </w:r>
-      <w:r>
-        <w:t xml:space="preserve"> user, and exposes </w:t>
-      </w:r>
-      <w:r>
-        <w:rPr>
-          <w:rFonts w:ascii="Consolas" w:hAnsi="Consolas"/>
-          <w:color w:val="333333"/>
-          <w:sz w:val="20"/>
-        </w:rPr>
-        <w:t>8000</w:t>
-      </w:r>
-      <w:r>
-        <w:t xml:space="preserve">. A </w:t>
-      </w:r>
-      <w:r>
-        <w:rPr>
-          <w:rFonts w:ascii="Consolas" w:hAnsi="Consolas"/>
-          <w:color w:val="333333"/>
-          <w:sz w:val="20"/>
-        </w:rPr>
-        <w:t>HEALTHCHECK</w:t>
-      </w:r>
-      <w:r>
-        <w:t xml:space="preserve"> curls</w:t>
-      </w:r>
-    </w:p>
-    <w:p>
-      <w:r>
-        <w:rPr>
-          <w:rFonts w:ascii="Consolas" w:hAnsi="Consolas"/>
-          <w:color w:val="333333"/>
-          <w:sz w:val="20"/>
-        </w:rPr>
-        <w:t>/health</w:t>
-      </w:r>
-      <w:r>
-        <w:t xml:space="preserve"> every 30 s.</w:t>
-      </w:r>
-    </w:p>
-    <w:p/>
-    <w:p>
-      <w:r>
-        <w:rPr>
-          <w:rFonts w:ascii="Consolas" w:hAnsi="Consolas"/>
-          <w:color w:val="333333"/>
-          <w:sz w:val="18"/>
-        </w:rPr>
-        <w:t>docker build -t heart-api:latest .</w:t>
-        <w:br/>
-        <w:t>docker run --rm -p 8000:8000 heart-api:latest</w:t>
-        <w:br/>
-        <w:t>curl -X POST http://localhost:8000/predict \</w:t>
-        <w:br/>
-        <w:t xml:space="preserve">  -H "Content-Type: application/json" \</w:t>
-        <w:br/>
-        <w:t xml:space="preserve">  -d @tests/sample_request.json</w:t>
-      </w:r>
-    </w:p>
-    <w:p/>
     <w:p>
       <w:r>
         <w:drawing>
@@ -3611,7 +3880,7 @@
               <a:graphicData uri="http://schemas.openxmlformats.org/drawingml/2006/picture">
                 <pic:pic>
                   <pic:nvPicPr>
-                    <pic:cNvPr id="0" name="07_docker_build.png"/>
+                    <pic:cNvPr id="0" name="06_github_actions_success.png"/>
                     <pic:cNvPicPr/>
                   </pic:nvPicPr>
                   <pic:blipFill>
@@ -3634,12 +3903,185 @@
         </w:drawing>
       </w:r>
     </w:p>
+    <w:p/>
+    <w:p/>
+    <w:p/>
+    <w:p>
+      <w:pPr>
+        <w:pStyle w:val="Heading1"/>
+      </w:pPr>
+      <w:r>
+        <w:t>9. Containerisation *(Task 6 — 5 marks)*</w:t>
+      </w:r>
+    </w:p>
+    <w:p/>
+    <w:p>
+      <w:r>
+        <w:t>A two-stage Dockerfile (</w:t>
+      </w:r>
+      <w:r>
+        <w:rPr>
+          <w:rFonts w:ascii="Consolas" w:hAnsi="Consolas"/>
+          <w:color w:val="333333"/>
+          <w:sz w:val="20"/>
+        </w:rPr>
+        <w:t>python:3.11-slim</w:t>
+      </w:r>
+      <w:r>
+        <w:t xml:space="preserve"> builder + runtime) installs</w:t>
+      </w:r>
+    </w:p>
+    <w:p>
+      <w:r>
+        <w:t xml:space="preserve">deps into </w:t>
+      </w:r>
+      <w:r>
+        <w:rPr>
+          <w:rFonts w:ascii="Consolas" w:hAnsi="Consolas"/>
+          <w:color w:val="333333"/>
+          <w:sz w:val="20"/>
+        </w:rPr>
+        <w:t>/install</w:t>
+      </w:r>
+      <w:r>
+        <w:t xml:space="preserve">, copies only </w:t>
+      </w:r>
+      <w:r>
+        <w:rPr>
+          <w:rFonts w:ascii="Consolas" w:hAnsi="Consolas"/>
+          <w:color w:val="333333"/>
+          <w:sz w:val="20"/>
+        </w:rPr>
+        <w:t>src/</w:t>
+      </w:r>
+      <w:r>
+        <w:t xml:space="preserve"> and </w:t>
+      </w:r>
+      <w:r>
+        <w:rPr>
+          <w:rFonts w:ascii="Consolas" w:hAnsi="Consolas"/>
+          <w:color w:val="333333"/>
+          <w:sz w:val="20"/>
+        </w:rPr>
+        <w:t>models/</w:t>
+      </w:r>
+      <w:r>
+        <w:t>, switches to a</w:t>
+      </w:r>
+    </w:p>
+    <w:p>
+      <w:r>
+        <w:t xml:space="preserve">non-root </w:t>
+      </w:r>
+      <w:r>
+        <w:rPr>
+          <w:rFonts w:ascii="Consolas" w:hAnsi="Consolas"/>
+          <w:color w:val="333333"/>
+          <w:sz w:val="20"/>
+        </w:rPr>
+        <w:t>heart</w:t>
+      </w:r>
+      <w:r>
+        <w:t xml:space="preserve"> user, and exposes </w:t>
+      </w:r>
+      <w:r>
+        <w:rPr>
+          <w:rFonts w:ascii="Consolas" w:hAnsi="Consolas"/>
+          <w:color w:val="333333"/>
+          <w:sz w:val="20"/>
+        </w:rPr>
+        <w:t>8000</w:t>
+      </w:r>
+      <w:r>
+        <w:t xml:space="preserve">. A </w:t>
+      </w:r>
+      <w:r>
+        <w:rPr>
+          <w:rFonts w:ascii="Consolas" w:hAnsi="Consolas"/>
+          <w:color w:val="333333"/>
+          <w:sz w:val="20"/>
+        </w:rPr>
+        <w:t>HEALTHCHECK</w:t>
+      </w:r>
+      <w:r>
+        <w:t xml:space="preserve"> curls</w:t>
+      </w:r>
+    </w:p>
+    <w:p>
+      <w:r>
+        <w:rPr>
+          <w:rFonts w:ascii="Consolas" w:hAnsi="Consolas"/>
+          <w:color w:val="333333"/>
+          <w:sz w:val="20"/>
+        </w:rPr>
+        <w:t>/health</w:t>
+      </w:r>
+      <w:r>
+        <w:t xml:space="preserve"> every 30 s.</w:t>
+      </w:r>
+    </w:p>
+    <w:p/>
+    <w:p>
+      <w:r>
+        <w:rPr>
+          <w:rFonts w:ascii="Consolas" w:hAnsi="Consolas"/>
+          <w:color w:val="333333"/>
+          <w:sz w:val="18"/>
+        </w:rPr>
+        <w:t>docker build -t heart-api:latest .</w:t>
+        <w:br/>
+        <w:t>docker run --rm -p 8000:8000 heart-api:latest</w:t>
+        <w:br/>
+        <w:t>curl -X POST http://localhost:8000/predict \</w:t>
+        <w:br/>
+        <w:t xml:space="preserve">  -H "Content-Type: application/json" \</w:t>
+        <w:br/>
+        <w:t xml:space="preserve">  -d @tests/sample_request.json</w:t>
+      </w:r>
+    </w:p>
+    <w:p/>
+    <w:p>
+      <w:r>
+        <w:drawing>
+          <wp:inline xmlns:a="http://schemas.openxmlformats.org/drawingml/2006/main" xmlns:pic="http://schemas.openxmlformats.org/drawingml/2006/picture">
+            <wp:extent cx="5029200" cy="2766060"/>
+            <wp:docPr id="8" name="Picture 8"/>
+            <wp:cNvGraphicFramePr>
+              <a:graphicFrameLocks noChangeAspect="1"/>
+            </wp:cNvGraphicFramePr>
+            <a:graphic>
+              <a:graphicData uri="http://schemas.openxmlformats.org/drawingml/2006/picture">
+                <pic:pic>
+                  <pic:nvPicPr>
+                    <pic:cNvPr id="0" name="07_docker_build.png"/>
+                    <pic:cNvPicPr/>
+                  </pic:nvPicPr>
+                  <pic:blipFill>
+                    <a:blip r:embed="rId16"/>
+                    <a:stretch>
+                      <a:fillRect/>
+                    </a:stretch>
+                  </pic:blipFill>
+                  <pic:spPr>
+                    <a:xfrm>
+                      <a:off x="0" y="0"/>
+                      <a:ext cx="5029200" cy="2766060"/>
+                    </a:xfrm>
+                    <a:prstGeom prst="rect"/>
+                  </pic:spPr>
+                </pic:pic>
+              </a:graphicData>
+            </a:graphic>
+          </wp:inline>
+        </w:drawing>
+      </w:r>
+    </w:p>
     <w:p>
       <w:r>
         <w:drawing>
           <wp:inline xmlns:a="http://schemas.openxmlformats.org/drawingml/2006/main" xmlns:pic="http://schemas.openxmlformats.org/drawingml/2006/picture">
             <wp:extent cx="5029200" cy="2828925"/>
-            <wp:docPr id="8" name="Picture 8"/>
+            <wp:docPr id="9" name="Picture 9"/>
             <wp:cNvGraphicFramePr>
               <a:graphicFrameLocks noChangeAspect="1"/>
             </wp:cNvGraphicFramePr>
@@ -3651,7 +4093,7 @@
                     <pic:cNvPicPr/>
                   </pic:nvPicPr>
                   <pic:blipFill>
-                    <a:blip r:embed="rId16"/>
+                    <a:blip r:embed="rId17"/>
                     <a:stretch>
                       <a:fillRect/>
                     </a:stretch>
@@ -3695,7 +4137,7 @@
         <w:pStyle w:val="Heading1"/>
       </w:pPr>
       <w:r>
-        <w:t>9. Production deployment *(Task 7 — 7 marks)*</w:t>
+        <w:t>10. Production deployment *(Task 7 — 7 marks)*</w:t>
       </w:r>
     </w:p>
     <w:p/>
@@ -3868,7 +4310,7 @@
         <w:drawing>
           <wp:inline xmlns:a="http://schemas.openxmlformats.org/drawingml/2006/main" xmlns:pic="http://schemas.openxmlformats.org/drawingml/2006/picture">
             <wp:extent cx="5029200" cy="2766060"/>
-            <wp:docPr id="9" name="Picture 9"/>
+            <wp:docPr id="10" name="Picture 10"/>
             <wp:cNvGraphicFramePr>
               <a:graphicFrameLocks noChangeAspect="1"/>
             </wp:cNvGraphicFramePr>
@@ -3880,7 +4322,7 @@
                     <pic:cNvPicPr/>
                   </pic:nvPicPr>
                   <pic:blipFill>
-                    <a:blip r:embed="rId17"/>
+                    <a:blip r:embed="rId18"/>
                     <a:stretch>
                       <a:fillRect/>
                     </a:stretch>
@@ -4234,7 +4676,7 @@
         <w:drawing>
           <wp:inline xmlns:a="http://schemas.openxmlformats.org/drawingml/2006/main" xmlns:pic="http://schemas.openxmlformats.org/drawingml/2006/picture">
             <wp:extent cx="5029200" cy="3023806"/>
-            <wp:docPr id="10" name="Picture 10"/>
+            <wp:docPr id="11" name="Picture 11"/>
             <wp:cNvGraphicFramePr>
               <a:graphicFrameLocks noChangeAspect="1"/>
             </wp:cNvGraphicFramePr>
@@ -4246,7 +4688,7 @@
                     <pic:cNvPicPr/>
                   </pic:nvPicPr>
                   <pic:blipFill>
-                    <a:blip r:embed="rId18"/>
+                    <a:blip r:embed="rId19"/>
                     <a:stretch>
                       <a:fillRect/>
                     </a:stretch>
@@ -4273,7 +4715,7 @@
         <w:pStyle w:val="Heading1"/>
       </w:pPr>
       <w:r>
-        <w:t>10. Monitoring and logging *(Task 8 — 3 marks)*</w:t>
+        <w:t>11. Monitoring and logging *(Task 8 — 3 marks)*</w:t>
       </w:r>
     </w:p>
     <w:p/>
@@ -4505,42 +4947,6 @@
       </w:r>
     </w:p>
     <w:p/>
-    <w:p>
-      <w:r>
-        <w:drawing>
-          <wp:inline xmlns:a="http://schemas.openxmlformats.org/drawingml/2006/main" xmlns:pic="http://schemas.openxmlformats.org/drawingml/2006/picture">
-            <wp:extent cx="5029200" cy="2828925"/>
-            <wp:docPr id="11" name="Picture 11"/>
-            <wp:cNvGraphicFramePr>
-              <a:graphicFrameLocks noChangeAspect="1"/>
-            </wp:cNvGraphicFramePr>
-            <a:graphic>
-              <a:graphicData uri="http://schemas.openxmlformats.org/drawingml/2006/picture">
-                <pic:pic>
-                  <pic:nvPicPr>
-                    <pic:cNvPr id="0" name="12_grafana_dashboard.png"/>
-                    <pic:cNvPicPr/>
-                  </pic:nvPicPr>
-                  <pic:blipFill>
-                    <a:blip r:embed="rId19"/>
-                    <a:stretch>
-                      <a:fillRect/>
-                    </a:stretch>
-                  </pic:blipFill>
-                  <pic:spPr>
-                    <a:xfrm>
-                      <a:off x="0" y="0"/>
-                      <a:ext cx="5029200" cy="2828925"/>
-                    </a:xfrm>
-                    <a:prstGeom prst="rect"/>
-                  </pic:spPr>
-                </pic:pic>
-              </a:graphicData>
-            </a:graphic>
-          </wp:inline>
-        </w:drawing>
-      </w:r>
-    </w:p>
     <w:p>
       <w:r>
         <w:drawing>
@@ -4554,7 +4960,7 @@
               <a:graphicData uri="http://schemas.openxmlformats.org/drawingml/2006/picture">
                 <pic:pic>
                   <pic:nvPicPr>
-                    <pic:cNvPr id="0" name="13_prometheus_targets.png"/>
+                    <pic:cNvPr id="0" name="12_grafana_dashboard.png"/>
                     <pic:cNvPicPr/>
                   </pic:nvPicPr>
                   <pic:blipFill>
@@ -4590,7 +4996,7 @@
               <a:graphicData uri="http://schemas.openxmlformats.org/drawingml/2006/picture">
                 <pic:pic>
                   <pic:nvPicPr>
-                    <pic:cNvPr id="0" name="06_prometheus_query.png"/>
+                    <pic:cNvPr id="0" name="13_prometheus_targets.png"/>
                     <pic:cNvPicPr/>
                   </pic:nvPicPr>
                   <pic:blipFill>
@@ -4626,7 +5032,7 @@
               <a:graphicData uri="http://schemas.openxmlformats.org/drawingml/2006/picture">
                 <pic:pic>
                   <pic:nvPicPr>
-                    <pic:cNvPr id="0" name="07_metrics_endpoint.png"/>
+                    <pic:cNvPr id="0" name="06_prometheus_query.png"/>
                     <pic:cNvPicPr/>
                   </pic:nvPicPr>
                   <pic:blipFill>
@@ -4649,121 +5055,40 @@
         </w:drawing>
       </w:r>
     </w:p>
-    <w:p/>
-    <w:p/>
-    <w:p/>
     <w:p>
-      <w:pPr>
-        <w:pStyle w:val="Heading1"/>
-      </w:pPr>
-      <w:r>
-        <w:t>11. Documentation and reporting *(Task 9 — 2 marks)*</w:t>
-      </w:r>
-    </w:p>
-    <w:p/>
-    <w:p>
-      <w:pPr>
-        <w:pStyle w:val="ListBullet"/>
-      </w:pPr>
-      <w:r>
-        <w:t xml:space="preserve">This document — </w:t>
-      </w:r>
-      <w:r>
-        <w:rPr>
-          <w:rFonts w:ascii="Consolas" w:hAnsi="Consolas"/>
-          <w:color w:val="333333"/>
-          <w:sz w:val="20"/>
-        </w:rPr>
-        <w:t>docs/REPORT.md</w:t>
-      </w:r>
-      <w:r>
-        <w:t xml:space="preserve"> (also exported as </w:t>
-      </w:r>
-      <w:r>
-        <w:rPr>
-          <w:rFonts w:ascii="Consolas" w:hAnsi="Consolas"/>
-          <w:color w:val="333333"/>
-          <w:sz w:val="20"/>
-        </w:rPr>
-        <w:t>REPORT.docx</w:t>
-      </w:r>
-      <w:r>
-        <w:t xml:space="preserve"> and </w:t>
-      </w:r>
-      <w:r>
-        <w:rPr>
-          <w:rFonts w:ascii="Consolas" w:hAnsi="Consolas"/>
-          <w:color w:val="333333"/>
-          <w:sz w:val="20"/>
-        </w:rPr>
-        <w:t>REPORT.pdf</w:t>
-      </w:r>
-      <w:r>
-        <w:t>).</w:t>
-      </w:r>
-    </w:p>
-    <w:p>
-      <w:pPr>
-        <w:pStyle w:val="ListBullet"/>
-      </w:pPr>
-      <w:r>
-        <w:rPr>
-          <w:rFonts w:ascii="Consolas" w:hAnsi="Consolas"/>
-          <w:color w:val="333333"/>
-          <w:sz w:val="20"/>
-        </w:rPr>
-        <w:t>README.md</w:t>
-      </w:r>
-      <w:r>
-        <w:t xml:space="preserve"> covers setup, Docker, Kubernetes, Render, CI/CD, and layout.</w:t>
-      </w:r>
-    </w:p>
-    <w:p>
-      <w:pPr>
-        <w:pStyle w:val="ListBullet"/>
-      </w:pPr>
-      <w:r>
-        <w:rPr>
-          <w:rFonts w:ascii="Consolas" w:hAnsi="Consolas"/>
-          <w:color w:val="333333"/>
-          <w:sz w:val="20"/>
-        </w:rPr>
-        <w:t>docs/architecture.md</w:t>
-      </w:r>
-      <w:r>
-        <w:t xml:space="preserve"> includes a Mermaid + ASCII architecture diagram.</w:t>
-      </w:r>
-    </w:p>
-    <w:p>
-      <w:pPr>
-        <w:pStyle w:val="ListBullet"/>
-      </w:pPr>
-      <w:r>
-        <w:rPr>
-          <w:rFonts w:ascii="Consolas" w:hAnsi="Consolas"/>
-          <w:color w:val="333333"/>
-          <w:sz w:val="20"/>
-        </w:rPr>
-        <w:t>screenshots/</w:t>
-      </w:r>
-      <w:r>
-        <w:t xml:space="preserve"> contains 15 PNGs referenced from this report and the</w:t>
-      </w:r>
-    </w:p>
-    <w:p>
-      <w:r>
-        <w:t xml:space="preserve">  demo video (</w:t>
-      </w:r>
-      <w:r>
-        <w:rPr>
-          <w:rFonts w:ascii="Consolas" w:hAnsi="Consolas"/>
-          <w:color w:val="333333"/>
-          <w:sz w:val="20"/>
-        </w:rPr>
-        <w:t>docs/2026-05-09 17-51-37.mp4</w:t>
-      </w:r>
-      <w:r>
-        <w:t>).</w:t>
+      <w:r>
+        <w:drawing>
+          <wp:inline xmlns:a="http://schemas.openxmlformats.org/drawingml/2006/main" xmlns:pic="http://schemas.openxmlformats.org/drawingml/2006/picture">
+            <wp:extent cx="5029200" cy="2828925"/>
+            <wp:docPr id="15" name="Picture 15"/>
+            <wp:cNvGraphicFramePr>
+              <a:graphicFrameLocks noChangeAspect="1"/>
+            </wp:cNvGraphicFramePr>
+            <a:graphic>
+              <a:graphicData uri="http://schemas.openxmlformats.org/drawingml/2006/picture">
+                <pic:pic>
+                  <pic:nvPicPr>
+                    <pic:cNvPr id="0" name="07_metrics_endpoint.png"/>
+                    <pic:cNvPicPr/>
+                  </pic:nvPicPr>
+                  <pic:blipFill>
+                    <a:blip r:embed="rId23"/>
+                    <a:stretch>
+                      <a:fillRect/>
+                    </a:stretch>
+                  </pic:blipFill>
+                  <pic:spPr>
+                    <a:xfrm>
+                      <a:off x="0" y="0"/>
+                      <a:ext cx="5029200" cy="2828925"/>
+                    </a:xfrm>
+                    <a:prstGeom prst="rect"/>
+                  </pic:spPr>
+                </pic:pic>
+              </a:graphicData>
+            </a:graphic>
+          </wp:inline>
+        </w:drawing>
       </w:r>
     </w:p>
     <w:p/>
@@ -4774,7 +5099,124 @@
         <w:pStyle w:val="Heading1"/>
       </w:pPr>
       <w:r>
-        <w:t>12. Deliverables checklist</w:t>
+        <w:t>12. Documentation and reporting *(Task 9 — 2 marks)*</w:t>
+      </w:r>
+    </w:p>
+    <w:p/>
+    <w:p>
+      <w:pPr>
+        <w:pStyle w:val="ListBullet"/>
+      </w:pPr>
+      <w:r>
+        <w:t xml:space="preserve">This document — </w:t>
+      </w:r>
+      <w:r>
+        <w:rPr>
+          <w:rFonts w:ascii="Consolas" w:hAnsi="Consolas"/>
+          <w:color w:val="333333"/>
+          <w:sz w:val="20"/>
+        </w:rPr>
+        <w:t>docs/REPORT.md</w:t>
+      </w:r>
+      <w:r>
+        <w:t xml:space="preserve"> (also exported as </w:t>
+      </w:r>
+      <w:r>
+        <w:rPr>
+          <w:rFonts w:ascii="Consolas" w:hAnsi="Consolas"/>
+          <w:color w:val="333333"/>
+          <w:sz w:val="20"/>
+        </w:rPr>
+        <w:t>REPORT.docx</w:t>
+      </w:r>
+      <w:r>
+        <w:t xml:space="preserve"> and </w:t>
+      </w:r>
+      <w:r>
+        <w:rPr>
+          <w:rFonts w:ascii="Consolas" w:hAnsi="Consolas"/>
+          <w:color w:val="333333"/>
+          <w:sz w:val="20"/>
+        </w:rPr>
+        <w:t>REPORT.pdf</w:t>
+      </w:r>
+      <w:r>
+        <w:t>).</w:t>
+      </w:r>
+    </w:p>
+    <w:p>
+      <w:pPr>
+        <w:pStyle w:val="ListBullet"/>
+      </w:pPr>
+      <w:r>
+        <w:rPr>
+          <w:rFonts w:ascii="Consolas" w:hAnsi="Consolas"/>
+          <w:color w:val="333333"/>
+          <w:sz w:val="20"/>
+        </w:rPr>
+        <w:t>README.md</w:t>
+      </w:r>
+      <w:r>
+        <w:t xml:space="preserve"> covers setup, Docker, Kubernetes, Render, CI/CD, and layout.</w:t>
+      </w:r>
+    </w:p>
+    <w:p>
+      <w:pPr>
+        <w:pStyle w:val="ListBullet"/>
+      </w:pPr>
+      <w:r>
+        <w:rPr>
+          <w:rFonts w:ascii="Consolas" w:hAnsi="Consolas"/>
+          <w:color w:val="333333"/>
+          <w:sz w:val="20"/>
+        </w:rPr>
+        <w:t>docs/architecture.md</w:t>
+      </w:r>
+      <w:r>
+        <w:t xml:space="preserve"> includes a Mermaid + ASCII architecture diagram.</w:t>
+      </w:r>
+    </w:p>
+    <w:p>
+      <w:pPr>
+        <w:pStyle w:val="ListBullet"/>
+      </w:pPr>
+      <w:r>
+        <w:rPr>
+          <w:rFonts w:ascii="Consolas" w:hAnsi="Consolas"/>
+          <w:color w:val="333333"/>
+          <w:sz w:val="20"/>
+        </w:rPr>
+        <w:t>screenshots/</w:t>
+      </w:r>
+      <w:r>
+        <w:t xml:space="preserve"> contains 15 PNGs referenced from this report and the</w:t>
+      </w:r>
+    </w:p>
+    <w:p>
+      <w:r>
+        <w:t xml:space="preserve">  demo video (</w:t>
+      </w:r>
+      <w:r>
+        <w:rPr>
+          <w:rFonts w:ascii="Consolas" w:hAnsi="Consolas"/>
+          <w:color w:val="333333"/>
+          <w:sz w:val="20"/>
+        </w:rPr>
+        <w:t>docs/2026-05-09 17-51-37.mp4</w:t>
+      </w:r>
+      <w:r>
+        <w:t>).</w:t>
+      </w:r>
+    </w:p>
+    <w:p/>
+    <w:p/>
+    <w:p/>
+    <w:p>
+      <w:pPr>
+        <w:pStyle w:val="Heading1"/>
+      </w:pPr>
+      <w:r>
+        <w:t>13. Deliverables checklist</w:t>
       </w:r>
     </w:p>
     <w:p/>

</xml_diff>

<commit_message>
docs: drop references to non-existent Render screenshots (14-17) from REPORT
</commit_message>
<xml_diff>
--- a/docs/REPORT.docx
+++ b/docs/REPORT.docx
@@ -4653,26 +4653,6 @@
     <w:p/>
     <w:p>
       <w:r>
-        <w:t>[image not found: ../screenshots/14_render_dashboard.png]</w:t>
-      </w:r>
-    </w:p>
-    <w:p>
-      <w:r>
-        <w:t>[image not found: ../screenshots/15_render_logs.png]</w:t>
-      </w:r>
-    </w:p>
-    <w:p>
-      <w:r>
-        <w:t>[image not found: ../screenshots/16_render_swagger.png]</w:t>
-      </w:r>
-    </w:p>
-    <w:p>
-      <w:r>
-        <w:t>[image not found: ../screenshots/17_render_predict.png]</w:t>
-      </w:r>
-    </w:p>
-    <w:p>
-      <w:r>
         <w:drawing>
           <wp:inline xmlns:a="http://schemas.openxmlformats.org/drawingml/2006/main" xmlns:pic="http://schemas.openxmlformats.org/drawingml/2006/picture">
             <wp:extent cx="5029200" cy="3023806"/>

</xml_diff>

<commit_message>
docs: add Try /predict Swagger header link and update submission date to 09-May-2026
</commit_message>
<xml_diff>
--- a/docs/REPORT.docx
+++ b/docs/REPORT.docx
@@ -51,7 +51,7 @@
         <w:t>Submission date:</w:t>
       </w:r>
       <w:r>
-        <w:t xml:space="preserve"> 5-May-2026</w:t>
+        <w:t xml:space="preserve"> 09-May-2026</w:t>
       </w:r>
     </w:p>
     <w:p>
@@ -88,6 +88,23 @@
           <w:color w:val="1F497D"/>
         </w:rPr>
         <w:t>https://heart-disease-mlops-yhb7.onrender.com</w:t>
+      </w:r>
+    </w:p>
+    <w:p>
+      <w:r>
+        <w:rPr>
+          <w:b/>
+        </w:rPr>
+        <w:t>Try `/predict` (Swagger UI):</w:t>
+      </w:r>
+      <w:r>
+        <w:t xml:space="preserve"> </w:t>
+      </w:r>
+      <w:r>
+        <w:rPr>
+          <w:color w:val="1F497D"/>
+        </w:rPr>
+        <w:t>https://heart-disease-mlops-yhb7.onrender.com/docs#/inference/predict_predict_post</w:t>
       </w:r>
     </w:p>
     <w:p/>

</xml_diff>

<commit_message>
docs: rename REPORT.pdf to MLOps_Assignment_Report_2025cs05056.pdf for submission
</commit_message>
<xml_diff>
--- a/docs/REPORT.docx
+++ b/docs/REPORT.docx
@@ -254,7 +254,14 @@
           <w:p>
             <w:r/>
             <w:r>
-              <w:t>`docs/REPORT.pdf`</w:t>
+              <w:t>`docs/MLOps_Assignment_Report_2025cs05056.pdf`</w:t>
+            </w:r>
+            <w:r>
+              <w:rPr>
+                <w:color w:val="555555"/>
+                <w:sz w:val="18"/>
+              </w:rPr>
+              <w:t xml:space="preserve"> (MLOps_Assignment_Report_2025cs05056.pdf)</w:t>
             </w:r>
           </w:p>
         </w:tc>
@@ -5135,7 +5142,7 @@
           <w:color w:val="333333"/>
           <w:sz w:val="20"/>
         </w:rPr>
-        <w:t>REPORT.pdf</w:t>
+        <w:t>MLOps_Assignment_Report_2025cs05056.pdf</w:t>
       </w:r>
       <w:r>
         <w:t>).</w:t>
@@ -5626,7 +5633,7 @@
                 <w:color w:val="333333"/>
                 <w:sz w:val="20"/>
               </w:rPr>
-              <w:t>docs/REPORT.pdf</w:t>
+              <w:t>docs/MLOps_Assignment_Report_2025cs05056.pdf</w:t>
             </w:r>
             <w:r>
               <w:t xml:space="preserve">, </w:t>

</xml_diff>